<commit_message>
Revise article in SBC format
</commit_message>
<xml_diff>
--- a/docs/entrega_professor/artigo_edutech_vision_grupo3.docx
+++ b/docs/entrega_professor/artigo_edutech_vision_grupo3.docx
@@ -4,27 +4,29 @@
   <w:body>
     <w:p>
       <w:pPr>
-        <w:spacing w:before="240" w:after="240"/>
+        <w:spacing w:after="40"/>
         <w:jc w:val="center"/>
       </w:pPr>
       <w:r>
         <w:rPr>
           <w:rFonts w:ascii="Times New Roman" w:hAnsi="Times New Roman" w:eastAsia="Times New Roman"/>
           <w:b/>
+          <w:i w:val="0"/>
           <w:sz w:val="32"/>
         </w:rPr>
-        <w:t>EduTech Vision: Monitoramento de Atenção, Postura e Engajamento por Processamento Digital de Imagens</w:t>
+        <w:t>EduTech Vision: Atenção, Postura e Engajamento por Visão Computacional em Tempo Real</w:t>
       </w:r>
     </w:p>
     <w:p>
       <w:pPr>
-        <w:spacing w:after="240"/>
+        <w:spacing w:after="40"/>
         <w:jc w:val="center"/>
       </w:pPr>
       <w:r>
         <w:rPr>
           <w:rFonts w:ascii="Times New Roman" w:hAnsi="Times New Roman" w:eastAsia="Times New Roman"/>
           <w:b/>
+          <w:i w:val="0"/>
           <w:sz w:val="24"/>
         </w:rPr>
         <w:t>Fernando Cobianchi, Samuel Bernini</w:t>
@@ -32,104 +34,8 @@
     </w:p>
     <w:p>
       <w:pPr>
-        <w:spacing w:after="0"/>
+        <w:spacing w:after="40"/>
         <w:jc w:val="center"/>
-      </w:pPr>
-      <w:r>
-        <w:rPr>
-          <w:rFonts w:ascii="Times New Roman" w:hAnsi="Times New Roman" w:eastAsia="Times New Roman"/>
-          <w:sz w:val="24"/>
-        </w:rPr>
-        <w:t>Bacharelado em Ciência da Computação - Universidade do Estado de Mato Grosso (UNEMAT)</w:t>
-      </w:r>
-    </w:p>
-    <w:p>
-      <w:pPr>
-        <w:spacing w:after="0"/>
-        <w:jc w:val="center"/>
-      </w:pPr>
-      <w:r>
-        <w:rPr>
-          <w:rFonts w:ascii="Times New Roman" w:hAnsi="Times New Roman" w:eastAsia="Times New Roman"/>
-          <w:sz w:val="24"/>
-        </w:rPr>
-        <w:t>Câmpus Universitário de Rondonópolis - Rondonópolis - MT - Brasil</w:t>
-      </w:r>
-    </w:p>
-    <w:p>
-      <w:pPr>
-        <w:spacing w:before="120" w:after="120"/>
-        <w:jc w:val="center"/>
-      </w:pPr>
-      <w:r>
-        <w:rPr>
-          <w:rFonts w:ascii="Courier New" w:hAnsi="Courier New" w:eastAsia="Courier New"/>
-          <w:sz w:val="20"/>
-        </w:rPr>
-        <w:t>{fernando.cobianchi, samuel.bernini}@unemat.br</w:t>
-      </w:r>
-    </w:p>
-    <w:p>
-      <w:pPr>
-        <w:spacing w:before="120" w:after="0" w:line="240" w:lineRule="auto"/>
-        <w:ind w:left="454" w:right="454" w:firstLine="0"/>
-      </w:pPr>
-      <w:r>
-        <w:rPr>
-          <w:rFonts w:ascii="Times New Roman" w:hAnsi="Times New Roman" w:eastAsia="Times New Roman"/>
-          <w:b/>
-          <w:sz w:val="24"/>
-        </w:rPr>
-        <w:t xml:space="preserve">Abstract. </w:t>
-      </w:r>
-      <w:r>
-        <w:rPr>
-          <w:rFonts w:ascii="Times New Roman" w:hAnsi="Times New Roman" w:eastAsia="Times New Roman"/>
-          <w:sz w:val="24"/>
-        </w:rPr>
-        <w:t>EduTech Vision is a real-time digital image processing system for educational demonstrations of attention, posture and audience engagement. The current version has individual and audience modes without student identification. The standard pipeline combines OpenCV YuNet, MediaPipe Face Landmarker on expanded crops, EAR/MAR, solvePnP pose, moving averages and 10 s aggregation. In 960x540 smoke benchmarks, enhanced reached F1=0.712/29.0 FPS in individual mode and F1=0.583/74.5 FPS in audience mode. In a 1080p audience audit, it obtained 5/11 exact counts, 10/11 within one face and mean error 0.636. The system is a PDI demonstration, not a pedagogical or clinical diagnostic tool.</w:t>
-      </w:r>
-    </w:p>
-    <w:p>
-      <w:pPr>
-        <w:spacing w:before="120" w:after="0" w:line="240" w:lineRule="auto"/>
-        <w:ind w:left="454" w:right="454" w:firstLine="0"/>
-      </w:pPr>
-      <w:r>
-        <w:rPr>
-          <w:rFonts w:ascii="Times New Roman" w:hAnsi="Times New Roman" w:eastAsia="Times New Roman"/>
-          <w:b/>
-          <w:sz w:val="24"/>
-        </w:rPr>
-        <w:t xml:space="preserve">Resumo. </w:t>
-      </w:r>
-      <w:r>
-        <w:rPr>
-          <w:rFonts w:ascii="Times New Roman" w:hAnsi="Times New Roman" w:eastAsia="Times New Roman"/>
-          <w:sz w:val="24"/>
-        </w:rPr>
-        <w:t>O EduTech Vision é um sistema de PDI em tempo real para demonstrações educacionais de atenção visual, postura e engajamento. A versão atual opera em modos individual e plateia, sem identificação de estudantes. O pipeline padrão combina OpenCV YuNet, MediaPipe Face Landmarker em recortes ampliados, EAR/MAR, pose por solvePnP, médias móveis e agregação de 10 s. Em benchmarks smoke a 960x540, enhanced alcançou F1=0,712/29,0 FPS no modo individual e F1=0,583/74,5 FPS no modo plateia. Em auditoria 1080p de plateia, obteve 5/11 acertos exatos, 10/11 casos com erro de no máximo um rosto e erro médio 0,636. O sistema é demonstração de PDI, não avaliação pedagógica ou diagnóstico clínico.</w:t>
-      </w:r>
-    </w:p>
-    <w:p>
-      <w:pPr>
-        <w:spacing w:before="240" w:after="0"/>
-        <w:ind w:firstLine="0"/>
-        <w:jc w:val="left"/>
-      </w:pPr>
-      <w:r>
-        <w:rPr>
-          <w:rFonts w:ascii="Times New Roman" w:hAnsi="Times New Roman" w:eastAsia="Times New Roman"/>
-          <w:b/>
-          <w:sz w:val="26"/>
-        </w:rPr>
-        <w:t>1. Introdução</w:t>
-      </w:r>
-    </w:p>
-    <w:p>
-      <w:pPr>
-        <w:spacing w:before="120" w:after="0" w:line="240" w:lineRule="auto"/>
-        <w:ind w:firstLine="0"/>
       </w:pPr>
       <w:r>
         <w:rPr>
@@ -138,13 +44,13 @@
           <w:i w:val="0"/>
           <w:sz w:val="24"/>
         </w:rPr>
-        <w:t>A observação de atenção, postura e engajamento em ambientes educacionais costuma depender da percepção do professor ou do próprio estudante. Essa percepção é útil, mas é subjetiva, descontínua e difícil de registrar de forma reprodutível. Em projetos de Processamento Digital de Imagens (PDI), sinais visuais como abertura dos olhos, abertura da boca, orientação da cabeça e presença de faces podem ser utilizados para demonstrar como medidas geométricas e temporais transformam imagens em indicadores aproximados.</w:t>
+        <w:t>Bacharelado em Ciência da Computação -- Universidade do Estado de Mato Grosso (UNEMAT)</w:t>
       </w:r>
     </w:p>
     <w:p>
       <w:pPr>
-        <w:spacing w:before="120" w:after="0" w:line="240" w:lineRule="auto"/>
-        <w:ind w:firstLine="720"/>
+        <w:spacing w:after="40"/>
+        <w:jc w:val="center"/>
       </w:pPr>
       <w:r>
         <w:rPr>
@@ -153,13 +59,13 @@
           <w:i w:val="0"/>
           <w:sz w:val="24"/>
         </w:rPr>
-        <w:t>Neste contexto, o EduTech Vision foi desenvolvido como produto acadêmico da Trilha 3: Atenção, Postura e Engajamento. O sistema possui dois cenários complementares: no modo individual, uma câmera frontal acompanha uma pessoa e estima fadiga, bocejo, queda postural e desatenção sustentada; no modo plateia, uma câmera voltada a um grupo calcula métricas agregadas de faces voltadas ao palco ou professor. O modo plateia não identifica alunos e não produz decisões individualizadas.</w:t>
+        <w:t>Campus Universitário de Rondonópolis -- Rondonópolis -- MT -- Brasil</w:t>
       </w:r>
     </w:p>
     <w:p>
       <w:pPr>
-        <w:spacing w:before="120" w:after="0" w:line="240" w:lineRule="auto"/>
-        <w:ind w:firstLine="720"/>
+        <w:spacing w:after="40"/>
+        <w:jc w:val="center"/>
       </w:pPr>
       <w:r>
         <w:rPr>
@@ -168,28 +74,80 @@
           <w:i w:val="0"/>
           <w:sz w:val="24"/>
         </w:rPr>
-        <w:t>O objetivo deste artigo é apresentar a versão atual do sistema com linguagem científica e evidências compatíveis com os resultados atuais disponíveis. O trabalho não afirma medir aprendizagem, rendimento escolar ou estado clínico. Os indicadores gerados são aproximações visuais para fins de demonstração acadêmica de PDI em tempo real.</w:t>
+        <w:t>{fernando.cobianchi, samuel.bernini}@unemat.br</w:t>
       </w:r>
     </w:p>
     <w:p>
       <w:pPr>
-        <w:spacing w:before="240" w:after="0"/>
-        <w:ind w:firstLine="0"/>
+        <w:spacing w:after="160"/>
+        <w:ind w:left="454" w:right="454" w:firstLine="0"/>
+        <w:jc w:val="both"/>
+      </w:pPr>
+      <w:r>
+        <w:rPr>
+          <w:rFonts w:ascii="Times New Roman" w:hAnsi="Times New Roman" w:eastAsia="Times New Roman"/>
+          <w:b w:val="0"/>
+          <w:i/>
+          <w:sz w:val="24"/>
+        </w:rPr>
+        <w:t xml:space="preserve">Abstract. </w:t>
+      </w:r>
+      <w:r>
+        <w:rPr>
+          <w:rFonts w:ascii="Times New Roman" w:hAnsi="Times New Roman" w:eastAsia="Times New Roman"/>
+          <w:b w:val="0"/>
+          <w:i/>
+          <w:sz w:val="24"/>
+        </w:rPr>
+        <w:t>EduTech Vision is a real-time digital image processing system for educational demonstrations of visual attention, posture and audience engagement. The standard pipeline combines OpenCV YuNet face detection, expanded face crops, MediaPipe Face Landmarker, EAR/MAR geometric metrics, solvePnP head pose, moving averages and temporal state machines. In a reproducible smoke benchmark at 960x540, the enhanced profile improved face recall from 0.193 to 0.592 in individual mode and from 0.011 to 0.443 in audience mode, with F1 of 0.712 and 0.583. A specific individual-mode audit processed 15,193 full-video frames and obtained 86.6% valid face/metric frames and 82.5% frontal frames. The system is a computer vision demonstration, not a clinical or pedagogical diagnostic tool.</w:t>
+      </w:r>
+    </w:p>
+    <w:p>
+      <w:pPr>
+        <w:spacing w:after="160"/>
+        <w:ind w:left="454" w:right="454" w:firstLine="0"/>
+        <w:jc w:val="both"/>
+      </w:pPr>
+      <w:r>
+        <w:rPr>
+          <w:rFonts w:ascii="Times New Roman" w:hAnsi="Times New Roman" w:eastAsia="Times New Roman"/>
+          <w:b w:val="0"/>
+          <w:i/>
+          <w:sz w:val="24"/>
+        </w:rPr>
+        <w:t xml:space="preserve">Resumo. </w:t>
+      </w:r>
+      <w:r>
+        <w:rPr>
+          <w:rFonts w:ascii="Times New Roman" w:hAnsi="Times New Roman" w:eastAsia="Times New Roman"/>
+          <w:b w:val="0"/>
+          <w:i/>
+          <w:sz w:val="24"/>
+        </w:rPr>
+        <w:t>Este artigo apresenta o EduTech Vision, um sistema de processamento digital de imagens em tempo real para demonstrações educacionais de atenção visual, postura e engajamento de plateia. O pipeline padrão combina detecção facial OpenCV YuNet, recortes faciais ampliados, MediaPipe Face Landmarker, métricas geométricas EAR/MAR, pose de cabeça por solvePnP, médias móveis e máquinas de estados temporais. Em benchmark smoke reprodutível a 960x540, o perfil enhanced elevou o recall de face de 0,193 para 0,592 no modo individual e de 0,011 para 0,443 no modo plateia, com F1 de 0,712 e 0,583. Uma auditoria específica do modo individual processou 15.193 frames de vídeos completos e obteve 86,6% de frames com face/métricas válidas e 82,5% de frames frontais. O sistema é uma demonstração de visão computacional, não uma ferramenta diagnóstica clínica ou pedagógica.</w:t>
+      </w:r>
+    </w:p>
+    <w:p>
+      <w:pPr>
+        <w:keepNext/>
+        <w:spacing w:before="200" w:after="120"/>
         <w:jc w:val="left"/>
       </w:pPr>
       <w:r>
         <w:rPr>
           <w:rFonts w:ascii="Times New Roman" w:hAnsi="Times New Roman" w:eastAsia="Times New Roman"/>
           <w:b/>
+          <w:i w:val="0"/>
           <w:sz w:val="26"/>
         </w:rPr>
-        <w:t>2. Fundamentação</w:t>
+        <w:t>Introdução</w:t>
       </w:r>
     </w:p>
     <w:p>
       <w:pPr>
-        <w:spacing w:before="120" w:after="0" w:line="240" w:lineRule="auto"/>
-        <w:ind w:firstLine="720"/>
+        <w:spacing w:after="120"/>
+        <w:ind w:firstLine="0"/>
+        <w:jc w:val="both"/>
       </w:pPr>
       <w:r>
         <w:rPr>
@@ -198,13 +156,14 @@
           <w:i w:val="0"/>
           <w:sz w:val="24"/>
         </w:rPr>
-        <w:t>PDI e visão computacional combinam aquisição, pré-processamento, extração de características e tomada de decisão para interpretar padrões visuais [Gonzalez and Woods 2018, Szeliski 2022]. Em aplicações com faces, detectores localizam regiões de interesse, enquanto modelos de landmarks estimam pontos anatômicos que permitem calcular medidas geométricas. O uso de detectores pré-treinados como front-end é adequado quando o processamento posterior explicita o núcleo de PDI, como ocorre com razões geométricas, estimativa de pose e suavização temporal.</w:t>
+        <w:t>A observação de atenção, postura e engajamento em contextos educacionais costuma depender da percepção subjetiva do professor ou do próprio estudante. Essa percepção pode ser pedagogicamente útil, mas é descontínua, difícil de registrar e pouco reprodutível. Em Processamento Digital de Imagens (PDI), sinais visuais como abertura dos olhos, abertura da boca, orientação da cabeça e quantidade de faces no quadro permitem demonstrar como imagens podem ser transformadas em indicadores geométricos e temporais.</w:t>
       </w:r>
     </w:p>
     <w:p>
       <w:pPr>
-        <w:spacing w:before="120" w:after="0" w:line="240" w:lineRule="auto"/>
+        <w:spacing w:after="120"/>
         <w:ind w:firstLine="720"/>
+        <w:jc w:val="both"/>
       </w:pPr>
       <w:r>
         <w:rPr>
@@ -213,13 +172,14 @@
           <w:i w:val="0"/>
           <w:sz w:val="24"/>
         </w:rPr>
-        <w:t>No modo individual, a razão de aspecto dos olhos, ou Eye Aspect Ratio (EAR), é calculada pela razão entre distâncias verticais e horizontais de pontos das pálpebras. Reduções sustentadas do EAR indicam olhos fechados por mais tempo que uma piscada comum. De modo análogo, a Mouth Aspect Ratio (MAR) relaciona abertura vertical e largura da boca, permitindo sinalizar bocejo quando o valor permanece elevado. Essas métricas são sensíveis a escala, pose, iluminação e qualidade dos landmarks; por isso são suavizadas antes da decisão.</w:t>
+        <w:t>O EduTech Vision foi desenvolvido na Trilha 3 da disciplina de PDI com dois cenários complementares. No modo individual, uma câmera frontal acompanha uma pessoa e estima fadiga ocular, bocejo, queda postural e desatenção sustentada. No modo plateia, uma câmera voltada a um grupo estima, de forma agregada, a proporção de faces com pose orientada ao palco ou professor. O sistema não realiza reconhecimento de identidade e não mede aprendizagem.</w:t>
       </w:r>
     </w:p>
     <w:p>
       <w:pPr>
-        <w:spacing w:before="120" w:after="0" w:line="240" w:lineRule="auto"/>
+        <w:spacing w:after="120"/>
         <w:ind w:firstLine="720"/>
+        <w:jc w:val="both"/>
       </w:pPr>
       <w:r>
         <w:rPr>
@@ -228,28 +188,30 @@
           <w:i w:val="0"/>
           <w:sz w:val="24"/>
         </w:rPr>
-        <w:t>A postura e o foco visual aproximado são estimados por pose de cabeça. O sistema usa correspondências 2D-3D de pontos faciais e a função solvePnP para obter yaw, pitch e roll. No modo plateia, yaw e pitch são comparados a um eixo de referência calibrado no início da sessão. A decisão final é agregada em janela temporal, pois quadros isolados podem conter ruído, oclusões ou landmarks incompletos.</w:t>
+        <w:t>O objetivo deste artigo é apresentar a versão final do produto, sua fundamentação técnica, o pipeline de processamento, a metodologia experimental e os resultados quantitativos disponíveis. A escrita prioriza evidências numéricas e limitações, pois os indicadores gerados são aproximações visuais para demonstração acadêmica de PDI em tempo real.</w:t>
       </w:r>
     </w:p>
     <w:p>
       <w:pPr>
-        <w:spacing w:before="240" w:after="0"/>
-        <w:ind w:firstLine="0"/>
+        <w:keepNext/>
+        <w:spacing w:before="200" w:after="120"/>
         <w:jc w:val="left"/>
       </w:pPr>
       <w:r>
         <w:rPr>
           <w:rFonts w:ascii="Times New Roman" w:hAnsi="Times New Roman" w:eastAsia="Times New Roman"/>
           <w:b/>
+          <w:i w:val="0"/>
           <w:sz w:val="26"/>
         </w:rPr>
-        <w:t>3. Sistema Proposto</w:t>
+        <w:t>Fundamentação Teórica</w:t>
       </w:r>
     </w:p>
     <w:p>
       <w:pPr>
-        <w:spacing w:before="120" w:after="0" w:line="240" w:lineRule="auto"/>
-        <w:ind w:firstLine="720"/>
+        <w:spacing w:after="120"/>
+        <w:ind w:firstLine="0"/>
+        <w:jc w:val="both"/>
       </w:pPr>
       <w:r>
         <w:rPr>
@@ -258,18 +220,142 @@
           <w:i w:val="0"/>
           <w:sz w:val="24"/>
         </w:rPr>
-        <w:t>A Figura 1 sintetiza o pipeline atual. A entrada pode ser câmera ou vídeo, processada em resolução padrão de 960x540. O perfil padrão é enhanced: OpenCV YuNet detecta faces, aplica supressão de não máximos e prioriza candidatos; em seguida, cada região é recortada com margem ampliada e enviada ao MediaPipe Face Landmarker. O perfil mediapipe é mantido como baseline, enquanto o perfil research, baseado em SCRFD, é apenas comparativo acadêmico e não constitui o padrão de distribuição.</w:t>
+        <w:t>PDI e visão computacional organizam etapas de aquisição, pré-processamento, segmentação, extração de características e interpretação visual [Gonzalez and Woods 2018, Szeliski 2022]. Em aplicações com faces, detectores localizam regiões de interesse, enquanto modelos de landmarks estimam pontos faciais que permitem calcular métricas geométricas e pose.</w:t>
       </w:r>
     </w:p>
     <w:p>
       <w:pPr>
-        <w:spacing w:before="120" w:after="0"/>
-        <w:jc w:val="center"/>
+        <w:spacing w:after="120"/>
+        <w:ind w:firstLine="720"/>
+        <w:jc w:val="both"/>
       </w:pPr>
+      <w:r>
+        <w:rPr>
+          <w:rFonts w:ascii="Times New Roman" w:hAnsi="Times New Roman" w:eastAsia="Times New Roman"/>
+          <w:b w:val="0"/>
+          <w:i w:val="0"/>
+          <w:sz w:val="24"/>
+        </w:rPr>
+        <w:t>No modo individual, o Eye Aspect Ratio (EAR) é calculado pela razão entre distâncias verticais e horizontais de landmarks dos olhos, seguindo a ideia de detecção de piscadas por geometria facial [Soukupova and Cech 2016]. Quando os olhos fecham, as distâncias verticais diminuem e o EAR cai. A Mouth Aspect Ratio (MAR) usa princípio semelhante para representar abertura da boca e sinalizar bocejos sustentados.</w:t>
+      </w:r>
+    </w:p>
+    <w:p>
+      <w:pPr>
+        <w:spacing w:after="120"/>
+        <w:ind w:firstLine="720"/>
+        <w:jc w:val="both"/>
+      </w:pPr>
+      <w:r>
+        <w:rPr>
+          <w:rFonts w:ascii="Times New Roman" w:hAnsi="Times New Roman" w:eastAsia="Times New Roman"/>
+          <w:b w:val="0"/>
+          <w:i w:val="0"/>
+          <w:sz w:val="24"/>
+        </w:rPr>
+        <w:t>A orientação da cabeça é estimada por correspondências 2D-3D e pela família de algoritmos solvePnP [Lepetit et al. 2009]. A partir de landmarks como nariz, queixo, cantos dos olhos e boca, o sistema estima yaw, pitch e roll. Esses ângulos são suavizados no tempo porque frames isolados podem conter ruído de landmark, oclusão ou blur de movimento.</w:t>
+      </w:r>
+    </w:p>
+    <w:p>
+      <w:pPr>
+        <w:spacing w:after="120"/>
+        <w:ind w:firstLine="720"/>
+        <w:jc w:val="both"/>
+      </w:pPr>
+      <w:r>
+        <w:rPr>
+          <w:rFonts w:ascii="Times New Roman" w:hAnsi="Times New Roman" w:eastAsia="Times New Roman"/>
+          <w:b w:val="0"/>
+          <w:i w:val="0"/>
+          <w:sz w:val="24"/>
+        </w:rPr>
+        <w:t>A detecção inicial de faces foi avaliada contra o uso direto de MediaPipe no quadro completo [Lugaresi et al. 2019]. O benchmark WIDER FACE [Yang et al. 2016] foi usado como base anotada para medir recall, precisão e F1 em diferentes tamanhos de face, distâncias e perturbações sintéticas.</w:t>
+      </w:r>
+    </w:p>
+    <w:p>
+      <w:pPr>
+        <w:keepNext/>
+        <w:spacing w:before="200" w:after="120"/>
+        <w:jc w:val="left"/>
+      </w:pPr>
+      <w:r>
+        <w:rPr>
+          <w:rFonts w:ascii="Times New Roman" w:hAnsi="Times New Roman" w:eastAsia="Times New Roman"/>
+          <w:b/>
+          <w:i w:val="0"/>
+          <w:sz w:val="26"/>
+        </w:rPr>
+        <w:t>Metodologia e Pipeline</w:t>
+      </w:r>
+    </w:p>
+    <w:p>
+      <w:pPr>
+        <w:spacing w:after="120"/>
+        <w:ind w:firstLine="0"/>
+        <w:jc w:val="both"/>
+      </w:pPr>
+      <w:r>
+        <w:rPr>
+          <w:rFonts w:ascii="Times New Roman" w:hAnsi="Times New Roman" w:eastAsia="Times New Roman"/>
+          <w:b w:val="0"/>
+          <w:i w:val="0"/>
+          <w:sz w:val="24"/>
+        </w:rPr>
+        <w:t>A Figura 1 resume o pipeline operacional. A entrada é uma webcam ou arquivo de vídeo redimensionado para 960x540 no modo padrão. O perfil enhanced aplica OpenCV YuNet para localizar faces, usa supressão de não máximos e recortes ampliados, e então executa MediaPipe Face Landmarker em cada região de interesse. Essa escolha preserva o MediaPipe para landmarks e desloca o gargalo de faces pequenas para um detector frontal mais adequado.</w:t>
+      </w:r>
+    </w:p>
+    <w:p>
+      <w:pPr>
+        <w:spacing w:after="120"/>
+        <w:ind w:firstLine="720"/>
+        <w:jc w:val="both"/>
+      </w:pPr>
+      <w:r>
+        <w:rPr>
+          <w:rFonts w:ascii="Times New Roman" w:hAnsi="Times New Roman" w:eastAsia="Times New Roman"/>
+          <w:b w:val="0"/>
+          <w:i w:val="0"/>
+          <w:sz w:val="24"/>
+        </w:rPr>
+        <w:t>Três perfis foram mantidos para comparação metodológica. O perfil mediapipe é o baseline, com processamento direto do quadro. O perfil enhanced é o padrão distribuível, combinando YuNet e landmarks em crops. O perfil research usa SCRFD/InsightFace apenas como comparativo acadêmico opcional; o padrão de entrega é o perfil enhanced.</w:t>
+      </w:r>
+    </w:p>
+    <w:p>
+      <w:pPr>
+        <w:spacing w:after="120"/>
+        <w:ind w:firstLine="720"/>
+        <w:jc w:val="both"/>
+      </w:pPr>
+      <w:r>
+        <w:rPr>
+          <w:rFonts w:ascii="Times New Roman" w:hAnsi="Times New Roman" w:eastAsia="Times New Roman"/>
+          <w:b w:val="0"/>
+          <w:i w:val="0"/>
+          <w:sz w:val="24"/>
+        </w:rPr>
+        <w:t>No modo individual, o sistema usa no máximo uma face e confiança facial 0,70. A calibração dura 5 s a partir da primeira amostra facial válida, evitando baseline vazio quando a câmera ou vídeo inicia sem rosto. O baseline armazena medianas e desvios robustos de EAR, MAR, yaw e pitch. Para yaw/pitch, a estatística é circular: valores próximos de +179 e -179 graus são tratados como orientações equivalentes, não como extremos opostos.</w:t>
+      </w:r>
+    </w:p>
+    <w:p>
+      <w:pPr>
+        <w:spacing w:after="120"/>
+        <w:ind w:firstLine="720"/>
+        <w:jc w:val="both"/>
+      </w:pPr>
+      <w:r>
+        <w:rPr>
+          <w:rFonts w:ascii="Times New Roman" w:hAnsi="Times New Roman" w:eastAsia="Times New Roman"/>
+          <w:b w:val="0"/>
+          <w:i w:val="0"/>
+          <w:sz w:val="24"/>
+        </w:rPr>
+        <w:t>Os alertas usam médias móveis e condições sustentadas. Fadiga ocular exige EAR médio abaixo do limiar dinâmico e queda simultânea dos dois olhos; bocejo exige MAR acima do limiar; postura usa desvio de pitch; e desatenção usa desvio de yaw. No modo plateia, cada face com pose válida é comparada a um eixo de palco calibrado, e os resultados são agregados em janelas de 10 s.</w:t>
+      </w:r>
+    </w:p>
+    <w:p>
       <w:r>
         <w:drawing>
           <wp:inline xmlns:a="http://schemas.openxmlformats.org/drawingml/2006/main" xmlns:pic="http://schemas.openxmlformats.org/drawingml/2006/picture">
-            <wp:extent cx="5220000" cy="1624000"/>
+            <wp:extent cx="5220000" cy="1222617"/>
             <wp:docPr id="1" name="Picture 1"/>
             <wp:cNvGraphicFramePr>
               <a:graphicFrameLocks noChangeAspect="1"/>
@@ -278,7 +364,7 @@
               <a:graphicData uri="http://schemas.openxmlformats.org/drawingml/2006/picture">
                 <pic:pic>
                   <pic:nvPicPr>
-                    <pic:cNvPr id="0" name="pipeline_edutech_vision.png"/>
+                    <pic:cNvPr id="0" name="pipeline_generated.png"/>
                     <pic:cNvPicPr/>
                   </pic:nvPicPr>
                   <pic:blipFill>
@@ -290,7 +376,7 @@
                   <pic:spPr>
                     <a:xfrm>
                       <a:off x="0" y="0"/>
-                      <a:ext cx="5220000" cy="1624000"/>
+                      <a:ext cx="5220000" cy="1222617"/>
                     </a:xfrm>
                     <a:prstGeom prst="rect"/>
                   </pic:spPr>
@@ -303,14 +389,14 @@
     </w:p>
     <w:p>
       <w:pPr>
-        <w:spacing w:before="120" w:after="120" w:line="240" w:lineRule="auto"/>
-        <w:ind w:firstLine="0"/>
+        <w:spacing w:after="140"/>
         <w:jc w:val="center"/>
       </w:pPr>
       <w:r>
         <w:rPr>
-          <w:rFonts w:ascii="Arial" w:hAnsi="Arial" w:eastAsia="Arial"/>
+          <w:rFonts w:ascii="Times New Roman" w:hAnsi="Times New Roman" w:eastAsia="Times New Roman"/>
           <w:b/>
+          <w:i w:val="0"/>
           <w:sz w:val="20"/>
         </w:rPr>
         <w:t>Figura 1. Pipeline atual do EduTech Vision.</w:t>
@@ -318,8 +404,25 @@
     </w:p>
     <w:p>
       <w:pPr>
-        <w:spacing w:before="120" w:after="0" w:line="240" w:lineRule="auto"/>
-        <w:ind w:firstLine="720"/>
+        <w:keepNext/>
+        <w:spacing w:before="200" w:after="120"/>
+        <w:jc w:val="left"/>
+      </w:pPr>
+      <w:r>
+        <w:rPr>
+          <w:rFonts w:ascii="Times New Roman" w:hAnsi="Times New Roman" w:eastAsia="Times New Roman"/>
+          <w:b/>
+          <w:i w:val="0"/>
+          <w:sz w:val="26"/>
+        </w:rPr>
+        <w:t>Metodologia Experimental</w:t>
+      </w:r>
+    </w:p>
+    <w:p>
+      <w:pPr>
+        <w:spacing w:after="120"/>
+        <w:ind w:firstLine="0"/>
+        <w:jc w:val="both"/>
       </w:pPr>
       <w:r>
         <w:rPr>
@@ -328,13 +431,14 @@
           <w:i w:val="0"/>
           <w:sz w:val="24"/>
         </w:rPr>
-        <w:t>No modo individual, a configuração atual usa confiança facial 0,70 e no máximo uma face. A primeira etapa de uso realiza calibração de 5 s para estabelecer referências de EAR, MAR, yaw e pitch. Em seguida, as medidas passam por média móvel de janela 7 e por condições sustentadas, evitando que piscadas ou movimentos pontuais acionem alertas. Os alertas visuais indicam fadiga, bocejo, postura ruim e desatenção, sem atribuir diagnóstico clínico.</w:t>
+        <w:t>A avaliação foi organizada em quatro frentes. A primeira foi um benchmark smoke do detector, comparando o baseline mediapipe e o perfil enhanced nos modos individual e plateia. As métricas foram recall de face, recall de landmarks, precisão, F1, FPS médio e FPS mínimo. O recall de face mede caixas detectadas; o recall de landmarks exige também pontos suficientes para EAR, MAR ou pose.</w:t>
       </w:r>
     </w:p>
     <w:p>
       <w:pPr>
-        <w:spacing w:before="120" w:after="0" w:line="240" w:lineRule="auto"/>
+        <w:spacing w:after="120"/>
         <w:ind w:firstLine="720"/>
+        <w:jc w:val="both"/>
       </w:pPr>
       <w:r>
         <w:rPr>
@@ -343,28 +447,14 @@
           <w:i w:val="0"/>
           <w:sz w:val="24"/>
         </w:rPr>
-        <w:t>No modo plateia, a configuração atual usa confiança facial 0,60, limite de 24 faces, tolerância de 30 graus em yaw, tolerância de 20 graus em pitch e janela de agregação de 10 s. Faces detectadas sem landmarks confiáveis podem aparecer no painel visual como detecções anônimas, mas não entram no cálculo de pose e engajamento. A saída persistida é agregada, composta por séries temporais e estatísticas da sessão.</w:t>
+        <w:t>A segunda frente foi uma auditoria específica do modo individual. Foram baixados vídeos frontais 1080p e retratos estáticos por manifesto reprodutível. O auditor processou vídeos completos, sem amostragem por intervalo, redimensionando cada frame para a mesma resolução operacional do app. Cada frame gerou uma linha com detecção, qualidade dos landmarks, EAR, MAR, yaw, pitch, deltas em relação ao baseline e classificação frontal/neutra.</w:t>
       </w:r>
     </w:p>
     <w:p>
       <w:pPr>
-        <w:spacing w:before="240" w:after="0"/>
-        <w:ind w:firstLine="0"/>
-        <w:jc w:val="left"/>
-      </w:pPr>
-      <w:r>
-        <w:rPr>
-          <w:rFonts w:ascii="Times New Roman" w:hAnsi="Times New Roman" w:eastAsia="Times New Roman"/>
-          <w:b/>
-          <w:sz w:val="26"/>
-        </w:rPr>
-        <w:t>4. Metodologia Experimental</w:t>
-      </w:r>
-    </w:p>
-    <w:p>
-      <w:pPr>
-        <w:spacing w:before="120" w:after="0" w:line="240" w:lineRule="auto"/>
+        <w:spacing w:after="120"/>
         <w:ind w:firstLine="720"/>
+        <w:jc w:val="both"/>
       </w:pPr>
       <w:r>
         <w:rPr>
@@ -373,13 +463,14 @@
           <w:i w:val="0"/>
           <w:sz w:val="24"/>
         </w:rPr>
-        <w:t>A avaliação foi organizada em quatro frentes. A primeira é o benchmark smoke do detector, que compara o baseline MediaPipe em quadro inteiro com o perfil enhanced em dois modos. As métricas são recall de face, recall de landmarks, precisão, F1, FPS médio e FPS mínimo. O recall de face considera uma caixa localizada corretamente; o recall de landmarks é mais restritivo e exige que a face também gere pontos suficientes para EAR, MAR ou pose.</w:t>
+        <w:t>A terceira frente foi a auditoria HQ de plateia. Vídeos 1080p completos foram processados do primeiro ao último frame e quadros selecionados foram comparados a contagens manuais de rostos avaliáveis. Foram medidos acertos exatos, erro de no máximo um rosto, erro absoluto médio, presença da contagem manual em janela temporal de +/-1 s, FPS médio e FPS p10.</w:t>
       </w:r>
     </w:p>
     <w:p>
       <w:pPr>
-        <w:spacing w:before="120" w:after="0" w:line="240" w:lineRule="auto"/>
+        <w:spacing w:after="120"/>
         <w:ind w:firstLine="720"/>
+        <w:jc w:val="both"/>
       </w:pPr>
       <w:r>
         <w:rPr>
@@ -388,13 +479,30 @@
           <w:i w:val="0"/>
           <w:sz w:val="24"/>
         </w:rPr>
-        <w:t>A segunda frente é a auditoria HQ de plateia. Nessa avaliação, vídeos 1080p são processados integralmente e quadros selecionados são comparados com contagens manuais de rostos avaliáveis. As métricas são acertos exatos, casos com erro de no máximo um rosto, erro absoluto médio, presença da contagem manual dentro da janela temporal de mais ou menos 1 s, FPS médio e FPS no percentil 10.</w:t>
+        <w:t>A quarta frente foi a instrumentação dos protocolos formais: iluminação, oclusão, FPS, matriz de confusão e tolerância a falhas. Na versão atual, apenas a matriz demonstrativa possui resultado consolidado; os demais protocolos estão implementados como scripts de coleta, mas não foram usados como evidência final por falta de nova execução presencial completa. Essa limitação é explicitada para evitar uso indevido de logs preliminares.</w:t>
       </w:r>
     </w:p>
     <w:p>
       <w:pPr>
-        <w:spacing w:before="120" w:after="0" w:line="240" w:lineRule="auto"/>
-        <w:ind w:firstLine="720"/>
+        <w:keepNext/>
+        <w:spacing w:before="200" w:after="120"/>
+        <w:jc w:val="left"/>
+      </w:pPr>
+      <w:r>
+        <w:rPr>
+          <w:rFonts w:ascii="Times New Roman" w:hAnsi="Times New Roman" w:eastAsia="Times New Roman"/>
+          <w:b/>
+          <w:i w:val="0"/>
+          <w:sz w:val="26"/>
+        </w:rPr>
+        <w:t>Resultados</w:t>
+      </w:r>
+    </w:p>
+    <w:p>
+      <w:pPr>
+        <w:spacing w:after="120"/>
+        <w:ind w:firstLine="0"/>
+        <w:jc w:val="both"/>
       </w:pPr>
       <w:r>
         <w:rPr>
@@ -403,111 +511,50 @@
           <w:i w:val="0"/>
           <w:sz w:val="24"/>
         </w:rPr>
-        <w:t>A terceira frente é o relatório de sessão. Ele demonstra instrumentação da aplicação por meio de logs CSV, gráficos, relatório HTML, relatório PDF, timeline de eventos e telemetria. Esses artefatos são usados para evidenciar capacidade de registro e reprodutibilidade da demonstração, e não como verdade final dos protocolos formais.</w:t>
+        <w:t>A Tabela 1 apresenta o benchmark smoke canônico da versão atual. Em ambos os modos, o perfil enhanced aumenta substancialmente o recall de face e o F1 em relação ao baseline MediaPipe, mantendo desempenho em tempo real. A redução de FPS é esperada porque o pipeline passa a executar detecção por YuNet, recortes ampliados e landmarks em regiões de interesse.</w:t>
       </w:r>
     </w:p>
     <w:p>
       <w:pPr>
-        <w:spacing w:before="120" w:after="0" w:line="240" w:lineRule="auto"/>
-        <w:ind w:firstLine="720"/>
-      </w:pPr>
-      <w:r>
-        <w:rPr>
-          <w:rFonts w:ascii="Times New Roman" w:hAnsi="Times New Roman" w:eastAsia="Times New Roman"/>
-          <w:b w:val="0"/>
-          <w:i w:val="0"/>
-          <w:sz w:val="24"/>
-        </w:rPr>
-        <w:t>Por fim, a versão atual contém metodologia e scripts para os cinco protocolos formais do plano da disciplina: robustez luminosa, resiliência a oclusão, telemetria de FPS, matriz de confusão e tolerância a falhas. Entretanto, não foram usados resultados históricos, preliminares ou logs finais antigos como evidência da versão atual. Na ausência de novos registros experimentais finais desses cinco protocolos, eles são tratados neste artigo como metodologia disponível para reexecução. O suporte a reconexão de câmera é descrito apenas como característica de robustez implementada, não como resultado experimental principal.</w:t>
-      </w:r>
-    </w:p>
-    <w:p>
-      <w:pPr>
-        <w:spacing w:before="240" w:after="0"/>
-        <w:ind w:firstLine="0"/>
-        <w:jc w:val="left"/>
+        <w:spacing w:after="140"/>
+        <w:jc w:val="center"/>
       </w:pPr>
       <w:r>
         <w:rPr>
           <w:rFonts w:ascii="Times New Roman" w:hAnsi="Times New Roman" w:eastAsia="Times New Roman"/>
           <w:b/>
-          <w:sz w:val="26"/>
-        </w:rPr>
-        <w:t>5. Resultados</w:t>
-      </w:r>
-    </w:p>
-    <w:p>
-      <w:pPr>
-        <w:spacing w:before="120" w:after="0" w:line="240" w:lineRule="auto"/>
-        <w:ind w:firstLine="0"/>
-      </w:pPr>
-      <w:r>
-        <w:rPr>
-          <w:rFonts w:ascii="Times New Roman" w:hAnsi="Times New Roman" w:eastAsia="Times New Roman"/>
-          <w:b w:val="0"/>
           <w:i w:val="0"/>
-          <w:sz w:val="24"/>
-        </w:rPr>
-        <w:t>A Tabela 1 apresenta o benchmark smoke canônico da versão atual. Em ambos os modos, o perfil enhanced aumenta substancialmente o recall de face e o F1 em relação ao baseline MediaPipe, mantendo desempenho em tempo real. A redução de FPS é esperada, pois o pipeline passa a executar detecção por YuNet, recortes ampliados e landmarks em regiões de interesse, em vez de depender apenas do rastreamento direto no quadro inteiro.</w:t>
-      </w:r>
-    </w:p>
-    <w:p>
-      <w:pPr>
-        <w:spacing w:before="120" w:after="120" w:line="240" w:lineRule="auto"/>
-        <w:ind w:firstLine="0"/>
-        <w:jc w:val="center"/>
-      </w:pPr>
-      <w:r>
-        <w:rPr>
-          <w:rFonts w:ascii="Arial" w:hAnsi="Arial" w:eastAsia="Arial"/>
-          <w:b/>
           <w:sz w:val="20"/>
         </w:rPr>
-        <w:t>Tabela 1. Benchmark smoke do detector em 960x540.</w:t>
+        <w:t>Tabela 1. Benchmark smoke do detector em resolução 960x540.</w:t>
       </w:r>
     </w:p>
     <w:tbl>
       <w:tblPr>
+        <w:tblStyle w:val="TableGrid"/>
         <w:tblW w:type="auto" w:w="0"/>
         <w:jc w:val="center"/>
-        <w:tblLayout w:type="autofit"/>
         <w:tblLook w:firstColumn="1" w:firstRow="1" w:lastColumn="0" w:lastRow="0" w:noHBand="0" w:noVBand="1" w:val="04A0"/>
-        <w:tblBorders>
-          <w:top w:val="single" w:sz="4" w:space="0" w:color="808080"/>
-          <w:left w:val="single" w:sz="4" w:space="0" w:color="808080"/>
-          <w:bottom w:val="single" w:sz="4" w:space="0" w:color="808080"/>
-          <w:right w:val="single" w:sz="4" w:space="0" w:color="808080"/>
-          <w:insideH w:val="single" w:sz="4" w:space="0" w:color="808080"/>
-          <w:insideV w:val="single" w:sz="4" w:space="0" w:color="808080"/>
-        </w:tblBorders>
-        <w:tblCellMar>
-          <w:top w:w="20" w:type="dxa"/>
-          <w:start w:w="35" w:type="dxa"/>
-          <w:bottom w:w="20" w:type="dxa"/>
-          <w:end w:w="35" w:type="dxa"/>
-        </w:tblCellMar>
       </w:tblPr>
       <w:tblGrid>
-        <w:gridCol w:w="1063"/>
-        <w:gridCol w:w="1063"/>
-        <w:gridCol w:w="1063"/>
-        <w:gridCol w:w="1063"/>
-        <w:gridCol w:w="1063"/>
-        <w:gridCol w:w="1063"/>
-        <w:gridCol w:w="1063"/>
-        <w:gridCol w:w="1063"/>
+        <w:gridCol w:w="1215"/>
+        <w:gridCol w:w="1215"/>
+        <w:gridCol w:w="1215"/>
+        <w:gridCol w:w="1215"/>
+        <w:gridCol w:w="1215"/>
+        <w:gridCol w:w="1215"/>
+        <w:gridCol w:w="1215"/>
       </w:tblGrid>
       <w:tr>
         <w:tc>
           <w:tcPr>
-            <w:tcW w:type="dxa" w:w="1063"/>
-            <w:vAlign w:val="center"/>
+            <w:tcW w:type="dxa" w:w="1215"/>
           </w:tcPr>
           <w:p>
             <w:pPr>
-              <w:spacing w:before="0" w:after="0"/>
               <w:jc w:val="center"/>
             </w:pPr>
+            <w:r/>
             <w:r>
               <w:rPr>
                 <w:rFonts w:ascii="Times New Roman" w:hAnsi="Times New Roman" w:eastAsia="Times New Roman"/>
@@ -520,14 +567,13 @@
         </w:tc>
         <w:tc>
           <w:tcPr>
-            <w:tcW w:type="dxa" w:w="1063"/>
-            <w:vAlign w:val="center"/>
+            <w:tcW w:type="dxa" w:w="1215"/>
           </w:tcPr>
           <w:p>
             <w:pPr>
-              <w:spacing w:before="0" w:after="0"/>
               <w:jc w:val="center"/>
             </w:pPr>
+            <w:r/>
             <w:r>
               <w:rPr>
                 <w:rFonts w:ascii="Times New Roman" w:hAnsi="Times New Roman" w:eastAsia="Times New Roman"/>
@@ -540,14 +586,13 @@
         </w:tc>
         <w:tc>
           <w:tcPr>
-            <w:tcW w:type="dxa" w:w="1063"/>
-            <w:vAlign w:val="center"/>
+            <w:tcW w:type="dxa" w:w="1215"/>
           </w:tcPr>
           <w:p>
             <w:pPr>
-              <w:spacing w:before="0" w:after="0"/>
               <w:jc w:val="center"/>
             </w:pPr>
+            <w:r/>
             <w:r>
               <w:rPr>
                 <w:rFonts w:ascii="Times New Roman" w:hAnsi="Times New Roman" w:eastAsia="Times New Roman"/>
@@ -560,14 +605,13 @@
         </w:tc>
         <w:tc>
           <w:tcPr>
-            <w:tcW w:type="dxa" w:w="1063"/>
-            <w:vAlign w:val="center"/>
+            <w:tcW w:type="dxa" w:w="1215"/>
           </w:tcPr>
           <w:p>
             <w:pPr>
-              <w:spacing w:before="0" w:after="0"/>
               <w:jc w:val="center"/>
             </w:pPr>
+            <w:r/>
             <w:r>
               <w:rPr>
                 <w:rFonts w:ascii="Times New Roman" w:hAnsi="Times New Roman" w:eastAsia="Times New Roman"/>
@@ -580,14 +624,13 @@
         </w:tc>
         <w:tc>
           <w:tcPr>
-            <w:tcW w:type="dxa" w:w="1063"/>
-            <w:vAlign w:val="center"/>
+            <w:tcW w:type="dxa" w:w="1215"/>
           </w:tcPr>
           <w:p>
             <w:pPr>
-              <w:spacing w:before="0" w:after="0"/>
               <w:jc w:val="center"/>
             </w:pPr>
+            <w:r/>
             <w:r>
               <w:rPr>
                 <w:rFonts w:ascii="Times New Roman" w:hAnsi="Times New Roman" w:eastAsia="Times New Roman"/>
@@ -600,14 +643,13 @@
         </w:tc>
         <w:tc>
           <w:tcPr>
-            <w:tcW w:type="dxa" w:w="1063"/>
-            <w:vAlign w:val="center"/>
+            <w:tcW w:type="dxa" w:w="1215"/>
           </w:tcPr>
           <w:p>
             <w:pPr>
-              <w:spacing w:before="0" w:after="0"/>
               <w:jc w:val="center"/>
             </w:pPr>
+            <w:r/>
             <w:r>
               <w:rPr>
                 <w:rFonts w:ascii="Times New Roman" w:hAnsi="Times New Roman" w:eastAsia="Times New Roman"/>
@@ -620,14 +662,1130 @@
         </w:tc>
         <w:tc>
           <w:tcPr>
-            <w:tcW w:type="dxa" w:w="1063"/>
-            <w:vAlign w:val="center"/>
+            <w:tcW w:type="dxa" w:w="1215"/>
           </w:tcPr>
           <w:p>
             <w:pPr>
-              <w:spacing w:before="0" w:after="0"/>
               <w:jc w:val="center"/>
             </w:pPr>
+            <w:r/>
+            <w:r>
+              <w:rPr>
+                <w:rFonts w:ascii="Times New Roman" w:hAnsi="Times New Roman" w:eastAsia="Times New Roman"/>
+                <w:b/>
+                <w:sz w:val="16"/>
+              </w:rPr>
+              <w:t>FPS médio</w:t>
+            </w:r>
+          </w:p>
+        </w:tc>
+      </w:tr>
+      <w:tr>
+        <w:tc>
+          <w:tcPr>
+            <w:tcW w:type="dxa" w:w="1215"/>
+          </w:tcPr>
+          <w:p>
+            <w:pPr>
+              <w:jc w:val="center"/>
+            </w:pPr>
+            <w:r/>
+            <w:r>
+              <w:rPr>
+                <w:rFonts w:ascii="Times New Roman" w:hAnsi="Times New Roman" w:eastAsia="Times New Roman"/>
+                <w:b w:val="0"/>
+                <w:sz w:val="16"/>
+              </w:rPr>
+              <w:t>Individual</w:t>
+            </w:r>
+          </w:p>
+        </w:tc>
+        <w:tc>
+          <w:tcPr>
+            <w:tcW w:type="dxa" w:w="1215"/>
+          </w:tcPr>
+          <w:p>
+            <w:pPr>
+              <w:jc w:val="center"/>
+            </w:pPr>
+            <w:r/>
+            <w:r>
+              <w:rPr>
+                <w:rFonts w:ascii="Times New Roman" w:hAnsi="Times New Roman" w:eastAsia="Times New Roman"/>
+                <w:b w:val="0"/>
+                <w:sz w:val="16"/>
+              </w:rPr>
+              <w:t>mediapipe</w:t>
+            </w:r>
+          </w:p>
+        </w:tc>
+        <w:tc>
+          <w:tcPr>
+            <w:tcW w:type="dxa" w:w="1215"/>
+          </w:tcPr>
+          <w:p>
+            <w:pPr>
+              <w:jc w:val="center"/>
+            </w:pPr>
+            <w:r/>
+            <w:r>
+              <w:rPr>
+                <w:rFonts w:ascii="Times New Roman" w:hAnsi="Times New Roman" w:eastAsia="Times New Roman"/>
+                <w:b w:val="0"/>
+                <w:sz w:val="16"/>
+              </w:rPr>
+              <w:t>0,193</w:t>
+            </w:r>
+          </w:p>
+        </w:tc>
+        <w:tc>
+          <w:tcPr>
+            <w:tcW w:type="dxa" w:w="1215"/>
+          </w:tcPr>
+          <w:p>
+            <w:pPr>
+              <w:jc w:val="center"/>
+            </w:pPr>
+            <w:r/>
+            <w:r>
+              <w:rPr>
+                <w:rFonts w:ascii="Times New Roman" w:hAnsi="Times New Roman" w:eastAsia="Times New Roman"/>
+                <w:b w:val="0"/>
+                <w:sz w:val="16"/>
+              </w:rPr>
+              <w:t>0,193</w:t>
+            </w:r>
+          </w:p>
+        </w:tc>
+        <w:tc>
+          <w:tcPr>
+            <w:tcW w:type="dxa" w:w="1215"/>
+          </w:tcPr>
+          <w:p>
+            <w:pPr>
+              <w:jc w:val="center"/>
+            </w:pPr>
+            <w:r/>
+            <w:r>
+              <w:rPr>
+                <w:rFonts w:ascii="Times New Roman" w:hAnsi="Times New Roman" w:eastAsia="Times New Roman"/>
+                <w:b w:val="0"/>
+                <w:sz w:val="16"/>
+              </w:rPr>
+              <w:t>1,000</w:t>
+            </w:r>
+          </w:p>
+        </w:tc>
+        <w:tc>
+          <w:tcPr>
+            <w:tcW w:type="dxa" w:w="1215"/>
+          </w:tcPr>
+          <w:p>
+            <w:pPr>
+              <w:jc w:val="center"/>
+            </w:pPr>
+            <w:r/>
+            <w:r>
+              <w:rPr>
+                <w:rFonts w:ascii="Times New Roman" w:hAnsi="Times New Roman" w:eastAsia="Times New Roman"/>
+                <w:b w:val="0"/>
+                <w:sz w:val="16"/>
+              </w:rPr>
+              <w:t>0,324</w:t>
+            </w:r>
+          </w:p>
+        </w:tc>
+        <w:tc>
+          <w:tcPr>
+            <w:tcW w:type="dxa" w:w="1215"/>
+          </w:tcPr>
+          <w:p>
+            <w:pPr>
+              <w:jc w:val="center"/>
+            </w:pPr>
+            <w:r/>
+            <w:r>
+              <w:rPr>
+                <w:rFonts w:ascii="Times New Roman" w:hAnsi="Times New Roman" w:eastAsia="Times New Roman"/>
+                <w:b w:val="0"/>
+                <w:sz w:val="16"/>
+              </w:rPr>
+              <w:t>242,4</w:t>
+            </w:r>
+          </w:p>
+        </w:tc>
+      </w:tr>
+      <w:tr>
+        <w:tc>
+          <w:tcPr>
+            <w:tcW w:type="dxa" w:w="1215"/>
+          </w:tcPr>
+          <w:p>
+            <w:pPr>
+              <w:jc w:val="center"/>
+            </w:pPr>
+            <w:r/>
+            <w:r>
+              <w:rPr>
+                <w:rFonts w:ascii="Times New Roman" w:hAnsi="Times New Roman" w:eastAsia="Times New Roman"/>
+                <w:b w:val="0"/>
+                <w:sz w:val="16"/>
+              </w:rPr>
+              <w:t>Individual</w:t>
+            </w:r>
+          </w:p>
+        </w:tc>
+        <w:tc>
+          <w:tcPr>
+            <w:tcW w:type="dxa" w:w="1215"/>
+          </w:tcPr>
+          <w:p>
+            <w:pPr>
+              <w:jc w:val="center"/>
+            </w:pPr>
+            <w:r/>
+            <w:r>
+              <w:rPr>
+                <w:rFonts w:ascii="Times New Roman" w:hAnsi="Times New Roman" w:eastAsia="Times New Roman"/>
+                <w:b w:val="0"/>
+                <w:sz w:val="16"/>
+              </w:rPr>
+              <w:t>enhanced</w:t>
+            </w:r>
+          </w:p>
+        </w:tc>
+        <w:tc>
+          <w:tcPr>
+            <w:tcW w:type="dxa" w:w="1215"/>
+          </w:tcPr>
+          <w:p>
+            <w:pPr>
+              <w:jc w:val="center"/>
+            </w:pPr>
+            <w:r/>
+            <w:r>
+              <w:rPr>
+                <w:rFonts w:ascii="Times New Roman" w:hAnsi="Times New Roman" w:eastAsia="Times New Roman"/>
+                <w:b w:val="0"/>
+                <w:sz w:val="16"/>
+              </w:rPr>
+              <w:t>0,592</w:t>
+            </w:r>
+          </w:p>
+        </w:tc>
+        <w:tc>
+          <w:tcPr>
+            <w:tcW w:type="dxa" w:w="1215"/>
+          </w:tcPr>
+          <w:p>
+            <w:pPr>
+              <w:jc w:val="center"/>
+            </w:pPr>
+            <w:r/>
+            <w:r>
+              <w:rPr>
+                <w:rFonts w:ascii="Times New Roman" w:hAnsi="Times New Roman" w:eastAsia="Times New Roman"/>
+                <w:b w:val="0"/>
+                <w:sz w:val="16"/>
+              </w:rPr>
+              <w:t>0,294</w:t>
+            </w:r>
+          </w:p>
+        </w:tc>
+        <w:tc>
+          <w:tcPr>
+            <w:tcW w:type="dxa" w:w="1215"/>
+          </w:tcPr>
+          <w:p>
+            <w:pPr>
+              <w:jc w:val="center"/>
+            </w:pPr>
+            <w:r/>
+            <w:r>
+              <w:rPr>
+                <w:rFonts w:ascii="Times New Roman" w:hAnsi="Times New Roman" w:eastAsia="Times New Roman"/>
+                <w:b w:val="0"/>
+                <w:sz w:val="16"/>
+              </w:rPr>
+              <w:t>0,894</w:t>
+            </w:r>
+          </w:p>
+        </w:tc>
+        <w:tc>
+          <w:tcPr>
+            <w:tcW w:type="dxa" w:w="1215"/>
+          </w:tcPr>
+          <w:p>
+            <w:pPr>
+              <w:jc w:val="center"/>
+            </w:pPr>
+            <w:r/>
+            <w:r>
+              <w:rPr>
+                <w:rFonts w:ascii="Times New Roman" w:hAnsi="Times New Roman" w:eastAsia="Times New Roman"/>
+                <w:b w:val="0"/>
+                <w:sz w:val="16"/>
+              </w:rPr>
+              <w:t>0,712</w:t>
+            </w:r>
+          </w:p>
+        </w:tc>
+        <w:tc>
+          <w:tcPr>
+            <w:tcW w:type="dxa" w:w="1215"/>
+          </w:tcPr>
+          <w:p>
+            <w:pPr>
+              <w:jc w:val="center"/>
+            </w:pPr>
+            <w:r/>
+            <w:r>
+              <w:rPr>
+                <w:rFonts w:ascii="Times New Roman" w:hAnsi="Times New Roman" w:eastAsia="Times New Roman"/>
+                <w:b w:val="0"/>
+                <w:sz w:val="16"/>
+              </w:rPr>
+              <w:t>27,6</w:t>
+            </w:r>
+          </w:p>
+        </w:tc>
+      </w:tr>
+      <w:tr>
+        <w:tc>
+          <w:tcPr>
+            <w:tcW w:type="dxa" w:w="1215"/>
+          </w:tcPr>
+          <w:p>
+            <w:pPr>
+              <w:jc w:val="center"/>
+            </w:pPr>
+            <w:r/>
+            <w:r>
+              <w:rPr>
+                <w:rFonts w:ascii="Times New Roman" w:hAnsi="Times New Roman" w:eastAsia="Times New Roman"/>
+                <w:b w:val="0"/>
+                <w:sz w:val="16"/>
+              </w:rPr>
+              <w:t>Plateia</w:t>
+            </w:r>
+          </w:p>
+        </w:tc>
+        <w:tc>
+          <w:tcPr>
+            <w:tcW w:type="dxa" w:w="1215"/>
+          </w:tcPr>
+          <w:p>
+            <w:pPr>
+              <w:jc w:val="center"/>
+            </w:pPr>
+            <w:r/>
+            <w:r>
+              <w:rPr>
+                <w:rFonts w:ascii="Times New Roman" w:hAnsi="Times New Roman" w:eastAsia="Times New Roman"/>
+                <w:b w:val="0"/>
+                <w:sz w:val="16"/>
+              </w:rPr>
+              <w:t>mediapipe</w:t>
+            </w:r>
+          </w:p>
+        </w:tc>
+        <w:tc>
+          <w:tcPr>
+            <w:tcW w:type="dxa" w:w="1215"/>
+          </w:tcPr>
+          <w:p>
+            <w:pPr>
+              <w:jc w:val="center"/>
+            </w:pPr>
+            <w:r/>
+            <w:r>
+              <w:rPr>
+                <w:rFonts w:ascii="Times New Roman" w:hAnsi="Times New Roman" w:eastAsia="Times New Roman"/>
+                <w:b w:val="0"/>
+                <w:sz w:val="16"/>
+              </w:rPr>
+              <w:t>0,011</w:t>
+            </w:r>
+          </w:p>
+        </w:tc>
+        <w:tc>
+          <w:tcPr>
+            <w:tcW w:type="dxa" w:w="1215"/>
+          </w:tcPr>
+          <w:p>
+            <w:pPr>
+              <w:jc w:val="center"/>
+            </w:pPr>
+            <w:r/>
+            <w:r>
+              <w:rPr>
+                <w:rFonts w:ascii="Times New Roman" w:hAnsi="Times New Roman" w:eastAsia="Times New Roman"/>
+                <w:b w:val="0"/>
+                <w:sz w:val="16"/>
+              </w:rPr>
+              <w:t>0,011</w:t>
+            </w:r>
+          </w:p>
+        </w:tc>
+        <w:tc>
+          <w:tcPr>
+            <w:tcW w:type="dxa" w:w="1215"/>
+          </w:tcPr>
+          <w:p>
+            <w:pPr>
+              <w:jc w:val="center"/>
+            </w:pPr>
+            <w:r/>
+            <w:r>
+              <w:rPr>
+                <w:rFonts w:ascii="Times New Roman" w:hAnsi="Times New Roman" w:eastAsia="Times New Roman"/>
+                <w:b w:val="0"/>
+                <w:sz w:val="16"/>
+              </w:rPr>
+              <w:t>1,000</w:t>
+            </w:r>
+          </w:p>
+        </w:tc>
+        <w:tc>
+          <w:tcPr>
+            <w:tcW w:type="dxa" w:w="1215"/>
+          </w:tcPr>
+          <w:p>
+            <w:pPr>
+              <w:jc w:val="center"/>
+            </w:pPr>
+            <w:r/>
+            <w:r>
+              <w:rPr>
+                <w:rFonts w:ascii="Times New Roman" w:hAnsi="Times New Roman" w:eastAsia="Times New Roman"/>
+                <w:b w:val="0"/>
+                <w:sz w:val="16"/>
+              </w:rPr>
+              <w:t>0,022</w:t>
+            </w:r>
+          </w:p>
+        </w:tc>
+        <w:tc>
+          <w:tcPr>
+            <w:tcW w:type="dxa" w:w="1215"/>
+          </w:tcPr>
+          <w:p>
+            <w:pPr>
+              <w:jc w:val="center"/>
+            </w:pPr>
+            <w:r/>
+            <w:r>
+              <w:rPr>
+                <w:rFonts w:ascii="Times New Roman" w:hAnsi="Times New Roman" w:eastAsia="Times New Roman"/>
+                <w:b w:val="0"/>
+                <w:sz w:val="16"/>
+              </w:rPr>
+              <w:t>491,6</w:t>
+            </w:r>
+          </w:p>
+        </w:tc>
+      </w:tr>
+      <w:tr>
+        <w:tc>
+          <w:tcPr>
+            <w:tcW w:type="dxa" w:w="1215"/>
+          </w:tcPr>
+          <w:p>
+            <w:pPr>
+              <w:jc w:val="center"/>
+            </w:pPr>
+            <w:r/>
+            <w:r>
+              <w:rPr>
+                <w:rFonts w:ascii="Times New Roman" w:hAnsi="Times New Roman" w:eastAsia="Times New Roman"/>
+                <w:b w:val="0"/>
+                <w:sz w:val="16"/>
+              </w:rPr>
+              <w:t>Plateia</w:t>
+            </w:r>
+          </w:p>
+        </w:tc>
+        <w:tc>
+          <w:tcPr>
+            <w:tcW w:type="dxa" w:w="1215"/>
+          </w:tcPr>
+          <w:p>
+            <w:pPr>
+              <w:jc w:val="center"/>
+            </w:pPr>
+            <w:r/>
+            <w:r>
+              <w:rPr>
+                <w:rFonts w:ascii="Times New Roman" w:hAnsi="Times New Roman" w:eastAsia="Times New Roman"/>
+                <w:b w:val="0"/>
+                <w:sz w:val="16"/>
+              </w:rPr>
+              <w:t>enhanced</w:t>
+            </w:r>
+          </w:p>
+        </w:tc>
+        <w:tc>
+          <w:tcPr>
+            <w:tcW w:type="dxa" w:w="1215"/>
+          </w:tcPr>
+          <w:p>
+            <w:pPr>
+              <w:jc w:val="center"/>
+            </w:pPr>
+            <w:r/>
+            <w:r>
+              <w:rPr>
+                <w:rFonts w:ascii="Times New Roman" w:hAnsi="Times New Roman" w:eastAsia="Times New Roman"/>
+                <w:b w:val="0"/>
+                <w:sz w:val="16"/>
+              </w:rPr>
+              <w:t>0,443</w:t>
+            </w:r>
+          </w:p>
+        </w:tc>
+        <w:tc>
+          <w:tcPr>
+            <w:tcW w:type="dxa" w:w="1215"/>
+          </w:tcPr>
+          <w:p>
+            <w:pPr>
+              <w:jc w:val="center"/>
+            </w:pPr>
+            <w:r/>
+            <w:r>
+              <w:rPr>
+                <w:rFonts w:ascii="Times New Roman" w:hAnsi="Times New Roman" w:eastAsia="Times New Roman"/>
+                <w:b w:val="0"/>
+                <w:sz w:val="16"/>
+              </w:rPr>
+              <w:t>0,089</w:t>
+            </w:r>
+          </w:p>
+        </w:tc>
+        <w:tc>
+          <w:tcPr>
+            <w:tcW w:type="dxa" w:w="1215"/>
+          </w:tcPr>
+          <w:p>
+            <w:pPr>
+              <w:jc w:val="center"/>
+            </w:pPr>
+            <w:r/>
+            <w:r>
+              <w:rPr>
+                <w:rFonts w:ascii="Times New Roman" w:hAnsi="Times New Roman" w:eastAsia="Times New Roman"/>
+                <w:b w:val="0"/>
+                <w:sz w:val="16"/>
+              </w:rPr>
+              <w:t>0,851</w:t>
+            </w:r>
+          </w:p>
+        </w:tc>
+        <w:tc>
+          <w:tcPr>
+            <w:tcW w:type="dxa" w:w="1215"/>
+          </w:tcPr>
+          <w:p>
+            <w:pPr>
+              <w:jc w:val="center"/>
+            </w:pPr>
+            <w:r/>
+            <w:r>
+              <w:rPr>
+                <w:rFonts w:ascii="Times New Roman" w:hAnsi="Times New Roman" w:eastAsia="Times New Roman"/>
+                <w:b w:val="0"/>
+                <w:sz w:val="16"/>
+              </w:rPr>
+              <w:t>0,583</w:t>
+            </w:r>
+          </w:p>
+        </w:tc>
+        <w:tc>
+          <w:tcPr>
+            <w:tcW w:type="dxa" w:w="1215"/>
+          </w:tcPr>
+          <w:p>
+            <w:pPr>
+              <w:jc w:val="center"/>
+            </w:pPr>
+            <w:r/>
+            <w:r>
+              <w:rPr>
+                <w:rFonts w:ascii="Times New Roman" w:hAnsi="Times New Roman" w:eastAsia="Times New Roman"/>
+                <w:b w:val="0"/>
+                <w:sz w:val="16"/>
+              </w:rPr>
+              <w:t>74,5</w:t>
+            </w:r>
+          </w:p>
+        </w:tc>
+      </w:tr>
+    </w:tbl>
+    <w:p>
+      <w:pPr>
+        <w:spacing w:after="80"/>
+      </w:pPr>
+    </w:p>
+    <w:p>
+      <w:pPr>
+        <w:spacing w:after="120"/>
+        <w:ind w:firstLine="720"/>
+        <w:jc w:val="both"/>
+      </w:pPr>
+      <w:r>
+        <w:rPr>
+          <w:rFonts w:ascii="Times New Roman" w:hAnsi="Times New Roman" w:eastAsia="Times New Roman"/>
+          <w:b w:val="0"/>
+          <w:i w:val="0"/>
+          <w:sz w:val="24"/>
+        </w:rPr>
+        <w:t>A Tabela 2 mostra a auditoria específica do modo individual. Nos três vídeos frontais completos, o sistema processou 15.193 frames. Os frames sem face dos vídeos NASA correspondem principalmente a cartelas e b-roll de abertura, não a perda sistemática de rosto frontal. Quando havia pessoa frontal no quadro, os deltas medianos foram pequenos: 4,0 graus em yaw e 1,8 grau em pitch.</w:t>
+      </w:r>
+    </w:p>
+    <w:p>
+      <w:pPr>
+        <w:spacing w:after="140"/>
+        <w:jc w:val="center"/>
+      </w:pPr>
+      <w:r>
+        <w:rPr>
+          <w:rFonts w:ascii="Times New Roman" w:hAnsi="Times New Roman" w:eastAsia="Times New Roman"/>
+          <w:b/>
+          <w:i w:val="0"/>
+          <w:sz w:val="20"/>
+        </w:rPr>
+        <w:t>Tabela 2. Auditoria do modo individual em vídeos frontais completos.</w:t>
+      </w:r>
+    </w:p>
+    <w:tbl>
+      <w:tblPr>
+        <w:tblStyle w:val="TableGrid"/>
+        <w:tblW w:type="auto" w:w="0"/>
+        <w:jc w:val="center"/>
+        <w:tblLook w:firstColumn="1" w:firstRow="1" w:lastColumn="0" w:lastRow="0" w:noHBand="0" w:noVBand="1" w:val="04A0"/>
+      </w:tblPr>
+      <w:tblGrid>
+        <w:gridCol w:w="4252"/>
+        <w:gridCol w:w="4252"/>
+      </w:tblGrid>
+      <w:tr>
+        <w:tc>
+          <w:tcPr>
+            <w:tcW w:type="dxa" w:w="4252"/>
+          </w:tcPr>
+          <w:p>
+            <w:pPr>
+              <w:jc w:val="center"/>
+            </w:pPr>
+            <w:r/>
+            <w:r>
+              <w:rPr>
+                <w:rFonts w:ascii="Times New Roman" w:hAnsi="Times New Roman" w:eastAsia="Times New Roman"/>
+                <w:b/>
+                <w:sz w:val="16"/>
+              </w:rPr>
+              <w:t>Métrica</w:t>
+            </w:r>
+          </w:p>
+        </w:tc>
+        <w:tc>
+          <w:tcPr>
+            <w:tcW w:type="dxa" w:w="4252"/>
+          </w:tcPr>
+          <w:p>
+            <w:pPr>
+              <w:jc w:val="center"/>
+            </w:pPr>
+            <w:r/>
+            <w:r>
+              <w:rPr>
+                <w:rFonts w:ascii="Times New Roman" w:hAnsi="Times New Roman" w:eastAsia="Times New Roman"/>
+                <w:b/>
+                <w:sz w:val="16"/>
+              </w:rPr>
+              <w:t>Valor</w:t>
+            </w:r>
+          </w:p>
+        </w:tc>
+      </w:tr>
+      <w:tr>
+        <w:tc>
+          <w:tcPr>
+            <w:tcW w:type="dxa" w:w="4252"/>
+          </w:tcPr>
+          <w:p>
+            <w:pPr>
+              <w:jc w:val="center"/>
+            </w:pPr>
+            <w:r/>
+            <w:r>
+              <w:rPr>
+                <w:rFonts w:ascii="Times New Roman" w:hAnsi="Times New Roman" w:eastAsia="Times New Roman"/>
+                <w:b w:val="0"/>
+                <w:sz w:val="16"/>
+              </w:rPr>
+              <w:t>Vídeos processados</w:t>
+            </w:r>
+          </w:p>
+        </w:tc>
+        <w:tc>
+          <w:tcPr>
+            <w:tcW w:type="dxa" w:w="4252"/>
+          </w:tcPr>
+          <w:p>
+            <w:pPr>
+              <w:jc w:val="center"/>
+            </w:pPr>
+            <w:r/>
+            <w:r>
+              <w:rPr>
+                <w:rFonts w:ascii="Times New Roman" w:hAnsi="Times New Roman" w:eastAsia="Times New Roman"/>
+                <w:b w:val="0"/>
+                <w:sz w:val="16"/>
+              </w:rPr>
+              <w:t>3</w:t>
+            </w:r>
+          </w:p>
+        </w:tc>
+      </w:tr>
+      <w:tr>
+        <w:tc>
+          <w:tcPr>
+            <w:tcW w:type="dxa" w:w="4252"/>
+          </w:tcPr>
+          <w:p>
+            <w:pPr>
+              <w:jc w:val="center"/>
+            </w:pPr>
+            <w:r/>
+            <w:r>
+              <w:rPr>
+                <w:rFonts w:ascii="Times New Roman" w:hAnsi="Times New Roman" w:eastAsia="Times New Roman"/>
+                <w:b w:val="0"/>
+                <w:sz w:val="16"/>
+              </w:rPr>
+              <w:t>Frames totais</w:t>
+            </w:r>
+          </w:p>
+        </w:tc>
+        <w:tc>
+          <w:tcPr>
+            <w:tcW w:type="dxa" w:w="4252"/>
+          </w:tcPr>
+          <w:p>
+            <w:pPr>
+              <w:jc w:val="center"/>
+            </w:pPr>
+            <w:r/>
+            <w:r>
+              <w:rPr>
+                <w:rFonts w:ascii="Times New Roman" w:hAnsi="Times New Roman" w:eastAsia="Times New Roman"/>
+                <w:b w:val="0"/>
+                <w:sz w:val="16"/>
+              </w:rPr>
+              <w:t>15.193</w:t>
+            </w:r>
+          </w:p>
+        </w:tc>
+      </w:tr>
+      <w:tr>
+        <w:tc>
+          <w:tcPr>
+            <w:tcW w:type="dxa" w:w="4252"/>
+          </w:tcPr>
+          <w:p>
+            <w:pPr>
+              <w:jc w:val="center"/>
+            </w:pPr>
+            <w:r/>
+            <w:r>
+              <w:rPr>
+                <w:rFonts w:ascii="Times New Roman" w:hAnsi="Times New Roman" w:eastAsia="Times New Roman"/>
+                <w:b w:val="0"/>
+                <w:sz w:val="16"/>
+              </w:rPr>
+              <w:t>Frames com face/métricas válidas</w:t>
+            </w:r>
+          </w:p>
+        </w:tc>
+        <w:tc>
+          <w:tcPr>
+            <w:tcW w:type="dxa" w:w="4252"/>
+          </w:tcPr>
+          <w:p>
+            <w:pPr>
+              <w:jc w:val="center"/>
+            </w:pPr>
+            <w:r/>
+            <w:r>
+              <w:rPr>
+                <w:rFonts w:ascii="Times New Roman" w:hAnsi="Times New Roman" w:eastAsia="Times New Roman"/>
+                <w:b w:val="0"/>
+                <w:sz w:val="16"/>
+              </w:rPr>
+              <w:t>86,6%</w:t>
+            </w:r>
+          </w:p>
+        </w:tc>
+      </w:tr>
+      <w:tr>
+        <w:tc>
+          <w:tcPr>
+            <w:tcW w:type="dxa" w:w="4252"/>
+          </w:tcPr>
+          <w:p>
+            <w:pPr>
+              <w:jc w:val="center"/>
+            </w:pPr>
+            <w:r/>
+            <w:r>
+              <w:rPr>
+                <w:rFonts w:ascii="Times New Roman" w:hAnsi="Times New Roman" w:eastAsia="Times New Roman"/>
+                <w:b w:val="0"/>
+                <w:sz w:val="16"/>
+              </w:rPr>
+              <w:t>Frames frontais</w:t>
+            </w:r>
+          </w:p>
+        </w:tc>
+        <w:tc>
+          <w:tcPr>
+            <w:tcW w:type="dxa" w:w="4252"/>
+          </w:tcPr>
+          <w:p>
+            <w:pPr>
+              <w:jc w:val="center"/>
+            </w:pPr>
+            <w:r/>
+            <w:r>
+              <w:rPr>
+                <w:rFonts w:ascii="Times New Roman" w:hAnsi="Times New Roman" w:eastAsia="Times New Roman"/>
+                <w:b w:val="0"/>
+                <w:sz w:val="16"/>
+              </w:rPr>
+              <w:t>82,5%</w:t>
+            </w:r>
+          </w:p>
+        </w:tc>
+      </w:tr>
+      <w:tr>
+        <w:tc>
+          <w:tcPr>
+            <w:tcW w:type="dxa" w:w="4252"/>
+          </w:tcPr>
+          <w:p>
+            <w:pPr>
+              <w:jc w:val="center"/>
+            </w:pPr>
+            <w:r/>
+            <w:r>
+              <w:rPr>
+                <w:rFonts w:ascii="Times New Roman" w:hAnsi="Times New Roman" w:eastAsia="Times New Roman"/>
+                <w:b w:val="0"/>
+                <w:sz w:val="16"/>
+              </w:rPr>
+              <w:t>Frames neutros em pose</w:t>
+            </w:r>
+          </w:p>
+        </w:tc>
+        <w:tc>
+          <w:tcPr>
+            <w:tcW w:type="dxa" w:w="4252"/>
+          </w:tcPr>
+          <w:p>
+            <w:pPr>
+              <w:jc w:val="center"/>
+            </w:pPr>
+            <w:r/>
+            <w:r>
+              <w:rPr>
+                <w:rFonts w:ascii="Times New Roman" w:hAnsi="Times New Roman" w:eastAsia="Times New Roman"/>
+                <w:b w:val="0"/>
+                <w:sz w:val="16"/>
+              </w:rPr>
+              <w:t>76,7%</w:t>
+            </w:r>
+          </w:p>
+        </w:tc>
+      </w:tr>
+      <w:tr>
+        <w:tc>
+          <w:tcPr>
+            <w:tcW w:type="dxa" w:w="4252"/>
+          </w:tcPr>
+          <w:p>
+            <w:pPr>
+              <w:jc w:val="center"/>
+            </w:pPr>
+            <w:r/>
+            <w:r>
+              <w:rPr>
+                <w:rFonts w:ascii="Times New Roman" w:hAnsi="Times New Roman" w:eastAsia="Times New Roman"/>
+                <w:b w:val="0"/>
+                <w:sz w:val="16"/>
+              </w:rPr>
+              <w:t>Frames aprovados</w:t>
+            </w:r>
+          </w:p>
+        </w:tc>
+        <w:tc>
+          <w:tcPr>
+            <w:tcW w:type="dxa" w:w="4252"/>
+          </w:tcPr>
+          <w:p>
+            <w:pPr>
+              <w:jc w:val="center"/>
+            </w:pPr>
+            <w:r/>
+            <w:r>
+              <w:rPr>
+                <w:rFonts w:ascii="Times New Roman" w:hAnsi="Times New Roman" w:eastAsia="Times New Roman"/>
+                <w:b w:val="0"/>
+                <w:sz w:val="16"/>
+              </w:rPr>
+              <w:t>73,0%</w:t>
+            </w:r>
+          </w:p>
+        </w:tc>
+      </w:tr>
+      <w:tr>
+        <w:tc>
+          <w:tcPr>
+            <w:tcW w:type="dxa" w:w="4252"/>
+          </w:tcPr>
+          <w:p>
+            <w:pPr>
+              <w:jc w:val="center"/>
+            </w:pPr>
+            <w:r/>
+            <w:r>
+              <w:rPr>
+                <w:rFonts w:ascii="Times New Roman" w:hAnsi="Times New Roman" w:eastAsia="Times New Roman"/>
+                <w:b w:val="0"/>
+                <w:sz w:val="16"/>
+              </w:rPr>
+              <w:t>Yaw delta mediano</w:t>
+            </w:r>
+          </w:p>
+        </w:tc>
+        <w:tc>
+          <w:tcPr>
+            <w:tcW w:type="dxa" w:w="4252"/>
+          </w:tcPr>
+          <w:p>
+            <w:pPr>
+              <w:jc w:val="center"/>
+            </w:pPr>
+            <w:r/>
+            <w:r>
+              <w:rPr>
+                <w:rFonts w:ascii="Times New Roman" w:hAnsi="Times New Roman" w:eastAsia="Times New Roman"/>
+                <w:b w:val="0"/>
+                <w:sz w:val="16"/>
+              </w:rPr>
+              <w:t>4,0 graus</w:t>
+            </w:r>
+          </w:p>
+        </w:tc>
+      </w:tr>
+      <w:tr>
+        <w:tc>
+          <w:tcPr>
+            <w:tcW w:type="dxa" w:w="4252"/>
+          </w:tcPr>
+          <w:p>
+            <w:pPr>
+              <w:jc w:val="center"/>
+            </w:pPr>
+            <w:r/>
+            <w:r>
+              <w:rPr>
+                <w:rFonts w:ascii="Times New Roman" w:hAnsi="Times New Roman" w:eastAsia="Times New Roman"/>
+                <w:b w:val="0"/>
+                <w:sz w:val="16"/>
+              </w:rPr>
+              <w:t>Pitch delta mediano</w:t>
+            </w:r>
+          </w:p>
+        </w:tc>
+        <w:tc>
+          <w:tcPr>
+            <w:tcW w:type="dxa" w:w="4252"/>
+          </w:tcPr>
+          <w:p>
+            <w:pPr>
+              <w:jc w:val="center"/>
+            </w:pPr>
+            <w:r/>
+            <w:r>
+              <w:rPr>
+                <w:rFonts w:ascii="Times New Roman" w:hAnsi="Times New Roman" w:eastAsia="Times New Roman"/>
+                <w:b w:val="0"/>
+                <w:sz w:val="16"/>
+              </w:rPr>
+              <w:t>1,8 grau</w:t>
+            </w:r>
+          </w:p>
+        </w:tc>
+      </w:tr>
+    </w:tbl>
+    <w:p>
+      <w:pPr>
+        <w:spacing w:after="80"/>
+      </w:pPr>
+    </w:p>
+    <w:p>
+      <w:pPr>
+        <w:spacing w:after="120"/>
+        <w:ind w:firstLine="720"/>
+        <w:jc w:val="both"/>
+      </w:pPr>
+      <w:r>
+        <w:rPr>
+          <w:rFonts w:ascii="Times New Roman" w:hAnsi="Times New Roman" w:eastAsia="Times New Roman"/>
+          <w:b w:val="0"/>
+          <w:i w:val="0"/>
+          <w:sz w:val="24"/>
+        </w:rPr>
+        <w:t>A Tabela 3 resume a auditoria HQ de plateia com a configuração enhanced, confiança 0,60 e limite de 24 faces. Essa avaliação é mais pesada que o benchmark smoke porque usa vídeos 1080p completos e compara a saída temporal do app com contagens manuais.</w:t>
+      </w:r>
+    </w:p>
+    <w:p>
+      <w:pPr>
+        <w:spacing w:after="140"/>
+        <w:jc w:val="center"/>
+      </w:pPr>
+      <w:r>
+        <w:rPr>
+          <w:rFonts w:ascii="Times New Roman" w:hAnsi="Times New Roman" w:eastAsia="Times New Roman"/>
+          <w:b/>
+          <w:i w:val="0"/>
+          <w:sz w:val="20"/>
+        </w:rPr>
+        <w:t>Tabela 3. Auditoria HQ de plateia com enhanced, confiança 0,60 e 24 faces.</w:t>
+      </w:r>
+    </w:p>
+    <w:tbl>
+      <w:tblPr>
+        <w:tblStyle w:val="TableGrid"/>
+        <w:tblW w:type="auto" w:w="0"/>
+        <w:jc w:val="center"/>
+        <w:tblLook w:firstColumn="1" w:firstRow="1" w:lastColumn="0" w:lastRow="0" w:noHBand="0" w:noVBand="1" w:val="04A0"/>
+      </w:tblPr>
+      <w:tblGrid>
+        <w:gridCol w:w="1215"/>
+        <w:gridCol w:w="1215"/>
+        <w:gridCol w:w="1215"/>
+        <w:gridCol w:w="1215"/>
+        <w:gridCol w:w="1215"/>
+        <w:gridCol w:w="1215"/>
+        <w:gridCol w:w="1215"/>
+      </w:tblGrid>
+      <w:tr>
+        <w:tc>
+          <w:tcPr>
+            <w:tcW w:type="dxa" w:w="1215"/>
+          </w:tcPr>
+          <w:p>
+            <w:pPr>
+              <w:jc w:val="center"/>
+            </w:pPr>
+            <w:r/>
+            <w:r>
+              <w:rPr>
+                <w:rFonts w:ascii="Times New Roman" w:hAnsi="Times New Roman" w:eastAsia="Times New Roman"/>
+                <w:b/>
+                <w:sz w:val="16"/>
+              </w:rPr>
+              <w:t>Configuração</w:t>
+            </w:r>
+          </w:p>
+        </w:tc>
+        <w:tc>
+          <w:tcPr>
+            <w:tcW w:type="dxa" w:w="1215"/>
+          </w:tcPr>
+          <w:p>
+            <w:pPr>
+              <w:jc w:val="center"/>
+            </w:pPr>
+            <w:r/>
+            <w:r>
+              <w:rPr>
+                <w:rFonts w:ascii="Times New Roman" w:hAnsi="Times New Roman" w:eastAsia="Times New Roman"/>
+                <w:b/>
+                <w:sz w:val="16"/>
+              </w:rPr>
+              <w:t>Exatos</w:t>
+            </w:r>
+          </w:p>
+        </w:tc>
+        <w:tc>
+          <w:tcPr>
+            <w:tcW w:type="dxa" w:w="1215"/>
+          </w:tcPr>
+          <w:p>
+            <w:pPr>
+              <w:jc w:val="center"/>
+            </w:pPr>
+            <w:r/>
+            <w:r>
+              <w:rPr>
+                <w:rFonts w:ascii="Times New Roman" w:hAnsi="Times New Roman" w:eastAsia="Times New Roman"/>
+                <w:b/>
+                <w:sz w:val="16"/>
+              </w:rPr>
+              <w:t>Erro &lt;=1</w:t>
+            </w:r>
+          </w:p>
+        </w:tc>
+        <w:tc>
+          <w:tcPr>
+            <w:tcW w:type="dxa" w:w="1215"/>
+          </w:tcPr>
+          <w:p>
+            <w:pPr>
+              <w:jc w:val="center"/>
+            </w:pPr>
+            <w:r/>
+            <w:r>
+              <w:rPr>
+                <w:rFonts w:ascii="Times New Roman" w:hAnsi="Times New Roman" w:eastAsia="Times New Roman"/>
+                <w:b/>
+                <w:sz w:val="16"/>
+              </w:rPr>
+              <w:t>Erro médio</w:t>
+            </w:r>
+          </w:p>
+        </w:tc>
+        <w:tc>
+          <w:tcPr>
+            <w:tcW w:type="dxa" w:w="1215"/>
+          </w:tcPr>
+          <w:p>
+            <w:pPr>
+              <w:jc w:val="center"/>
+            </w:pPr>
+            <w:r/>
+            <w:r>
+              <w:rPr>
+                <w:rFonts w:ascii="Times New Roman" w:hAnsi="Times New Roman" w:eastAsia="Times New Roman"/>
+                <w:b/>
+                <w:sz w:val="16"/>
+              </w:rPr>
+              <w:t>Manual em +/-1s</w:t>
+            </w:r>
+          </w:p>
+        </w:tc>
+        <w:tc>
+          <w:tcPr>
+            <w:tcW w:type="dxa" w:w="1215"/>
+          </w:tcPr>
+          <w:p>
+            <w:pPr>
+              <w:jc w:val="center"/>
+            </w:pPr>
+            <w:r/>
             <w:r>
               <w:rPr>
                 <w:rFonts w:ascii="Times New Roman" w:hAnsi="Times New Roman" w:eastAsia="Times New Roman"/>
@@ -640,21 +1798,20 @@
         </w:tc>
         <w:tc>
           <w:tcPr>
-            <w:tcW w:type="dxa" w:w="1063"/>
-            <w:vAlign w:val="center"/>
+            <w:tcW w:type="dxa" w:w="1215"/>
           </w:tcPr>
           <w:p>
             <w:pPr>
-              <w:spacing w:before="0" w:after="0"/>
               <w:jc w:val="center"/>
             </w:pPr>
+            <w:r/>
             <w:r>
               <w:rPr>
                 <w:rFonts w:ascii="Times New Roman" w:hAnsi="Times New Roman" w:eastAsia="Times New Roman"/>
                 <w:b/>
                 <w:sz w:val="16"/>
               </w:rPr>
-              <w:t>FPS mín.</w:t>
+              <w:t>FPS p10</w:t>
             </w:r>
           </w:p>
         </w:tc>
@@ -662,995 +1819,132 @@
       <w:tr>
         <w:tc>
           <w:tcPr>
-            <w:tcW w:type="dxa" w:w="1063"/>
-            <w:vAlign w:val="center"/>
+            <w:tcW w:type="dxa" w:w="1215"/>
           </w:tcPr>
           <w:p>
             <w:pPr>
-              <w:spacing w:before="0" w:after="0"/>
               <w:jc w:val="center"/>
             </w:pPr>
+            <w:r/>
             <w:r>
               <w:rPr>
                 <w:rFonts w:ascii="Times New Roman" w:hAnsi="Times New Roman" w:eastAsia="Times New Roman"/>
                 <w:b w:val="0"/>
                 <w:sz w:val="16"/>
               </w:rPr>
-              <w:t>Individual</w:t>
+              <w:t>enhanced c0,60 m24</w:t>
             </w:r>
           </w:p>
         </w:tc>
         <w:tc>
           <w:tcPr>
-            <w:tcW w:type="dxa" w:w="1063"/>
-            <w:vAlign w:val="center"/>
+            <w:tcW w:type="dxa" w:w="1215"/>
           </w:tcPr>
           <w:p>
             <w:pPr>
-              <w:spacing w:before="0" w:after="0"/>
               <w:jc w:val="center"/>
             </w:pPr>
+            <w:r/>
             <w:r>
               <w:rPr>
                 <w:rFonts w:ascii="Times New Roman" w:hAnsi="Times New Roman" w:eastAsia="Times New Roman"/>
                 <w:b w:val="0"/>
                 <w:sz w:val="16"/>
               </w:rPr>
-              <w:t>mediapipe</w:t>
+              <w:t>5/11</w:t>
             </w:r>
           </w:p>
         </w:tc>
         <w:tc>
           <w:tcPr>
-            <w:tcW w:type="dxa" w:w="1063"/>
-            <w:vAlign w:val="center"/>
+            <w:tcW w:type="dxa" w:w="1215"/>
           </w:tcPr>
           <w:p>
             <w:pPr>
-              <w:spacing w:before="0" w:after="0"/>
               <w:jc w:val="center"/>
             </w:pPr>
+            <w:r/>
             <w:r>
               <w:rPr>
                 <w:rFonts w:ascii="Times New Roman" w:hAnsi="Times New Roman" w:eastAsia="Times New Roman"/>
                 <w:b w:val="0"/>
                 <w:sz w:val="16"/>
               </w:rPr>
-              <w:t>0,193</w:t>
+              <w:t>10/11</w:t>
             </w:r>
           </w:p>
         </w:tc>
         <w:tc>
           <w:tcPr>
-            <w:tcW w:type="dxa" w:w="1063"/>
-            <w:vAlign w:val="center"/>
+            <w:tcW w:type="dxa" w:w="1215"/>
           </w:tcPr>
           <w:p>
             <w:pPr>
-              <w:spacing w:before="0" w:after="0"/>
               <w:jc w:val="center"/>
             </w:pPr>
+            <w:r/>
             <w:r>
               <w:rPr>
                 <w:rFonts w:ascii="Times New Roman" w:hAnsi="Times New Roman" w:eastAsia="Times New Roman"/>
                 <w:b w:val="0"/>
                 <w:sz w:val="16"/>
               </w:rPr>
-              <w:t>0,193</w:t>
+              <w:t>0,636</w:t>
             </w:r>
           </w:p>
         </w:tc>
         <w:tc>
           <w:tcPr>
-            <w:tcW w:type="dxa" w:w="1063"/>
-            <w:vAlign w:val="center"/>
+            <w:tcW w:type="dxa" w:w="1215"/>
           </w:tcPr>
           <w:p>
             <w:pPr>
-              <w:spacing w:before="0" w:after="0"/>
               <w:jc w:val="center"/>
             </w:pPr>
+            <w:r/>
             <w:r>
               <w:rPr>
                 <w:rFonts w:ascii="Times New Roman" w:hAnsi="Times New Roman" w:eastAsia="Times New Roman"/>
                 <w:b w:val="0"/>
                 <w:sz w:val="16"/>
               </w:rPr>
-              <w:t>1,000</w:t>
+              <w:t>10/11</w:t>
             </w:r>
           </w:p>
         </w:tc>
         <w:tc>
           <w:tcPr>
-            <w:tcW w:type="dxa" w:w="1063"/>
-            <w:vAlign w:val="center"/>
+            <w:tcW w:type="dxa" w:w="1215"/>
           </w:tcPr>
           <w:p>
             <w:pPr>
-              <w:spacing w:before="0" w:after="0"/>
               <w:jc w:val="center"/>
             </w:pPr>
+            <w:r/>
             <w:r>
               <w:rPr>
                 <w:rFonts w:ascii="Times New Roman" w:hAnsi="Times New Roman" w:eastAsia="Times New Roman"/>
                 <w:b w:val="0"/>
                 <w:sz w:val="16"/>
               </w:rPr>
-              <w:t>0,324</w:t>
+              <w:t>13,3</w:t>
             </w:r>
           </w:p>
         </w:tc>
         <w:tc>
           <w:tcPr>
-            <w:tcW w:type="dxa" w:w="1063"/>
-            <w:vAlign w:val="center"/>
+            <w:tcW w:type="dxa" w:w="1215"/>
           </w:tcPr>
           <w:p>
             <w:pPr>
-              <w:spacing w:before="0" w:after="0"/>
               <w:jc w:val="center"/>
             </w:pPr>
+            <w:r/>
             <w:r>
               <w:rPr>
                 <w:rFonts w:ascii="Times New Roman" w:hAnsi="Times New Roman" w:eastAsia="Times New Roman"/>
                 <w:b w:val="0"/>
                 <w:sz w:val="16"/>
-              </w:rPr>
-              <w:t>242,4</w:t>
-            </w:r>
-          </w:p>
-        </w:tc>
-        <w:tc>
-          <w:tcPr>
-            <w:tcW w:type="dxa" w:w="1063"/>
-            <w:vAlign w:val="center"/>
-          </w:tcPr>
-          <w:p>
-            <w:pPr>
-              <w:spacing w:before="0" w:after="0"/>
-              <w:jc w:val="center"/>
-            </w:pPr>
-            <w:r>
-              <w:rPr>
-                <w:rFonts w:ascii="Times New Roman" w:hAnsi="Times New Roman" w:eastAsia="Times New Roman"/>
-                <w:b w:val="0"/>
-                <w:sz w:val="16"/>
-              </w:rPr>
-              <w:t>91,7</w:t>
-            </w:r>
-          </w:p>
-        </w:tc>
-      </w:tr>
-      <w:tr>
-        <w:tc>
-          <w:tcPr>
-            <w:tcW w:type="dxa" w:w="1063"/>
-            <w:vAlign w:val="center"/>
-          </w:tcPr>
-          <w:p>
-            <w:pPr>
-              <w:spacing w:before="0" w:after="0"/>
-              <w:jc w:val="center"/>
-            </w:pPr>
-            <w:r>
-              <w:rPr>
-                <w:rFonts w:ascii="Times New Roman" w:hAnsi="Times New Roman" w:eastAsia="Times New Roman"/>
-                <w:b w:val="0"/>
-                <w:sz w:val="16"/>
-              </w:rPr>
-              <w:t>Individual</w:t>
-            </w:r>
-          </w:p>
-        </w:tc>
-        <w:tc>
-          <w:tcPr>
-            <w:tcW w:type="dxa" w:w="1063"/>
-            <w:vAlign w:val="center"/>
-          </w:tcPr>
-          <w:p>
-            <w:pPr>
-              <w:spacing w:before="0" w:after="0"/>
-              <w:jc w:val="center"/>
-            </w:pPr>
-            <w:r>
-              <w:rPr>
-                <w:rFonts w:ascii="Times New Roman" w:hAnsi="Times New Roman" w:eastAsia="Times New Roman"/>
-                <w:b w:val="0"/>
-                <w:sz w:val="16"/>
-              </w:rPr>
-              <w:t>enhanced</w:t>
-            </w:r>
-          </w:p>
-        </w:tc>
-        <w:tc>
-          <w:tcPr>
-            <w:tcW w:type="dxa" w:w="1063"/>
-            <w:vAlign w:val="center"/>
-          </w:tcPr>
-          <w:p>
-            <w:pPr>
-              <w:spacing w:before="0" w:after="0"/>
-              <w:jc w:val="center"/>
-            </w:pPr>
-            <w:r>
-              <w:rPr>
-                <w:rFonts w:ascii="Times New Roman" w:hAnsi="Times New Roman" w:eastAsia="Times New Roman"/>
-                <w:b w:val="0"/>
-                <w:sz w:val="16"/>
-              </w:rPr>
-              <w:t>0,592</w:t>
-            </w:r>
-          </w:p>
-        </w:tc>
-        <w:tc>
-          <w:tcPr>
-            <w:tcW w:type="dxa" w:w="1063"/>
-            <w:vAlign w:val="center"/>
-          </w:tcPr>
-          <w:p>
-            <w:pPr>
-              <w:spacing w:before="0" w:after="0"/>
-              <w:jc w:val="center"/>
-            </w:pPr>
-            <w:r>
-              <w:rPr>
-                <w:rFonts w:ascii="Times New Roman" w:hAnsi="Times New Roman" w:eastAsia="Times New Roman"/>
-                <w:b w:val="0"/>
-                <w:sz w:val="16"/>
-              </w:rPr>
-              <w:t>0,294</w:t>
-            </w:r>
-          </w:p>
-        </w:tc>
-        <w:tc>
-          <w:tcPr>
-            <w:tcW w:type="dxa" w:w="1063"/>
-            <w:vAlign w:val="center"/>
-          </w:tcPr>
-          <w:p>
-            <w:pPr>
-              <w:spacing w:before="0" w:after="0"/>
-              <w:jc w:val="center"/>
-            </w:pPr>
-            <w:r>
-              <w:rPr>
-                <w:rFonts w:ascii="Times New Roman" w:hAnsi="Times New Roman" w:eastAsia="Times New Roman"/>
-                <w:b w:val="0"/>
-                <w:sz w:val="16"/>
-              </w:rPr>
-              <w:t>0,894</w:t>
-            </w:r>
-          </w:p>
-        </w:tc>
-        <w:tc>
-          <w:tcPr>
-            <w:tcW w:type="dxa" w:w="1063"/>
-            <w:vAlign w:val="center"/>
-          </w:tcPr>
-          <w:p>
-            <w:pPr>
-              <w:spacing w:before="0" w:after="0"/>
-              <w:jc w:val="center"/>
-            </w:pPr>
-            <w:r>
-              <w:rPr>
-                <w:rFonts w:ascii="Times New Roman" w:hAnsi="Times New Roman" w:eastAsia="Times New Roman"/>
-                <w:b w:val="0"/>
-                <w:sz w:val="16"/>
-              </w:rPr>
-              <w:t>0,712</w:t>
-            </w:r>
-          </w:p>
-        </w:tc>
-        <w:tc>
-          <w:tcPr>
-            <w:tcW w:type="dxa" w:w="1063"/>
-            <w:vAlign w:val="center"/>
-          </w:tcPr>
-          <w:p>
-            <w:pPr>
-              <w:spacing w:before="0" w:after="0"/>
-              <w:jc w:val="center"/>
-            </w:pPr>
-            <w:r>
-              <w:rPr>
-                <w:rFonts w:ascii="Times New Roman" w:hAnsi="Times New Roman" w:eastAsia="Times New Roman"/>
-                <w:b w:val="0"/>
-                <w:sz w:val="16"/>
-              </w:rPr>
-              <w:t>29,0</w:t>
-            </w:r>
-          </w:p>
-        </w:tc>
-        <w:tc>
-          <w:tcPr>
-            <w:tcW w:type="dxa" w:w="1063"/>
-            <w:vAlign w:val="center"/>
-          </w:tcPr>
-          <w:p>
-            <w:pPr>
-              <w:spacing w:before="0" w:after="0"/>
-              <w:jc w:val="center"/>
-            </w:pPr>
-            <w:r>
-              <w:rPr>
-                <w:rFonts w:ascii="Times New Roman" w:hAnsi="Times New Roman" w:eastAsia="Times New Roman"/>
-                <w:b w:val="0"/>
-                <w:sz w:val="16"/>
-              </w:rPr>
-              <w:t>19,3</w:t>
-            </w:r>
-          </w:p>
-        </w:tc>
-      </w:tr>
-      <w:tr>
-        <w:tc>
-          <w:tcPr>
-            <w:tcW w:type="dxa" w:w="1063"/>
-            <w:vAlign w:val="center"/>
-          </w:tcPr>
-          <w:p>
-            <w:pPr>
-              <w:spacing w:before="0" w:after="0"/>
-              <w:jc w:val="center"/>
-            </w:pPr>
-            <w:r>
-              <w:rPr>
-                <w:rFonts w:ascii="Times New Roman" w:hAnsi="Times New Roman" w:eastAsia="Times New Roman"/>
-                <w:b w:val="0"/>
-                <w:sz w:val="16"/>
-              </w:rPr>
-              <w:t>Plateia</w:t>
-            </w:r>
-          </w:p>
-        </w:tc>
-        <w:tc>
-          <w:tcPr>
-            <w:tcW w:type="dxa" w:w="1063"/>
-            <w:vAlign w:val="center"/>
-          </w:tcPr>
-          <w:p>
-            <w:pPr>
-              <w:spacing w:before="0" w:after="0"/>
-              <w:jc w:val="center"/>
-            </w:pPr>
-            <w:r>
-              <w:rPr>
-                <w:rFonts w:ascii="Times New Roman" w:hAnsi="Times New Roman" w:eastAsia="Times New Roman"/>
-                <w:b w:val="0"/>
-                <w:sz w:val="16"/>
-              </w:rPr>
-              <w:t>mediapipe</w:t>
-            </w:r>
-          </w:p>
-        </w:tc>
-        <w:tc>
-          <w:tcPr>
-            <w:tcW w:type="dxa" w:w="1063"/>
-            <w:vAlign w:val="center"/>
-          </w:tcPr>
-          <w:p>
-            <w:pPr>
-              <w:spacing w:before="0" w:after="0"/>
-              <w:jc w:val="center"/>
-            </w:pPr>
-            <w:r>
-              <w:rPr>
-                <w:rFonts w:ascii="Times New Roman" w:hAnsi="Times New Roman" w:eastAsia="Times New Roman"/>
-                <w:b w:val="0"/>
-                <w:sz w:val="16"/>
-              </w:rPr>
-              <w:t>0,011</w:t>
-            </w:r>
-          </w:p>
-        </w:tc>
-        <w:tc>
-          <w:tcPr>
-            <w:tcW w:type="dxa" w:w="1063"/>
-            <w:vAlign w:val="center"/>
-          </w:tcPr>
-          <w:p>
-            <w:pPr>
-              <w:spacing w:before="0" w:after="0"/>
-              <w:jc w:val="center"/>
-            </w:pPr>
-            <w:r>
-              <w:rPr>
-                <w:rFonts w:ascii="Times New Roman" w:hAnsi="Times New Roman" w:eastAsia="Times New Roman"/>
-                <w:b w:val="0"/>
-                <w:sz w:val="16"/>
-              </w:rPr>
-              <w:t>0,011</w:t>
-            </w:r>
-          </w:p>
-        </w:tc>
-        <w:tc>
-          <w:tcPr>
-            <w:tcW w:type="dxa" w:w="1063"/>
-            <w:vAlign w:val="center"/>
-          </w:tcPr>
-          <w:p>
-            <w:pPr>
-              <w:spacing w:before="0" w:after="0"/>
-              <w:jc w:val="center"/>
-            </w:pPr>
-            <w:r>
-              <w:rPr>
-                <w:rFonts w:ascii="Times New Roman" w:hAnsi="Times New Roman" w:eastAsia="Times New Roman"/>
-                <w:b w:val="0"/>
-                <w:sz w:val="16"/>
-              </w:rPr>
-              <w:t>1,000</w:t>
-            </w:r>
-          </w:p>
-        </w:tc>
-        <w:tc>
-          <w:tcPr>
-            <w:tcW w:type="dxa" w:w="1063"/>
-            <w:vAlign w:val="center"/>
-          </w:tcPr>
-          <w:p>
-            <w:pPr>
-              <w:spacing w:before="0" w:after="0"/>
-              <w:jc w:val="center"/>
-            </w:pPr>
-            <w:r>
-              <w:rPr>
-                <w:rFonts w:ascii="Times New Roman" w:hAnsi="Times New Roman" w:eastAsia="Times New Roman"/>
-                <w:b w:val="0"/>
-                <w:sz w:val="16"/>
-              </w:rPr>
-              <w:t>0,022</w:t>
-            </w:r>
-          </w:p>
-        </w:tc>
-        <w:tc>
-          <w:tcPr>
-            <w:tcW w:type="dxa" w:w="1063"/>
-            <w:vAlign w:val="center"/>
-          </w:tcPr>
-          <w:p>
-            <w:pPr>
-              <w:spacing w:before="0" w:after="0"/>
-              <w:jc w:val="center"/>
-            </w:pPr>
-            <w:r>
-              <w:rPr>
-                <w:rFonts w:ascii="Times New Roman" w:hAnsi="Times New Roman" w:eastAsia="Times New Roman"/>
-                <w:b w:val="0"/>
-                <w:sz w:val="16"/>
-              </w:rPr>
-              <w:t>491,6</w:t>
-            </w:r>
-          </w:p>
-        </w:tc>
-        <w:tc>
-          <w:tcPr>
-            <w:tcW w:type="dxa" w:w="1063"/>
-            <w:vAlign w:val="center"/>
-          </w:tcPr>
-          <w:p>
-            <w:pPr>
-              <w:spacing w:before="0" w:after="0"/>
-              <w:jc w:val="center"/>
-            </w:pPr>
-            <w:r>
-              <w:rPr>
-                <w:rFonts w:ascii="Times New Roman" w:hAnsi="Times New Roman" w:eastAsia="Times New Roman"/>
-                <w:b w:val="0"/>
-                <w:sz w:val="16"/>
-              </w:rPr>
-              <w:t>154,6</w:t>
-            </w:r>
-          </w:p>
-        </w:tc>
-      </w:tr>
-      <w:tr>
-        <w:tc>
-          <w:tcPr>
-            <w:tcW w:type="dxa" w:w="1063"/>
-            <w:vAlign w:val="center"/>
-          </w:tcPr>
-          <w:p>
-            <w:pPr>
-              <w:spacing w:before="0" w:after="0"/>
-              <w:jc w:val="center"/>
-            </w:pPr>
-            <w:r>
-              <w:rPr>
-                <w:rFonts w:ascii="Times New Roman" w:hAnsi="Times New Roman" w:eastAsia="Times New Roman"/>
-                <w:b w:val="0"/>
-                <w:sz w:val="16"/>
-              </w:rPr>
-              <w:t>Plateia</w:t>
-            </w:r>
-          </w:p>
-        </w:tc>
-        <w:tc>
-          <w:tcPr>
-            <w:tcW w:type="dxa" w:w="1063"/>
-            <w:vAlign w:val="center"/>
-          </w:tcPr>
-          <w:p>
-            <w:pPr>
-              <w:spacing w:before="0" w:after="0"/>
-              <w:jc w:val="center"/>
-            </w:pPr>
-            <w:r>
-              <w:rPr>
-                <w:rFonts w:ascii="Times New Roman" w:hAnsi="Times New Roman" w:eastAsia="Times New Roman"/>
-                <w:b w:val="0"/>
-                <w:sz w:val="16"/>
-              </w:rPr>
-              <w:t>enhanced</w:t>
-            </w:r>
-          </w:p>
-        </w:tc>
-        <w:tc>
-          <w:tcPr>
-            <w:tcW w:type="dxa" w:w="1063"/>
-            <w:vAlign w:val="center"/>
-          </w:tcPr>
-          <w:p>
-            <w:pPr>
-              <w:spacing w:before="0" w:after="0"/>
-              <w:jc w:val="center"/>
-            </w:pPr>
-            <w:r>
-              <w:rPr>
-                <w:rFonts w:ascii="Times New Roman" w:hAnsi="Times New Roman" w:eastAsia="Times New Roman"/>
-                <w:b w:val="0"/>
-                <w:sz w:val="16"/>
-              </w:rPr>
-              <w:t>0,443</w:t>
-            </w:r>
-          </w:p>
-        </w:tc>
-        <w:tc>
-          <w:tcPr>
-            <w:tcW w:type="dxa" w:w="1063"/>
-            <w:vAlign w:val="center"/>
-          </w:tcPr>
-          <w:p>
-            <w:pPr>
-              <w:spacing w:before="0" w:after="0"/>
-              <w:jc w:val="center"/>
-            </w:pPr>
-            <w:r>
-              <w:rPr>
-                <w:rFonts w:ascii="Times New Roman" w:hAnsi="Times New Roman" w:eastAsia="Times New Roman"/>
-                <w:b w:val="0"/>
-                <w:sz w:val="16"/>
-              </w:rPr>
-              <w:t>0,089</w:t>
-            </w:r>
-          </w:p>
-        </w:tc>
-        <w:tc>
-          <w:tcPr>
-            <w:tcW w:type="dxa" w:w="1063"/>
-            <w:vAlign w:val="center"/>
-          </w:tcPr>
-          <w:p>
-            <w:pPr>
-              <w:spacing w:before="0" w:after="0"/>
-              <w:jc w:val="center"/>
-            </w:pPr>
-            <w:r>
-              <w:rPr>
-                <w:rFonts w:ascii="Times New Roman" w:hAnsi="Times New Roman" w:eastAsia="Times New Roman"/>
-                <w:b w:val="0"/>
-                <w:sz w:val="16"/>
-              </w:rPr>
-              <w:t>0,851</w:t>
-            </w:r>
-          </w:p>
-        </w:tc>
-        <w:tc>
-          <w:tcPr>
-            <w:tcW w:type="dxa" w:w="1063"/>
-            <w:vAlign w:val="center"/>
-          </w:tcPr>
-          <w:p>
-            <w:pPr>
-              <w:spacing w:before="0" w:after="0"/>
-              <w:jc w:val="center"/>
-            </w:pPr>
-            <w:r>
-              <w:rPr>
-                <w:rFonts w:ascii="Times New Roman" w:hAnsi="Times New Roman" w:eastAsia="Times New Roman"/>
-                <w:b w:val="0"/>
-                <w:sz w:val="16"/>
-              </w:rPr>
-              <w:t>0,583</w:t>
-            </w:r>
-          </w:p>
-        </w:tc>
-        <w:tc>
-          <w:tcPr>
-            <w:tcW w:type="dxa" w:w="1063"/>
-            <w:vAlign w:val="center"/>
-          </w:tcPr>
-          <w:p>
-            <w:pPr>
-              <w:spacing w:before="0" w:after="0"/>
-              <w:jc w:val="center"/>
-            </w:pPr>
-            <w:r>
-              <w:rPr>
-                <w:rFonts w:ascii="Times New Roman" w:hAnsi="Times New Roman" w:eastAsia="Times New Roman"/>
-                <w:b w:val="0"/>
-                <w:sz w:val="16"/>
-              </w:rPr>
-              <w:t>74,5</w:t>
-            </w:r>
-          </w:p>
-        </w:tc>
-        <w:tc>
-          <w:tcPr>
-            <w:tcW w:type="dxa" w:w="1063"/>
-            <w:vAlign w:val="center"/>
-          </w:tcPr>
-          <w:p>
-            <w:pPr>
-              <w:spacing w:before="0" w:after="0"/>
-              <w:jc w:val="center"/>
-            </w:pPr>
-            <w:r>
-              <w:rPr>
-                <w:rFonts w:ascii="Times New Roman" w:hAnsi="Times New Roman" w:eastAsia="Times New Roman"/>
-                <w:b w:val="0"/>
-                <w:sz w:val="16"/>
-              </w:rPr>
-              <w:t>56,3</w:t>
-            </w:r>
-          </w:p>
-        </w:tc>
-      </w:tr>
-    </w:tbl>
-    <w:p>
-      <w:pPr>
-        <w:spacing w:before="120" w:after="0" w:line="240" w:lineRule="auto"/>
-        <w:ind w:firstLine="0"/>
-      </w:pPr>
-      <w:r>
-        <w:rPr>
-          <w:rFonts w:ascii="Times New Roman" w:hAnsi="Times New Roman" w:eastAsia="Times New Roman"/>
-          <w:b w:val="0"/>
-          <w:i w:val="0"/>
-          <w:sz w:val="24"/>
-        </w:rPr>
-        <w:t>A Tabela 2 resume a auditoria HQ do modo plateia com a configuração enhanced, confiança 0,60 e limite de 24 faces. Diferentemente da Tabela 1, essa avaliação usa vídeos 1080p completos, cenas mais pesadas e comparação com contagem manual em quadros específicos. Portanto, o FPS dessa auditoria não deve ser comparado diretamente com o FPS do benchmark de detector em 960x540.</w:t>
-      </w:r>
-    </w:p>
-    <w:p>
-      <w:pPr>
-        <w:spacing w:before="120" w:after="120" w:line="240" w:lineRule="auto"/>
-        <w:ind w:firstLine="0"/>
-        <w:jc w:val="center"/>
-      </w:pPr>
-      <w:r>
-        <w:rPr>
-          <w:rFonts w:ascii="Arial" w:hAnsi="Arial" w:eastAsia="Arial"/>
-          <w:b/>
-          <w:sz w:val="20"/>
-        </w:rPr>
-        <w:t>Tabela 2. Auditoria HQ de plateia com configuração enhanced, confiança 0,60 e limite de 24 faces.</w:t>
-      </w:r>
-    </w:p>
-    <w:tbl>
-      <w:tblPr>
-        <w:tblW w:type="auto" w:w="0"/>
-        <w:jc w:val="center"/>
-        <w:tblLayout w:type="autofit"/>
-        <w:tblLook w:firstColumn="1" w:firstRow="1" w:lastColumn="0" w:lastRow="0" w:noHBand="0" w:noVBand="1" w:val="04A0"/>
-        <w:tblBorders>
-          <w:top w:val="single" w:sz="4" w:space="0" w:color="808080"/>
-          <w:left w:val="single" w:sz="4" w:space="0" w:color="808080"/>
-          <w:bottom w:val="single" w:sz="4" w:space="0" w:color="808080"/>
-          <w:right w:val="single" w:sz="4" w:space="0" w:color="808080"/>
-          <w:insideH w:val="single" w:sz="4" w:space="0" w:color="808080"/>
-          <w:insideV w:val="single" w:sz="4" w:space="0" w:color="808080"/>
-        </w:tblBorders>
-        <w:tblCellMar>
-          <w:top w:w="20" w:type="dxa"/>
-          <w:start w:w="35" w:type="dxa"/>
-          <w:bottom w:w="20" w:type="dxa"/>
-          <w:end w:w="35" w:type="dxa"/>
-        </w:tblCellMar>
-      </w:tblPr>
-      <w:tblGrid>
-        <w:gridCol w:w="4252"/>
-        <w:gridCol w:w="4252"/>
-      </w:tblGrid>
-      <w:tr>
-        <w:tc>
-          <w:tcPr>
-            <w:tcW w:type="dxa" w:w="4252"/>
-            <w:vAlign w:val="center"/>
-          </w:tcPr>
-          <w:p>
-            <w:pPr>
-              <w:spacing w:before="0" w:after="0"/>
-              <w:jc w:val="center"/>
-            </w:pPr>
-            <w:r>
-              <w:rPr>
-                <w:rFonts w:ascii="Times New Roman" w:hAnsi="Times New Roman" w:eastAsia="Times New Roman"/>
-                <w:b/>
-                <w:sz w:val="18"/>
-              </w:rPr>
-              <w:t>Métrica</w:t>
-            </w:r>
-          </w:p>
-        </w:tc>
-        <w:tc>
-          <w:tcPr>
-            <w:tcW w:type="dxa" w:w="4252"/>
-            <w:vAlign w:val="center"/>
-          </w:tcPr>
-          <w:p>
-            <w:pPr>
-              <w:spacing w:before="0" w:after="0"/>
-              <w:jc w:val="center"/>
-            </w:pPr>
-            <w:r>
-              <w:rPr>
-                <w:rFonts w:ascii="Times New Roman" w:hAnsi="Times New Roman" w:eastAsia="Times New Roman"/>
-                <w:b/>
-                <w:sz w:val="18"/>
-              </w:rPr>
-              <w:t>Resultado</w:t>
-            </w:r>
-          </w:p>
-        </w:tc>
-      </w:tr>
-      <w:tr>
-        <w:tc>
-          <w:tcPr>
-            <w:tcW w:type="dxa" w:w="4252"/>
-            <w:vAlign w:val="center"/>
-          </w:tcPr>
-          <w:p>
-            <w:pPr>
-              <w:spacing w:before="0" w:after="0"/>
-              <w:jc w:val="center"/>
-            </w:pPr>
-            <w:r>
-              <w:rPr>
-                <w:rFonts w:ascii="Times New Roman" w:hAnsi="Times New Roman" w:eastAsia="Times New Roman"/>
-                <w:b w:val="0"/>
-                <w:sz w:val="18"/>
-              </w:rPr>
-              <w:t>Acertos exatos</w:t>
-            </w:r>
-          </w:p>
-        </w:tc>
-        <w:tc>
-          <w:tcPr>
-            <w:tcW w:type="dxa" w:w="4252"/>
-            <w:vAlign w:val="center"/>
-          </w:tcPr>
-          <w:p>
-            <w:pPr>
-              <w:spacing w:before="0" w:after="0"/>
-              <w:jc w:val="center"/>
-            </w:pPr>
-            <w:r>
-              <w:rPr>
-                <w:rFonts w:ascii="Times New Roman" w:hAnsi="Times New Roman" w:eastAsia="Times New Roman"/>
-                <w:b w:val="0"/>
-                <w:sz w:val="18"/>
-              </w:rPr>
-              <w:t>5/11</w:t>
-            </w:r>
-          </w:p>
-        </w:tc>
-      </w:tr>
-      <w:tr>
-        <w:tc>
-          <w:tcPr>
-            <w:tcW w:type="dxa" w:w="4252"/>
-            <w:vAlign w:val="center"/>
-          </w:tcPr>
-          <w:p>
-            <w:pPr>
-              <w:spacing w:before="0" w:after="0"/>
-              <w:jc w:val="center"/>
-            </w:pPr>
-            <w:r>
-              <w:rPr>
-                <w:rFonts w:ascii="Times New Roman" w:hAnsi="Times New Roman" w:eastAsia="Times New Roman"/>
-                <w:b w:val="0"/>
-                <w:sz w:val="18"/>
-              </w:rPr>
-              <w:t>Erro de no máximo 1 rosto</w:t>
-            </w:r>
-          </w:p>
-        </w:tc>
-        <w:tc>
-          <w:tcPr>
-            <w:tcW w:type="dxa" w:w="4252"/>
-            <w:vAlign w:val="center"/>
-          </w:tcPr>
-          <w:p>
-            <w:pPr>
-              <w:spacing w:before="0" w:after="0"/>
-              <w:jc w:val="center"/>
-            </w:pPr>
-            <w:r>
-              <w:rPr>
-                <w:rFonts w:ascii="Times New Roman" w:hAnsi="Times New Roman" w:eastAsia="Times New Roman"/>
-                <w:b w:val="0"/>
-                <w:sz w:val="18"/>
-              </w:rPr>
-              <w:t>10/11</w:t>
-            </w:r>
-          </w:p>
-        </w:tc>
-      </w:tr>
-      <w:tr>
-        <w:tc>
-          <w:tcPr>
-            <w:tcW w:type="dxa" w:w="4252"/>
-            <w:vAlign w:val="center"/>
-          </w:tcPr>
-          <w:p>
-            <w:pPr>
-              <w:spacing w:before="0" w:after="0"/>
-              <w:jc w:val="center"/>
-            </w:pPr>
-            <w:r>
-              <w:rPr>
-                <w:rFonts w:ascii="Times New Roman" w:hAnsi="Times New Roman" w:eastAsia="Times New Roman"/>
-                <w:b w:val="0"/>
-                <w:sz w:val="18"/>
-              </w:rPr>
-              <w:t>Erro absoluto médio</w:t>
-            </w:r>
-          </w:p>
-        </w:tc>
-        <w:tc>
-          <w:tcPr>
-            <w:tcW w:type="dxa" w:w="4252"/>
-            <w:vAlign w:val="center"/>
-          </w:tcPr>
-          <w:p>
-            <w:pPr>
-              <w:spacing w:before="0" w:after="0"/>
-              <w:jc w:val="center"/>
-            </w:pPr>
-            <w:r>
-              <w:rPr>
-                <w:rFonts w:ascii="Times New Roman" w:hAnsi="Times New Roman" w:eastAsia="Times New Roman"/>
-                <w:b w:val="0"/>
-                <w:sz w:val="18"/>
-              </w:rPr>
-              <w:t>0,636 rosto</w:t>
-            </w:r>
-          </w:p>
-        </w:tc>
-      </w:tr>
-      <w:tr>
-        <w:tc>
-          <w:tcPr>
-            <w:tcW w:type="dxa" w:w="4252"/>
-            <w:vAlign w:val="center"/>
-          </w:tcPr>
-          <w:p>
-            <w:pPr>
-              <w:spacing w:before="0" w:after="0"/>
-              <w:jc w:val="center"/>
-            </w:pPr>
-            <w:r>
-              <w:rPr>
-                <w:rFonts w:ascii="Times New Roman" w:hAnsi="Times New Roman" w:eastAsia="Times New Roman"/>
-                <w:b w:val="0"/>
-                <w:sz w:val="18"/>
-              </w:rPr>
-              <w:t>Manual dentro da janela +/-1 s</w:t>
-            </w:r>
-          </w:p>
-        </w:tc>
-        <w:tc>
-          <w:tcPr>
-            <w:tcW w:type="dxa" w:w="4252"/>
-            <w:vAlign w:val="center"/>
-          </w:tcPr>
-          <w:p>
-            <w:pPr>
-              <w:spacing w:before="0" w:after="0"/>
-              <w:jc w:val="center"/>
-            </w:pPr>
-            <w:r>
-              <w:rPr>
-                <w:rFonts w:ascii="Times New Roman" w:hAnsi="Times New Roman" w:eastAsia="Times New Roman"/>
-                <w:b w:val="0"/>
-                <w:sz w:val="18"/>
-              </w:rPr>
-              <w:t>10/11</w:t>
-            </w:r>
-          </w:p>
-        </w:tc>
-      </w:tr>
-      <w:tr>
-        <w:tc>
-          <w:tcPr>
-            <w:tcW w:type="dxa" w:w="4252"/>
-            <w:vAlign w:val="center"/>
-          </w:tcPr>
-          <w:p>
-            <w:pPr>
-              <w:spacing w:before="0" w:after="0"/>
-              <w:jc w:val="center"/>
-            </w:pPr>
-            <w:r>
-              <w:rPr>
-                <w:rFonts w:ascii="Times New Roman" w:hAnsi="Times New Roman" w:eastAsia="Times New Roman"/>
-                <w:b w:val="0"/>
-                <w:sz w:val="18"/>
-              </w:rPr>
-              <w:t>FPS médio</w:t>
-            </w:r>
-          </w:p>
-        </w:tc>
-        <w:tc>
-          <w:tcPr>
-            <w:tcW w:type="dxa" w:w="4252"/>
-            <w:vAlign w:val="center"/>
-          </w:tcPr>
-          <w:p>
-            <w:pPr>
-              <w:spacing w:before="0" w:after="0"/>
-              <w:jc w:val="center"/>
-            </w:pPr>
-            <w:r>
-              <w:rPr>
-                <w:rFonts w:ascii="Times New Roman" w:hAnsi="Times New Roman" w:eastAsia="Times New Roman"/>
-                <w:b w:val="0"/>
-                <w:sz w:val="18"/>
-              </w:rPr>
-              <w:t>13,3</w:t>
-            </w:r>
-          </w:p>
-        </w:tc>
-      </w:tr>
-      <w:tr>
-        <w:tc>
-          <w:tcPr>
-            <w:tcW w:type="dxa" w:w="4252"/>
-            <w:vAlign w:val="center"/>
-          </w:tcPr>
-          <w:p>
-            <w:pPr>
-              <w:spacing w:before="0" w:after="0"/>
-              <w:jc w:val="center"/>
-            </w:pPr>
-            <w:r>
-              <w:rPr>
-                <w:rFonts w:ascii="Times New Roman" w:hAnsi="Times New Roman" w:eastAsia="Times New Roman"/>
-                <w:b w:val="0"/>
-                <w:sz w:val="18"/>
-              </w:rPr>
-              <w:t>FPS p10</w:t>
-            </w:r>
-          </w:p>
-        </w:tc>
-        <w:tc>
-          <w:tcPr>
-            <w:tcW w:type="dxa" w:w="4252"/>
-            <w:vAlign w:val="center"/>
-          </w:tcPr>
-          <w:p>
-            <w:pPr>
-              <w:spacing w:before="0" w:after="0"/>
-              <w:jc w:val="center"/>
-            </w:pPr>
-            <w:r>
-              <w:rPr>
-                <w:rFonts w:ascii="Times New Roman" w:hAnsi="Times New Roman" w:eastAsia="Times New Roman"/>
-                <w:b w:val="0"/>
-                <w:sz w:val="18"/>
               </w:rPr>
               <w:t>9,4</w:t>
             </w:r>
@@ -1660,8 +1954,14 @@
     </w:tbl>
     <w:p>
       <w:pPr>
-        <w:spacing w:before="120" w:after="0" w:line="240" w:lineRule="auto"/>
-        <w:ind w:firstLine="0"/>
+        <w:spacing w:after="80"/>
+      </w:pPr>
+    </w:p>
+    <w:p>
+      <w:pPr>
+        <w:spacing w:after="120"/>
+        <w:ind w:firstLine="720"/>
+        <w:jc w:val="both"/>
       </w:pPr>
       <w:r>
         <w:rPr>
@@ -1670,241 +1970,30 @@
           <w:i w:val="0"/>
           <w:sz w:val="24"/>
         </w:rPr>
-        <w:t>A matriz de confusão disponível na versão revisada é demonstrativa. Ela contém 50 amostras sintéticas de atenção e desatenção, usadas para testar o fluxo de cálculo, visualização e relatório. A Tabela 3 mostra que houve 46 acertos e 4 erros, produzindo acurácia, precisão macro, recall macro e F1 macro de 0,92. Como as amostras são explicitamente demonstrativas, esse resultado não é apresentado como validação científica real; a validação final exige amostras reais rotuladas.</w:t>
+        <w:t>A matriz de confusão disponível contém 50 amostras sintéticas de atenção/desatenção, usadas para testar o fluxo de cálculo, visualização e relatório. O resultado foi acurácia, precisão macro, recall macro e F1 macro de 0,92. Por serem amostras demonstrativas, esses valores não substituem uma validação científica com rotulação real.</w:t>
       </w:r>
     </w:p>
     <w:p>
       <w:pPr>
-        <w:spacing w:before="120" w:after="120" w:line="240" w:lineRule="auto"/>
-        <w:ind w:firstLine="0"/>
-        <w:jc w:val="center"/>
+        <w:keepNext/>
+        <w:spacing w:before="200" w:after="120"/>
+        <w:jc w:val="left"/>
       </w:pPr>
       <w:r>
         <w:rPr>
-          <w:rFonts w:ascii="Arial" w:hAnsi="Arial" w:eastAsia="Arial"/>
+          <w:rFonts w:ascii="Times New Roman" w:hAnsi="Times New Roman" w:eastAsia="Times New Roman"/>
           <w:b/>
-          <w:sz w:val="20"/>
+          <w:i w:val="0"/>
+          <w:sz w:val="26"/>
         </w:rPr>
-        <w:t>Tabela 3. Matriz de confusão demonstrativa com 50 amostras.</w:t>
+        <w:t>Discussão</w:t>
       </w:r>
     </w:p>
-    <w:tbl>
-      <w:tblPr>
-        <w:tblW w:type="auto" w:w="0"/>
-        <w:jc w:val="center"/>
-        <w:tblLayout w:type="autofit"/>
-        <w:tblLook w:firstColumn="1" w:firstRow="1" w:lastColumn="0" w:lastRow="0" w:noHBand="0" w:noVBand="1" w:val="04A0"/>
-        <w:tblBorders>
-          <w:top w:val="single" w:sz="4" w:space="0" w:color="808080"/>
-          <w:left w:val="single" w:sz="4" w:space="0" w:color="808080"/>
-          <w:bottom w:val="single" w:sz="4" w:space="0" w:color="808080"/>
-          <w:right w:val="single" w:sz="4" w:space="0" w:color="808080"/>
-          <w:insideH w:val="single" w:sz="4" w:space="0" w:color="808080"/>
-          <w:insideV w:val="single" w:sz="4" w:space="0" w:color="808080"/>
-        </w:tblBorders>
-        <w:tblCellMar>
-          <w:top w:w="20" w:type="dxa"/>
-          <w:start w:w="35" w:type="dxa"/>
-          <w:bottom w:w="20" w:type="dxa"/>
-          <w:end w:w="35" w:type="dxa"/>
-        </w:tblCellMar>
-      </w:tblPr>
-      <w:tblGrid>
-        <w:gridCol w:w="2835"/>
-        <w:gridCol w:w="2835"/>
-        <w:gridCol w:w="2835"/>
-      </w:tblGrid>
-      <w:tr>
-        <w:tc>
-          <w:tcPr>
-            <w:tcW w:type="dxa" w:w="2835"/>
-            <w:vAlign w:val="center"/>
-          </w:tcPr>
-          <w:p>
-            <w:pPr>
-              <w:spacing w:before="0" w:after="0"/>
-              <w:jc w:val="center"/>
-            </w:pPr>
-            <w:r>
-              <w:rPr>
-                <w:rFonts w:ascii="Times New Roman" w:hAnsi="Times New Roman" w:eastAsia="Times New Roman"/>
-                <w:b/>
-                <w:sz w:val="18"/>
-              </w:rPr>
-              <w:t>Classe real</w:t>
-            </w:r>
-          </w:p>
-        </w:tc>
-        <w:tc>
-          <w:tcPr>
-            <w:tcW w:type="dxa" w:w="2835"/>
-            <w:vAlign w:val="center"/>
-          </w:tcPr>
-          <w:p>
-            <w:pPr>
-              <w:spacing w:before="0" w:after="0"/>
-              <w:jc w:val="center"/>
-            </w:pPr>
-            <w:r>
-              <w:rPr>
-                <w:rFonts w:ascii="Times New Roman" w:hAnsi="Times New Roman" w:eastAsia="Times New Roman"/>
-                <w:b/>
-                <w:sz w:val="18"/>
-              </w:rPr>
-              <w:t>Predito atento</w:t>
-            </w:r>
-          </w:p>
-        </w:tc>
-        <w:tc>
-          <w:tcPr>
-            <w:tcW w:type="dxa" w:w="2835"/>
-            <w:vAlign w:val="center"/>
-          </w:tcPr>
-          <w:p>
-            <w:pPr>
-              <w:spacing w:before="0" w:after="0"/>
-              <w:jc w:val="center"/>
-            </w:pPr>
-            <w:r>
-              <w:rPr>
-                <w:rFonts w:ascii="Times New Roman" w:hAnsi="Times New Roman" w:eastAsia="Times New Roman"/>
-                <w:b/>
-                <w:sz w:val="18"/>
-              </w:rPr>
-              <w:t>Predito desatento</w:t>
-            </w:r>
-          </w:p>
-        </w:tc>
-      </w:tr>
-      <w:tr>
-        <w:tc>
-          <w:tcPr>
-            <w:tcW w:type="dxa" w:w="2835"/>
-            <w:vAlign w:val="center"/>
-          </w:tcPr>
-          <w:p>
-            <w:pPr>
-              <w:spacing w:before="0" w:after="0"/>
-              <w:jc w:val="center"/>
-            </w:pPr>
-            <w:r>
-              <w:rPr>
-                <w:rFonts w:ascii="Times New Roman" w:hAnsi="Times New Roman" w:eastAsia="Times New Roman"/>
-                <w:b w:val="0"/>
-                <w:sz w:val="18"/>
-              </w:rPr>
-              <w:t>Atento</w:t>
-            </w:r>
-          </w:p>
-        </w:tc>
-        <w:tc>
-          <w:tcPr>
-            <w:tcW w:type="dxa" w:w="2835"/>
-            <w:vAlign w:val="center"/>
-          </w:tcPr>
-          <w:p>
-            <w:pPr>
-              <w:spacing w:before="0" w:after="0"/>
-              <w:jc w:val="center"/>
-            </w:pPr>
-            <w:r>
-              <w:rPr>
-                <w:rFonts w:ascii="Times New Roman" w:hAnsi="Times New Roman" w:eastAsia="Times New Roman"/>
-                <w:b w:val="0"/>
-                <w:sz w:val="18"/>
-              </w:rPr>
-              <w:t>23</w:t>
-            </w:r>
-          </w:p>
-        </w:tc>
-        <w:tc>
-          <w:tcPr>
-            <w:tcW w:type="dxa" w:w="2835"/>
-            <w:vAlign w:val="center"/>
-          </w:tcPr>
-          <w:p>
-            <w:pPr>
-              <w:spacing w:before="0" w:after="0"/>
-              <w:jc w:val="center"/>
-            </w:pPr>
-            <w:r>
-              <w:rPr>
-                <w:rFonts w:ascii="Times New Roman" w:hAnsi="Times New Roman" w:eastAsia="Times New Roman"/>
-                <w:b w:val="0"/>
-                <w:sz w:val="18"/>
-              </w:rPr>
-              <w:t>2</w:t>
-            </w:r>
-          </w:p>
-        </w:tc>
-      </w:tr>
-      <w:tr>
-        <w:tc>
-          <w:tcPr>
-            <w:tcW w:type="dxa" w:w="2835"/>
-            <w:vAlign w:val="center"/>
-          </w:tcPr>
-          <w:p>
-            <w:pPr>
-              <w:spacing w:before="0" w:after="0"/>
-              <w:jc w:val="center"/>
-            </w:pPr>
-            <w:r>
-              <w:rPr>
-                <w:rFonts w:ascii="Times New Roman" w:hAnsi="Times New Roman" w:eastAsia="Times New Roman"/>
-                <w:b w:val="0"/>
-                <w:sz w:val="18"/>
-              </w:rPr>
-              <w:t>Desatento</w:t>
-            </w:r>
-          </w:p>
-        </w:tc>
-        <w:tc>
-          <w:tcPr>
-            <w:tcW w:type="dxa" w:w="2835"/>
-            <w:vAlign w:val="center"/>
-          </w:tcPr>
-          <w:p>
-            <w:pPr>
-              <w:spacing w:before="0" w:after="0"/>
-              <w:jc w:val="center"/>
-            </w:pPr>
-            <w:r>
-              <w:rPr>
-                <w:rFonts w:ascii="Times New Roman" w:hAnsi="Times New Roman" w:eastAsia="Times New Roman"/>
-                <w:b w:val="0"/>
-                <w:sz w:val="18"/>
-              </w:rPr>
-              <w:t>2</w:t>
-            </w:r>
-          </w:p>
-        </w:tc>
-        <w:tc>
-          <w:tcPr>
-            <w:tcW w:type="dxa" w:w="2835"/>
-            <w:vAlign w:val="center"/>
-          </w:tcPr>
-          <w:p>
-            <w:pPr>
-              <w:spacing w:before="0" w:after="0"/>
-              <w:jc w:val="center"/>
-            </w:pPr>
-            <w:r>
-              <w:rPr>
-                <w:rFonts w:ascii="Times New Roman" w:hAnsi="Times New Roman" w:eastAsia="Times New Roman"/>
-                <w:b w:val="0"/>
-                <w:sz w:val="18"/>
-              </w:rPr>
-              <w:t>23</w:t>
-            </w:r>
-          </w:p>
-        </w:tc>
-      </w:tr>
-    </w:tbl>
     <w:p>
       <w:pPr>
-        <w:spacing w:before="120" w:after="0" w:line="240" w:lineRule="auto"/>
-        <w:ind w:firstLine="720"/>
+        <w:spacing w:after="120"/>
+        <w:ind w:firstLine="0"/>
+        <w:jc w:val="both"/>
       </w:pPr>
       <w:r>
         <w:rPr>
@@ -1913,28 +2002,14 @@
           <w:i w:val="0"/>
           <w:sz w:val="24"/>
         </w:rPr>
-        <w:t>O relatório de sessão demonstra que a aplicação gera CSVs de telemetria, gráficos, páginas HTML, PDF e linha do tempo de eventos. Seus valores numéricos não foram usados para substituir a reexecução formal dos cinco protocolos, mas comprovam que o sistema está instrumentado para registrar sessões e produzir artefatos analisáveis.</w:t>
+        <w:t>Os resultados justificam o perfil enhanced como padrão. O baseline mediapipe é muito rápido, mas perde faces pequenas ou distantes, sobretudo no modo plateia. A combinação YuNet + crops + landmarks aumenta a utilidade visual do produto sem exigir treinamento próprio. Separar recall de face e recall de landmarks evita uma interpretação incorreta: uma caixa pode estar correta, mas ainda não oferecer pontos confiáveis para pose ou EAR/MAR.</w:t>
       </w:r>
     </w:p>
     <w:p>
       <w:pPr>
-        <w:spacing w:before="240" w:after="0"/>
-        <w:ind w:firstLine="0"/>
-        <w:jc w:val="left"/>
-      </w:pPr>
-      <w:r>
-        <w:rPr>
-          <w:rFonts w:ascii="Times New Roman" w:hAnsi="Times New Roman" w:eastAsia="Times New Roman"/>
-          <w:b/>
-          <w:sz w:val="26"/>
-        </w:rPr>
-        <w:t>6. Discussão</w:t>
-      </w:r>
-    </w:p>
-    <w:p>
-      <w:pPr>
-        <w:spacing w:before="120" w:after="0" w:line="240" w:lineRule="auto"/>
+        <w:spacing w:after="120"/>
         <w:ind w:firstLine="720"/>
+        <w:jc w:val="both"/>
       </w:pPr>
       <w:r>
         <w:rPr>
@@ -1943,13 +2018,14 @@
           <w:i w:val="0"/>
           <w:sz w:val="24"/>
         </w:rPr>
-        <w:t>Os resultados justificam o uso do perfil enhanced como padrão. O baseline MediaPipe é muito rápido, mas perde muitas faces pequenas ou distantes, sobretudo no modo plateia. O uso de YuNet antes dos landmarks aumenta o recall de faces e torna a interface mais útil para demonstrações com mais de uma pessoa. A principal contrapartida é a queda de FPS e a diferença entre detecção de face e disponibilidade de landmarks.</w:t>
+        <w:t>No modo individual, os principais ajustes metodológicos foram motivados pelos testes. O pitch retornado por solvePnP pode alternar entre +179 e -179 graus para faces frontais; por isso o baseline passou a usar média circular. A calibração também passou a esperar a primeira face válida, pois vídeos com abertura sem rosto geravam baseline inadequado. Esses dois pontos aumentaram a consistência dos deltas de pose em vídeos frontais.</w:t>
       </w:r>
     </w:p>
     <w:p>
       <w:pPr>
-        <w:spacing w:before="120" w:after="0" w:line="240" w:lineRule="auto"/>
+        <w:spacing w:after="120"/>
         <w:ind w:firstLine="720"/>
+        <w:jc w:val="both"/>
       </w:pPr>
       <w:r>
         <w:rPr>
@@ -1958,13 +2034,30 @@
           <w:i w:val="0"/>
           <w:sz w:val="24"/>
         </w:rPr>
-        <w:t>Essa diferença é importante para interpretar o sistema. Uma face pode ser localizada por caixa, mas não gerar landmarks estáveis o suficiente para pose, EAR ou MAR. Nesses casos, a face pode ser desenhada de forma anônima, mas não deve influenciar métricas de atenção ou engajamento. Por isso, recall de face e recall de landmarks são relatados separadamente.</w:t>
+        <w:t>Ainda há limitações importantes. Iluminação irregular, contraluz, oclusões, rosto em perfil, distância excessiva, motion blur e cortes nas bordas reduzem a estabilidade de landmarks. No modo plateia, a estimativa é agregada e visual; ela não mede atenção cognitiva. No modo individual, EAR e MAR variam entre pessoas e dependem de calibração inicial.</w:t>
       </w:r>
     </w:p>
     <w:p>
       <w:pPr>
-        <w:spacing w:before="120" w:after="0" w:line="240" w:lineRule="auto"/>
-        <w:ind w:firstLine="720"/>
+        <w:keepNext/>
+        <w:spacing w:before="200" w:after="120"/>
+        <w:jc w:val="left"/>
+      </w:pPr>
+      <w:r>
+        <w:rPr>
+          <w:rFonts w:ascii="Times New Roman" w:hAnsi="Times New Roman" w:eastAsia="Times New Roman"/>
+          <w:b/>
+          <w:i w:val="0"/>
+          <w:sz w:val="26"/>
+        </w:rPr>
+        <w:t>Considerações Éticas e LGPD</w:t>
+      </w:r>
+    </w:p>
+    <w:p>
+      <w:pPr>
+        <w:spacing w:after="120"/>
+        <w:ind w:firstLine="0"/>
+        <w:jc w:val="both"/>
       </w:pPr>
       <w:r>
         <w:rPr>
@@ -1973,13 +2066,14 @@
           <w:i w:val="0"/>
           <w:sz w:val="24"/>
         </w:rPr>
-        <w:t>Também há diferença metodológica entre o FPS do benchmark e o FPS da auditoria HQ. O benchmark smoke mede o pipeline do detector em 960x540, com foco em comparação controlada entre perfis. A auditoria HQ processa vídeos 1080p completos, registra respostas por frame e avalia cenas com maior densidade visual. É esperado que os valores absolutos de FPS sejam menores nesse contexto.</w:t>
+        <w:t>Como o sistema captura imagem de pessoas, seu uso deve seguir minimização de dados, transparência e finalidade acadêmica. O modo individual deve ser demonstrado com consentimento do participante e sem finalidade punitiva, clínica ou classificatória. O modo plateia deve operar com métricas agregadas e não deve identificar alunos, associar nomes a rostos ou produzir avaliação individual de aprendizagem.</w:t>
       </w:r>
     </w:p>
     <w:p>
       <w:pPr>
-        <w:spacing w:before="120" w:after="0" w:line="240" w:lineRule="auto"/>
+        <w:spacing w:after="120"/>
         <w:ind w:firstLine="720"/>
+        <w:jc w:val="both"/>
       </w:pPr>
       <w:r>
         <w:rPr>
@@ -1988,28 +2082,30 @@
           <w:i w:val="0"/>
           <w:sz w:val="24"/>
         </w:rPr>
-        <w:t>As limitações observadas são coerentes com aplicações de visão computacional em tempo real. Iluminação irregular, distância da câmera, oclusão parcial, rostos em perfil, faces pequenas, motion blur e cortes nas bordas reduzem a estabilidade dos landmarks. No modo individual, EAR e MAR variam entre pessoas e dependem da calibração inicial. No modo plateia, a métrica agregada estima orientação visual aproximada e não atenção cognitiva ou aprendizagem.</w:t>
+        <w:t>A proposta privilegia processamento local e armazenamento apenas de telemetria numérica, como séries temporais, contagens, percentuais agregados e eventos de interface. Em demonstrações públicas, recomenda-se sinalização visível, opção de ficar fora do campo da câmera e uso de voluntários quando forem necessárias evidências visuais.</w:t>
       </w:r>
     </w:p>
     <w:p>
       <w:pPr>
-        <w:spacing w:before="240" w:after="0"/>
-        <w:ind w:firstLine="0"/>
+        <w:keepNext/>
+        <w:spacing w:before="200" w:after="120"/>
         <w:jc w:val="left"/>
       </w:pPr>
       <w:r>
         <w:rPr>
           <w:rFonts w:ascii="Times New Roman" w:hAnsi="Times New Roman" w:eastAsia="Times New Roman"/>
           <w:b/>
+          <w:i w:val="0"/>
           <w:sz w:val="26"/>
         </w:rPr>
-        <w:t>7. Considerações Éticas e LGPD</w:t>
+        <w:t>Conclusão</w:t>
       </w:r>
     </w:p>
     <w:p>
       <w:pPr>
-        <w:spacing w:before="120" w:after="0" w:line="240" w:lineRule="auto"/>
-        <w:ind w:firstLine="720"/>
+        <w:spacing w:after="120"/>
+        <w:ind w:firstLine="0"/>
+        <w:jc w:val="both"/>
       </w:pPr>
       <w:r>
         <w:rPr>
@@ -2018,13 +2114,14 @@
           <w:i w:val="0"/>
           <w:sz w:val="24"/>
         </w:rPr>
-        <w:t>O EduTech Vision trata imagem de pessoas e, portanto, deve ser usado com minimização de dados, transparência e finalidade acadêmica. No modo individual, a captura deve ocorrer com consentimento do participante e sem uso punitivo, clínico ou classificatório. No modo plateia, o sistema opera apenas com métricas agregadas e não deve identificar alunos, registrar nomes, persistir frames ou permitir reidentificação.</w:t>
+        <w:t>Este artigo apresentou o EduTech Vision como aplicação de PDI em tempo real para monitoramento aproximado de atenção visual, postura e engajamento agregado. A arquitetura final combina YuNet, MediaPipe Face Landmarker em recortes ampliados, EAR, MAR, solvePnP, suavização temporal, painel OpenCV e relatórios de sessão.</w:t>
       </w:r>
     </w:p>
     <w:p>
       <w:pPr>
-        <w:spacing w:before="120" w:after="0" w:line="240" w:lineRule="auto"/>
+        <w:spacing w:after="120"/>
         <w:ind w:firstLine="720"/>
+        <w:jc w:val="both"/>
       </w:pPr>
       <w:r>
         <w:rPr>
@@ -2033,13 +2130,30 @@
           <w:i w:val="0"/>
           <w:sz w:val="24"/>
         </w:rPr>
-        <w:t>Por padrão, a proposta privilegia processamento local, descarte de imagens e armazenamento apenas de séries temporais, contagens, percentuais agregados e eventos de interface. Relatórios e gráficos devem ser usados para explicar o comportamento do pipeline, não para vigiar indivíduos. Em demonstrações públicas, recomenda-se sinalização visível sobre a captura de imagem, opção de afastamento da câmera e uso de voluntários quando forem necessárias evidências visuais.</w:t>
+        <w:t>As evidências quantitativas mostram ganho claro do perfil enhanced sobre o baseline mediapipe e uma auditoria específica mais forte para o modo individual. Ao mesmo tempo, o artigo delimita o escopo: o sistema é uma demonstração acadêmica e não uma ferramenta diagnóstica ou avaliativa. Trabalhos futuros incluem reexecutar os cinco protocolos formais com coleta presencial completa, ampliar amostras reais rotuladas e testar condições controladas de iluminação, distância e oclusão.</w:t>
       </w:r>
     </w:p>
     <w:p>
       <w:pPr>
-        <w:spacing w:before="120" w:after="0" w:line="240" w:lineRule="auto"/>
-        <w:ind w:firstLine="720"/>
+        <w:keepNext/>
+        <w:spacing w:before="200" w:after="120"/>
+        <w:jc w:val="left"/>
+      </w:pPr>
+      <w:r>
+        <w:rPr>
+          <w:rFonts w:ascii="Times New Roman" w:hAnsi="Times New Roman" w:eastAsia="Times New Roman"/>
+          <w:b/>
+          <w:i w:val="0"/>
+          <w:sz w:val="26"/>
+        </w:rPr>
+        <w:t>Agradecimentos</w:t>
+      </w:r>
+    </w:p>
+    <w:p>
+      <w:pPr>
+        <w:spacing w:after="120"/>
+        <w:ind w:firstLine="0"/>
+        <w:jc w:val="both"/>
       </w:pPr>
       <w:r>
         <w:rPr>
@@ -2048,28 +2162,30 @@
           <w:i w:val="0"/>
           <w:sz w:val="24"/>
         </w:rPr>
-        <w:t>Essas escolhas atendem ao princípio de necessidade da Lei Geral de Proteção de Dados e reduzem o risco de interpretação abusiva. O sistema deve ser entendido como material didático de PDI, não como tecnologia de decisão automatizada sobre estudantes.</w:t>
+        <w:t>Os autores agradecem ao curso de Bacharelado em Ciência da Computação da UNEMAT e ao docente da disciplina de Processamento Digital de Imagens pelas diretrizes, críticas e critérios de avaliação do projeto. Ferramentas de IA generativa foram utilizadas pontualmente como apoio à revisão gramatical e à organização textual; o conteúdo técnico, a interpretação dos resultados e a responsabilidade final permanecem dos autores.</w:t>
       </w:r>
     </w:p>
     <w:p>
       <w:pPr>
-        <w:spacing w:before="240" w:after="0"/>
-        <w:ind w:firstLine="0"/>
+        <w:keepNext/>
+        <w:spacing w:before="200" w:after="120"/>
         <w:jc w:val="left"/>
       </w:pPr>
       <w:r>
         <w:rPr>
           <w:rFonts w:ascii="Times New Roman" w:hAnsi="Times New Roman" w:eastAsia="Times New Roman"/>
           <w:b/>
+          <w:i w:val="0"/>
           <w:sz w:val="26"/>
         </w:rPr>
-        <w:t>8. Conclusão</w:t>
+        <w:t>Referências</w:t>
       </w:r>
     </w:p>
     <w:p>
       <w:pPr>
-        <w:spacing w:before="120" w:after="0" w:line="240" w:lineRule="auto"/>
-        <w:ind w:firstLine="720"/>
+        <w:spacing w:after="120"/>
+        <w:ind w:firstLine="0"/>
+        <w:jc w:val="both"/>
       </w:pPr>
       <w:r>
         <w:rPr>
@@ -2078,13 +2194,14 @@
           <w:i w:val="0"/>
           <w:sz w:val="24"/>
         </w:rPr>
-        <w:t>Este artigo apresentou a versão atual do EduTech Vision, uma aplicação funcional de PDI em tempo real para monitoramento aproximado de atenção visual, postura e engajamento agregado. A arquitetura atual combina YuNet, MediaPipe Face Landmarker em recortes ampliados, EAR, MAR, solvePnP, suavização temporal e relatórios de sessão. O benchmark smoke mostra que o perfil enhanced supera o baseline MediaPipe em recall e F1 nos dois modos, enquanto a auditoria HQ indica desempenho aceitável para contagem agregada em vídeos mais pesados.</w:t>
+        <w:t>Brasil (2018). Lei nº 13.709, de 14 de agosto de 2018. Lei Geral de Proteção de Dados Pessoais (LGPD).</w:t>
       </w:r>
     </w:p>
     <w:p>
       <w:pPr>
-        <w:spacing w:before="120" w:after="0" w:line="240" w:lineRule="auto"/>
-        <w:ind w:firstLine="720"/>
+        <w:spacing w:after="120"/>
+        <w:ind w:firstLine="0"/>
+        <w:jc w:val="both"/>
       </w:pPr>
       <w:r>
         <w:rPr>
@@ -2093,28 +2210,14 @@
           <w:i w:val="0"/>
           <w:sz w:val="24"/>
         </w:rPr>
-        <w:t>As evidências atuais sustentam o sistema como demonstração reprodutível e tecnicamente coerente para a Trilha 3. Ao mesmo tempo, a matriz de confusão disponível é apenas demonstrativa e os cinco protocolos formais devem ser reexecutados com novos registros experimentais finais para uma validação máxima da versão atual. Trabalhos futuros incluem ampliar amostras reais rotuladas, testar diferentes condições de iluminação e distância, melhorar a estabilidade de landmarks em rostos pequenos e refinar a comunicação ética do uso em ambientes educacionais.</w:t>
+        <w:t>Gonzalez, R. C. and Woods, R. E. (2018). Digital Image Processing. 4. ed. Pearson.</w:t>
       </w:r>
     </w:p>
     <w:p>
       <w:pPr>
-        <w:spacing w:before="240" w:after="0"/>
+        <w:spacing w:after="120"/>
         <w:ind w:firstLine="0"/>
-        <w:jc w:val="left"/>
-      </w:pPr>
-      <w:r>
-        <w:rPr>
-          <w:rFonts w:ascii="Times New Roman" w:hAnsi="Times New Roman" w:eastAsia="Times New Roman"/>
-          <w:b/>
-          <w:sz w:val="26"/>
-        </w:rPr>
-        <w:t>Agradecimentos</w:t>
-      </w:r>
-    </w:p>
-    <w:p>
-      <w:pPr>
-        <w:spacing w:before="120" w:after="0" w:line="240" w:lineRule="auto"/>
-        <w:ind w:firstLine="0"/>
+        <w:jc w:val="both"/>
       </w:pPr>
       <w:r>
         <w:rPr>
@@ -2123,28 +2226,14 @@
           <w:i w:val="0"/>
           <w:sz w:val="24"/>
         </w:rPr>
-        <w:t>Os autores agradecem ao curso de Bacharelado em Ciência da Computação da UNEMAT e ao docente da disciplina de Processamento Digital de Imagens pelas diretrizes do projeto. Ferramentas de IA generativa foram utilizadas pontualmente como apoio à revisão gramatical e à organização textual; o conteúdo técnico, a interpretação dos resultados e a responsabilidade final permanecem dos autores.</w:t>
+        <w:t>Lepetit, V., Moreno-Noguer, F. and Fua, P. (2009). EPnP: An Accurate O(n) Solution to the PnP Problem. International Journal of Computer Vision, 81(2):155-166.</w:t>
       </w:r>
     </w:p>
     <w:p>
       <w:pPr>
-        <w:spacing w:before="240" w:after="0"/>
+        <w:spacing w:after="120"/>
         <w:ind w:firstLine="0"/>
-        <w:jc w:val="left"/>
-      </w:pPr>
-      <w:r>
-        <w:rPr>
-          <w:rFonts w:ascii="Times New Roman" w:hAnsi="Times New Roman" w:eastAsia="Times New Roman"/>
-          <w:b/>
-          <w:sz w:val="26"/>
-        </w:rPr>
-        <w:t>Referências</w:t>
-      </w:r>
-    </w:p>
-    <w:p>
-      <w:pPr>
-        <w:spacing w:before="120" w:after="0" w:line="240" w:lineRule="auto"/>
-        <w:ind w:left="283" w:hanging="283"/>
+        <w:jc w:val="both"/>
       </w:pPr>
       <w:r>
         <w:rPr>
@@ -2153,13 +2242,14 @@
           <w:i w:val="0"/>
           <w:sz w:val="24"/>
         </w:rPr>
-        <w:t>Brasil (2018). Lei nº 13.709, de 14 de agosto de 2018. Lei Geral de Proteção de Dados Pessoais.</w:t>
+        <w:t>Lugaresi, C. et al. (2019). MediaPipe: A Framework for Building Perception Pipelines. arXiv:1906.08172.</w:t>
       </w:r>
     </w:p>
     <w:p>
       <w:pPr>
-        <w:spacing w:before="120" w:after="0" w:line="240" w:lineRule="auto"/>
-        <w:ind w:left="283" w:hanging="283"/>
+        <w:spacing w:after="120"/>
+        <w:ind w:firstLine="0"/>
+        <w:jc w:val="both"/>
       </w:pPr>
       <w:r>
         <w:rPr>
@@ -2168,13 +2258,14 @@
           <w:i w:val="0"/>
           <w:sz w:val="24"/>
         </w:rPr>
-        <w:t>Gonzalez, R. C. and Woods, R. E. (2018). Processamento Digital de Imagens. 4. ed. Pearson.</w:t>
+        <w:t>OpenCV Zoo (2026). YuNet Face Detection Model. Disponível em: https://github.com/opencv/opencv_zoo.</w:t>
       </w:r>
     </w:p>
     <w:p>
       <w:pPr>
-        <w:spacing w:before="120" w:after="0" w:line="240" w:lineRule="auto"/>
-        <w:ind w:left="283" w:hanging="283"/>
+        <w:spacing w:after="120"/>
+        <w:ind w:firstLine="0"/>
+        <w:jc w:val="both"/>
       </w:pPr>
       <w:r>
         <w:rPr>
@@ -2183,43 +2274,14 @@
           <w:i w:val="0"/>
           <w:sz w:val="24"/>
         </w:rPr>
-        <w:t>Google (2026). MediaPipe Face Landmarker. Disponível em: https://developers.google.com/mediapipe. Acesso em: 2026.</w:t>
+        <w:t>Soukupova, T. and Cech, J. (2016). Real-Time Eye Blink Detection using Facial Landmarks. 21st Computer Vision Winter Workshop.</w:t>
       </w:r>
     </w:p>
     <w:p>
       <w:pPr>
-        <w:spacing w:before="120" w:after="0" w:line="240" w:lineRule="auto"/>
-        <w:ind w:left="283" w:hanging="283"/>
-      </w:pPr>
-      <w:r>
-        <w:rPr>
-          <w:rFonts w:ascii="Times New Roman" w:hAnsi="Times New Roman" w:eastAsia="Times New Roman"/>
-          <w:b w:val="0"/>
-          <w:i w:val="0"/>
-          <w:sz w:val="24"/>
-        </w:rPr>
-        <w:t>OpenCV (2026). OpenCV Documentation. Disponível em: https://docs.opencv.org. Acesso em: 2026.</w:t>
-      </w:r>
-    </w:p>
-    <w:p>
-      <w:pPr>
-        <w:spacing w:before="120" w:after="0" w:line="240" w:lineRule="auto"/>
-        <w:ind w:left="283" w:hanging="283"/>
-      </w:pPr>
-      <w:r>
-        <w:rPr>
-          <w:rFonts w:ascii="Times New Roman" w:hAnsi="Times New Roman" w:eastAsia="Times New Roman"/>
-          <w:b w:val="0"/>
-          <w:i w:val="0"/>
-          <w:sz w:val="24"/>
-        </w:rPr>
-        <w:t>OpenCV Zoo (2026). YuNet Face Detection. Disponível em: https://github.com/opencv/opencv_zoo/tree/main/models/face_detection_yunet. Acesso em: 2026.</w:t>
-      </w:r>
-    </w:p>
-    <w:p>
-      <w:pPr>
-        <w:spacing w:before="120" w:after="0" w:line="240" w:lineRule="auto"/>
-        <w:ind w:left="283" w:hanging="283"/>
+        <w:spacing w:after="120"/>
+        <w:ind w:firstLine="0"/>
+        <w:jc w:val="both"/>
       </w:pPr>
       <w:r>
         <w:rPr>
@@ -2233,8 +2295,9 @@
     </w:p>
     <w:p>
       <w:pPr>
-        <w:spacing w:before="120" w:after="0" w:line="240" w:lineRule="auto"/>
-        <w:ind w:left="283" w:hanging="283"/>
+        <w:spacing w:after="120"/>
+        <w:ind w:firstLine="0"/>
+        <w:jc w:val="both"/>
       </w:pPr>
       <w:r>
         <w:rPr>
@@ -2243,7 +2306,7 @@
           <w:i w:val="0"/>
           <w:sz w:val="24"/>
         </w:rPr>
-        <w:t>Yang, S., Luo, P., Loy, C. C. and Tang, X. (2016). WIDER FACE: A Face Detection Benchmark. In Proceedings of the IEEE Conference on Computer Vision and Pattern Recognition.</w:t>
+        <w:t>Yang, S., Luo, P., Loy, C. C. and Tang, X. (2016). WIDER FACE: A Face Detection Benchmark. Proceedings of CVPR.</w:t>
       </w:r>
     </w:p>
     <w:sectPr>

</xml_diff>

<commit_message>
Fix article pagination in Word
</commit_message>
<xml_diff>
--- a/docs/entrega_professor/artigo_edutech_vision_grupo3.docx
+++ b/docs/entrega_professor/artigo_edutech_vision_grupo3.docx
@@ -1651,6 +1651,11 @@
       </w:r>
     </w:p>
     <w:p>
+      <w:r>
+        <w:br w:type="page"/>
+      </w:r>
+    </w:p>
+    <w:p>
       <w:pPr>
         <w:spacing w:after="140"/>
         <w:jc w:val="center"/>
@@ -2183,128 +2188,128 @@
     </w:p>
     <w:p>
       <w:pPr>
-        <w:spacing w:after="120"/>
+        <w:spacing w:after="80"/>
         <w:ind w:firstLine="0"/>
-        <w:jc w:val="both"/>
+        <w:jc w:val="left"/>
       </w:pPr>
       <w:r>
         <w:rPr>
           <w:rFonts w:ascii="Times New Roman" w:hAnsi="Times New Roman" w:eastAsia="Times New Roman"/>
           <w:b w:val="0"/>
           <w:i w:val="0"/>
-          <w:sz w:val="24"/>
+          <w:sz w:val="22"/>
         </w:rPr>
         <w:t>Brasil (2018). Lei nº 13.709, de 14 de agosto de 2018. Lei Geral de Proteção de Dados Pessoais (LGPD).</w:t>
       </w:r>
     </w:p>
     <w:p>
       <w:pPr>
-        <w:spacing w:after="120"/>
+        <w:spacing w:after="80"/>
         <w:ind w:firstLine="0"/>
-        <w:jc w:val="both"/>
+        <w:jc w:val="left"/>
       </w:pPr>
       <w:r>
         <w:rPr>
           <w:rFonts w:ascii="Times New Roman" w:hAnsi="Times New Roman" w:eastAsia="Times New Roman"/>
           <w:b w:val="0"/>
           <w:i w:val="0"/>
-          <w:sz w:val="24"/>
+          <w:sz w:val="22"/>
         </w:rPr>
         <w:t>Gonzalez, R. C. and Woods, R. E. (2018). Digital Image Processing. 4. ed. Pearson.</w:t>
       </w:r>
     </w:p>
     <w:p>
       <w:pPr>
-        <w:spacing w:after="120"/>
+        <w:spacing w:after="80"/>
         <w:ind w:firstLine="0"/>
-        <w:jc w:val="both"/>
+        <w:jc w:val="left"/>
       </w:pPr>
       <w:r>
         <w:rPr>
           <w:rFonts w:ascii="Times New Roman" w:hAnsi="Times New Roman" w:eastAsia="Times New Roman"/>
           <w:b w:val="0"/>
           <w:i w:val="0"/>
-          <w:sz w:val="24"/>
+          <w:sz w:val="22"/>
         </w:rPr>
         <w:t>Lepetit, V., Moreno-Noguer, F. and Fua, P. (2009). EPnP: An Accurate O(n) Solution to the PnP Problem. International Journal of Computer Vision, 81(2):155-166.</w:t>
       </w:r>
     </w:p>
     <w:p>
       <w:pPr>
-        <w:spacing w:after="120"/>
+        <w:spacing w:after="80"/>
         <w:ind w:firstLine="0"/>
-        <w:jc w:val="both"/>
+        <w:jc w:val="left"/>
       </w:pPr>
       <w:r>
         <w:rPr>
           <w:rFonts w:ascii="Times New Roman" w:hAnsi="Times New Roman" w:eastAsia="Times New Roman"/>
           <w:b w:val="0"/>
           <w:i w:val="0"/>
-          <w:sz w:val="24"/>
+          <w:sz w:val="22"/>
         </w:rPr>
         <w:t>Lugaresi, C. et al. (2019). MediaPipe: A Framework for Building Perception Pipelines. arXiv:1906.08172.</w:t>
       </w:r>
     </w:p>
     <w:p>
       <w:pPr>
-        <w:spacing w:after="120"/>
+        <w:spacing w:after="80"/>
         <w:ind w:firstLine="0"/>
-        <w:jc w:val="both"/>
+        <w:jc w:val="left"/>
       </w:pPr>
       <w:r>
         <w:rPr>
           <w:rFonts w:ascii="Times New Roman" w:hAnsi="Times New Roman" w:eastAsia="Times New Roman"/>
           <w:b w:val="0"/>
           <w:i w:val="0"/>
-          <w:sz w:val="24"/>
+          <w:sz w:val="22"/>
         </w:rPr>
         <w:t>OpenCV Zoo (2026). YuNet Face Detection Model. Disponível em: https://github.com/opencv/opencv_zoo.</w:t>
       </w:r>
     </w:p>
     <w:p>
       <w:pPr>
-        <w:spacing w:after="120"/>
+        <w:spacing w:after="80"/>
         <w:ind w:firstLine="0"/>
-        <w:jc w:val="both"/>
+        <w:jc w:val="left"/>
       </w:pPr>
       <w:r>
         <w:rPr>
           <w:rFonts w:ascii="Times New Roman" w:hAnsi="Times New Roman" w:eastAsia="Times New Roman"/>
           <w:b w:val="0"/>
           <w:i w:val="0"/>
-          <w:sz w:val="24"/>
+          <w:sz w:val="22"/>
         </w:rPr>
         <w:t>Soukupova, T. and Cech, J. (2016). Real-Time Eye Blink Detection using Facial Landmarks. 21st Computer Vision Winter Workshop.</w:t>
       </w:r>
     </w:p>
     <w:p>
       <w:pPr>
-        <w:spacing w:after="120"/>
+        <w:spacing w:after="80"/>
         <w:ind w:firstLine="0"/>
-        <w:jc w:val="both"/>
+        <w:jc w:val="left"/>
       </w:pPr>
       <w:r>
         <w:rPr>
           <w:rFonts w:ascii="Times New Roman" w:hAnsi="Times New Roman" w:eastAsia="Times New Roman"/>
           <w:b w:val="0"/>
           <w:i w:val="0"/>
-          <w:sz w:val="24"/>
+          <w:sz w:val="22"/>
         </w:rPr>
         <w:t>Szeliski, R. (2022). Computer Vision: Algorithms and Applications. 2. ed. Springer.</w:t>
       </w:r>
     </w:p>
     <w:p>
       <w:pPr>
-        <w:spacing w:after="120"/>
+        <w:spacing w:after="80"/>
         <w:ind w:firstLine="0"/>
-        <w:jc w:val="both"/>
+        <w:jc w:val="left"/>
       </w:pPr>
       <w:r>
         <w:rPr>
           <w:rFonts w:ascii="Times New Roman" w:hAnsi="Times New Roman" w:eastAsia="Times New Roman"/>
           <w:b w:val="0"/>
           <w:i w:val="0"/>
-          <w:sz w:val="24"/>
+          <w:sz w:val="22"/>
         </w:rPr>
         <w:t>Yang, S., Luo, P., Loy, C. C. and Tang, X. (2016). WIDER FACE: A Face Detection Benchmark. Proceedings of CVPR.</w:t>
       </w:r>

</xml_diff>

<commit_message>
Rebuild article with SBC LaTeX template
</commit_message>
<xml_diff>
--- a/docs/entrega_professor/artigo_edutech_vision_grupo3.docx
+++ b/docs/entrega_professor/artigo_edutech_vision_grupo3.docx
@@ -4,29 +4,27 @@
   <w:body>
     <w:p>
       <w:pPr>
-        <w:spacing w:after="40"/>
+        <w:spacing w:before="240" w:after="240"/>
         <w:jc w:val="center"/>
       </w:pPr>
       <w:r>
         <w:rPr>
           <w:rFonts w:ascii="Times New Roman" w:hAnsi="Times New Roman" w:eastAsia="Times New Roman"/>
           <w:b/>
-          <w:i w:val="0"/>
           <w:sz w:val="32"/>
         </w:rPr>
-        <w:t>EduTech Vision: Atenção, Postura e Engajamento por Visão Computacional em Tempo Real</w:t>
+        <w:t>EduTech Vision: Monitoramento de Atenção, Postura e Engajamento por Processamento Digital de Imagens</w:t>
       </w:r>
     </w:p>
     <w:p>
       <w:pPr>
-        <w:spacing w:after="40"/>
+        <w:spacing w:after="240"/>
         <w:jc w:val="center"/>
       </w:pPr>
       <w:r>
         <w:rPr>
           <w:rFonts w:ascii="Times New Roman" w:hAnsi="Times New Roman" w:eastAsia="Times New Roman"/>
           <w:b/>
-          <w:i w:val="0"/>
           <w:sz w:val="24"/>
         </w:rPr>
         <w:t>Fernando Cobianchi, Samuel Bernini</w:t>
@@ -34,8 +32,104 @@
     </w:p>
     <w:p>
       <w:pPr>
-        <w:spacing w:after="40"/>
+        <w:spacing w:after="0"/>
         <w:jc w:val="center"/>
+      </w:pPr>
+      <w:r>
+        <w:rPr>
+          <w:rFonts w:ascii="Times New Roman" w:hAnsi="Times New Roman" w:eastAsia="Times New Roman"/>
+          <w:sz w:val="24"/>
+        </w:rPr>
+        <w:t>Bacharelado em Ciência da Computação - Universidade do Estado de Mato Grosso (UNEMAT)</w:t>
+      </w:r>
+    </w:p>
+    <w:p>
+      <w:pPr>
+        <w:spacing w:after="0"/>
+        <w:jc w:val="center"/>
+      </w:pPr>
+      <w:r>
+        <w:rPr>
+          <w:rFonts w:ascii="Times New Roman" w:hAnsi="Times New Roman" w:eastAsia="Times New Roman"/>
+          <w:sz w:val="24"/>
+        </w:rPr>
+        <w:t>Câmpus Universitário de Rondonópolis - Rondonópolis - MT - Brasil</w:t>
+      </w:r>
+    </w:p>
+    <w:p>
+      <w:pPr>
+        <w:spacing w:before="120" w:after="120"/>
+        <w:jc w:val="center"/>
+      </w:pPr>
+      <w:r>
+        <w:rPr>
+          <w:rFonts w:ascii="Courier New" w:hAnsi="Courier New" w:eastAsia="Courier New"/>
+          <w:sz w:val="20"/>
+        </w:rPr>
+        <w:t>{fernando.cobianchi, samuel.bernini}@unemat.br</w:t>
+      </w:r>
+    </w:p>
+    <w:p>
+      <w:pPr>
+        <w:spacing w:before="120" w:after="0" w:line="240" w:lineRule="auto"/>
+        <w:ind w:left="454" w:right="454" w:firstLine="0"/>
+      </w:pPr>
+      <w:r>
+        <w:rPr>
+          <w:rFonts w:ascii="Times New Roman" w:hAnsi="Times New Roman" w:eastAsia="Times New Roman"/>
+          <w:b/>
+          <w:sz w:val="24"/>
+        </w:rPr>
+        <w:t xml:space="preserve">Abstract. </w:t>
+      </w:r>
+      <w:r>
+        <w:rPr>
+          <w:rFonts w:ascii="Times New Roman" w:hAnsi="Times New Roman" w:eastAsia="Times New Roman"/>
+          <w:sz w:val="24"/>
+        </w:rPr>
+        <w:t>EduTech Vision is a real-time digital image processing system for educational demonstrations of attention, posture and audience engagement. The current version has individual and audience modes without student identification. The standard pipeline combines OpenCV YuNet, MediaPipe Face Landmarker on expanded crops, EAR/MAR, solvePnP pose, moving averages and 10 s aggregation. In 960x540 smoke benchmarks, enhanced reached F1=0.712/29.0 FPS in individual mode and F1=0.583/74.5 FPS in audience mode. In a 1080p audience audit, it obtained 5/11 exact counts, 10/11 within one face and mean error 0.636. The system is a PDI demonstration, not a pedagogical or clinical diagnostic tool.</w:t>
+      </w:r>
+    </w:p>
+    <w:p>
+      <w:pPr>
+        <w:spacing w:before="120" w:after="0" w:line="240" w:lineRule="auto"/>
+        <w:ind w:left="454" w:right="454" w:firstLine="0"/>
+      </w:pPr>
+      <w:r>
+        <w:rPr>
+          <w:rFonts w:ascii="Times New Roman" w:hAnsi="Times New Roman" w:eastAsia="Times New Roman"/>
+          <w:b/>
+          <w:sz w:val="24"/>
+        </w:rPr>
+        <w:t xml:space="preserve">Resumo. </w:t>
+      </w:r>
+      <w:r>
+        <w:rPr>
+          <w:rFonts w:ascii="Times New Roman" w:hAnsi="Times New Roman" w:eastAsia="Times New Roman"/>
+          <w:sz w:val="24"/>
+        </w:rPr>
+        <w:t>O EduTech Vision é um sistema de PDI em tempo real para demonstrações educacionais de atenção visual, postura e engajamento. A versão atual opera em modos individual e plateia, sem identificação de estudantes. O pipeline padrão combina OpenCV YuNet, MediaPipe Face Landmarker em recortes ampliados, EAR/MAR, pose por solvePnP, médias móveis e agregação de 10 s. Em benchmarks smoke a 960x540, enhanced alcançou F1=0,712/29,0 FPS no modo individual e F1=0,583/74,5 FPS no modo plateia. Em auditoria 1080p de plateia, obteve 5/11 acertos exatos, 10/11 casos com erro de no máximo um rosto e erro médio 0,636. O sistema é demonstração de PDI, não avaliação pedagógica ou diagnóstico clínico.</w:t>
+      </w:r>
+    </w:p>
+    <w:p>
+      <w:pPr>
+        <w:spacing w:before="240" w:after="0"/>
+        <w:ind w:firstLine="0"/>
+        <w:jc w:val="left"/>
+      </w:pPr>
+      <w:r>
+        <w:rPr>
+          <w:rFonts w:ascii="Times New Roman" w:hAnsi="Times New Roman" w:eastAsia="Times New Roman"/>
+          <w:b/>
+          <w:sz w:val="26"/>
+        </w:rPr>
+        <w:t>1. Introdução</w:t>
+      </w:r>
+    </w:p>
+    <w:p>
+      <w:pPr>
+        <w:spacing w:before="120" w:after="0" w:line="240" w:lineRule="auto"/>
+        <w:ind w:firstLine="0"/>
       </w:pPr>
       <w:r>
         <w:rPr>
@@ -44,13 +138,13 @@
           <w:i w:val="0"/>
           <w:sz w:val="24"/>
         </w:rPr>
-        <w:t>Bacharelado em Ciência da Computação -- Universidade do Estado de Mato Grosso (UNEMAT)</w:t>
+        <w:t>A observação de atenção, postura e engajamento em ambientes educacionais costuma depender da percepção do professor ou do próprio estudante. Essa percepção é útil, mas é subjetiva, descontínua e difícil de registrar de forma reprodutível. Em projetos de Processamento Digital de Imagens (PDI), sinais visuais como abertura dos olhos, abertura da boca, orientação da cabeça e presença de faces podem ser utilizados para demonstrar como medidas geométricas e temporais transformam imagens em indicadores aproximados.</w:t>
       </w:r>
     </w:p>
     <w:p>
       <w:pPr>
-        <w:spacing w:after="40"/>
-        <w:jc w:val="center"/>
+        <w:spacing w:before="120" w:after="0" w:line="240" w:lineRule="auto"/>
+        <w:ind w:firstLine="720"/>
       </w:pPr>
       <w:r>
         <w:rPr>
@@ -59,13 +153,13 @@
           <w:i w:val="0"/>
           <w:sz w:val="24"/>
         </w:rPr>
-        <w:t>Campus Universitário de Rondonópolis -- Rondonópolis -- MT -- Brasil</w:t>
+        <w:t>Neste contexto, o EduTech Vision foi desenvolvido como produto acadêmico da Trilha 3: Atenção, Postura e Engajamento. O sistema possui dois cenários complementares: no modo individual, uma câmera frontal acompanha uma pessoa e estima fadiga, bocejo, queda postural e desatenção sustentada; no modo plateia, uma câmera voltada a um grupo calcula métricas agregadas de faces voltadas ao palco ou professor. O modo plateia não identifica alunos e não produz decisões individualizadas.</w:t>
       </w:r>
     </w:p>
     <w:p>
       <w:pPr>
-        <w:spacing w:after="40"/>
-        <w:jc w:val="center"/>
+        <w:spacing w:before="120" w:after="0" w:line="240" w:lineRule="auto"/>
+        <w:ind w:firstLine="720"/>
       </w:pPr>
       <w:r>
         <w:rPr>
@@ -74,80 +168,28 @@
           <w:i w:val="0"/>
           <w:sz w:val="24"/>
         </w:rPr>
-        <w:t>{fernando.cobianchi, samuel.bernini}@unemat.br</w:t>
+        <w:t>O objetivo deste artigo é apresentar a versão atual do sistema com linguagem científica e evidências compatíveis com os resultados atuais disponíveis. O trabalho não afirma medir aprendizagem, rendimento escolar ou estado clínico. Os indicadores gerados são aproximações visuais para fins de demonstração acadêmica de PDI em tempo real.</w:t>
       </w:r>
     </w:p>
     <w:p>
       <w:pPr>
-        <w:spacing w:after="160"/>
-        <w:ind w:left="454" w:right="454" w:firstLine="0"/>
-        <w:jc w:val="both"/>
-      </w:pPr>
-      <w:r>
-        <w:rPr>
-          <w:rFonts w:ascii="Times New Roman" w:hAnsi="Times New Roman" w:eastAsia="Times New Roman"/>
-          <w:b w:val="0"/>
-          <w:i/>
-          <w:sz w:val="24"/>
-        </w:rPr>
-        <w:t xml:space="preserve">Abstract. </w:t>
-      </w:r>
-      <w:r>
-        <w:rPr>
-          <w:rFonts w:ascii="Times New Roman" w:hAnsi="Times New Roman" w:eastAsia="Times New Roman"/>
-          <w:b w:val="0"/>
-          <w:i/>
-          <w:sz w:val="24"/>
-        </w:rPr>
-        <w:t>EduTech Vision is a real-time digital image processing system for educational demonstrations of visual attention, posture and audience engagement. The standard pipeline combines OpenCV YuNet face detection, expanded face crops, MediaPipe Face Landmarker, EAR/MAR geometric metrics, solvePnP head pose, moving averages and temporal state machines. In a reproducible smoke benchmark at 960x540, the enhanced profile improved face recall from 0.193 to 0.592 in individual mode and from 0.011 to 0.443 in audience mode, with F1 of 0.712 and 0.583. A specific individual-mode audit processed 15,193 full-video frames and obtained 86.6% valid face/metric frames and 82.5% frontal frames. The system is a computer vision demonstration, not a clinical or pedagogical diagnostic tool.</w:t>
-      </w:r>
-    </w:p>
-    <w:p>
-      <w:pPr>
-        <w:spacing w:after="160"/>
-        <w:ind w:left="454" w:right="454" w:firstLine="0"/>
-        <w:jc w:val="both"/>
-      </w:pPr>
-      <w:r>
-        <w:rPr>
-          <w:rFonts w:ascii="Times New Roman" w:hAnsi="Times New Roman" w:eastAsia="Times New Roman"/>
-          <w:b w:val="0"/>
-          <w:i/>
-          <w:sz w:val="24"/>
-        </w:rPr>
-        <w:t xml:space="preserve">Resumo. </w:t>
-      </w:r>
-      <w:r>
-        <w:rPr>
-          <w:rFonts w:ascii="Times New Roman" w:hAnsi="Times New Roman" w:eastAsia="Times New Roman"/>
-          <w:b w:val="0"/>
-          <w:i/>
-          <w:sz w:val="24"/>
-        </w:rPr>
-        <w:t>Este artigo apresenta o EduTech Vision, um sistema de processamento digital de imagens em tempo real para demonstrações educacionais de atenção visual, postura e engajamento de plateia. O pipeline padrão combina detecção facial OpenCV YuNet, recortes faciais ampliados, MediaPipe Face Landmarker, métricas geométricas EAR/MAR, pose de cabeça por solvePnP, médias móveis e máquinas de estados temporais. Em benchmark smoke reprodutível a 960x540, o perfil enhanced elevou o recall de face de 0,193 para 0,592 no modo individual e de 0,011 para 0,443 no modo plateia, com F1 de 0,712 e 0,583. Uma auditoria específica do modo individual processou 15.193 frames de vídeos completos e obteve 86,6% de frames com face/métricas válidas e 82,5% de frames frontais. O sistema é uma demonstração de visão computacional, não uma ferramenta diagnóstica clínica ou pedagógica.</w:t>
-      </w:r>
-    </w:p>
-    <w:p>
-      <w:pPr>
-        <w:keepNext/>
-        <w:spacing w:before="200" w:after="120"/>
+        <w:spacing w:before="240" w:after="0"/>
+        <w:ind w:firstLine="0"/>
         <w:jc w:val="left"/>
       </w:pPr>
       <w:r>
         <w:rPr>
           <w:rFonts w:ascii="Times New Roman" w:hAnsi="Times New Roman" w:eastAsia="Times New Roman"/>
           <w:b/>
-          <w:i w:val="0"/>
           <w:sz w:val="26"/>
         </w:rPr>
-        <w:t>Introdução</w:t>
+        <w:t>2. Fundamentação</w:t>
       </w:r>
     </w:p>
     <w:p>
       <w:pPr>
-        <w:spacing w:after="120"/>
-        <w:ind w:firstLine="0"/>
-        <w:jc w:val="both"/>
+        <w:spacing w:before="120" w:after="0" w:line="240" w:lineRule="auto"/>
+        <w:ind w:firstLine="720"/>
       </w:pPr>
       <w:r>
         <w:rPr>
@@ -156,14 +198,13 @@
           <w:i w:val="0"/>
           <w:sz w:val="24"/>
         </w:rPr>
-        <w:t>A observação de atenção, postura e engajamento em contextos educacionais costuma depender da percepção subjetiva do professor ou do próprio estudante. Essa percepção pode ser pedagogicamente útil, mas é descontínua, difícil de registrar e pouco reprodutível. Em Processamento Digital de Imagens (PDI), sinais visuais como abertura dos olhos, abertura da boca, orientação da cabeça e quantidade de faces no quadro permitem demonstrar como imagens podem ser transformadas em indicadores geométricos e temporais.</w:t>
+        <w:t>PDI e visão computacional combinam aquisição, pré-processamento, extração de características e tomada de decisão para interpretar padrões visuais [Gonzalez and Woods 2018, Szeliski 2022]. Em aplicações com faces, detectores localizam regiões de interesse, enquanto modelos de landmarks estimam pontos anatômicos que permitem calcular medidas geométricas. O uso de detectores pré-treinados como front-end é adequado quando o processamento posterior explicita o núcleo de PDI, como ocorre com razões geométricas, estimativa de pose e suavização temporal.</w:t>
       </w:r>
     </w:p>
     <w:p>
       <w:pPr>
-        <w:spacing w:after="120"/>
+        <w:spacing w:before="120" w:after="0" w:line="240" w:lineRule="auto"/>
         <w:ind w:firstLine="720"/>
-        <w:jc w:val="both"/>
       </w:pPr>
       <w:r>
         <w:rPr>
@@ -172,14 +213,13 @@
           <w:i w:val="0"/>
           <w:sz w:val="24"/>
         </w:rPr>
-        <w:t>O EduTech Vision foi desenvolvido na Trilha 3 da disciplina de PDI com dois cenários complementares. No modo individual, uma câmera frontal acompanha uma pessoa e estima fadiga ocular, bocejo, queda postural e desatenção sustentada. No modo plateia, uma câmera voltada a um grupo estima, de forma agregada, a proporção de faces com pose orientada ao palco ou professor. O sistema não realiza reconhecimento de identidade e não mede aprendizagem.</w:t>
+        <w:t>No modo individual, a razão de aspecto dos olhos, ou Eye Aspect Ratio (EAR), é calculada pela razão entre distâncias verticais e horizontais de pontos das pálpebras. Reduções sustentadas do EAR indicam olhos fechados por mais tempo que uma piscada comum. De modo análogo, a Mouth Aspect Ratio (MAR) relaciona abertura vertical e largura da boca, permitindo sinalizar bocejo quando o valor permanece elevado. Essas métricas são sensíveis a escala, pose, iluminação e qualidade dos landmarks; por isso são suavizadas antes da decisão.</w:t>
       </w:r>
     </w:p>
     <w:p>
       <w:pPr>
-        <w:spacing w:after="120"/>
+        <w:spacing w:before="120" w:after="0" w:line="240" w:lineRule="auto"/>
         <w:ind w:firstLine="720"/>
-        <w:jc w:val="both"/>
       </w:pPr>
       <w:r>
         <w:rPr>
@@ -188,30 +228,28 @@
           <w:i w:val="0"/>
           <w:sz w:val="24"/>
         </w:rPr>
-        <w:t>O objetivo deste artigo é apresentar a versão final do produto, sua fundamentação técnica, o pipeline de processamento, a metodologia experimental e os resultados quantitativos disponíveis. A escrita prioriza evidências numéricas e limitações, pois os indicadores gerados são aproximações visuais para demonstração acadêmica de PDI em tempo real.</w:t>
+        <w:t>A postura e o foco visual aproximado são estimados por pose de cabeça. O sistema usa correspondências 2D-3D de pontos faciais e a função solvePnP para obter yaw, pitch e roll. No modo plateia, yaw e pitch são comparados a um eixo de referência calibrado no início da sessão. A decisão final é agregada em janela temporal, pois quadros isolados podem conter ruído, oclusões ou landmarks incompletos.</w:t>
       </w:r>
     </w:p>
     <w:p>
       <w:pPr>
-        <w:keepNext/>
-        <w:spacing w:before="200" w:after="120"/>
+        <w:spacing w:before="240" w:after="0"/>
+        <w:ind w:firstLine="0"/>
         <w:jc w:val="left"/>
       </w:pPr>
       <w:r>
         <w:rPr>
           <w:rFonts w:ascii="Times New Roman" w:hAnsi="Times New Roman" w:eastAsia="Times New Roman"/>
           <w:b/>
-          <w:i w:val="0"/>
           <w:sz w:val="26"/>
         </w:rPr>
-        <w:t>Fundamentação Teórica</w:t>
+        <w:t>3. Sistema Proposto</w:t>
       </w:r>
     </w:p>
     <w:p>
       <w:pPr>
-        <w:spacing w:after="120"/>
-        <w:ind w:firstLine="0"/>
-        <w:jc w:val="both"/>
+        <w:spacing w:before="120" w:after="0" w:line="240" w:lineRule="auto"/>
+        <w:ind w:firstLine="720"/>
       </w:pPr>
       <w:r>
         <w:rPr>
@@ -220,142 +258,18 @@
           <w:i w:val="0"/>
           <w:sz w:val="24"/>
         </w:rPr>
-        <w:t>PDI e visão computacional organizam etapas de aquisição, pré-processamento, segmentação, extração de características e interpretação visual [Gonzalez and Woods 2018, Szeliski 2022]. Em aplicações com faces, detectores localizam regiões de interesse, enquanto modelos de landmarks estimam pontos faciais que permitem calcular métricas geométricas e pose.</w:t>
+        <w:t>A Figura 1 sintetiza o pipeline atual. A entrada pode ser câmera ou vídeo, processada em resolução padrão de 960x540. O perfil padrão é enhanced: OpenCV YuNet detecta faces, aplica supressão de não máximos e prioriza candidatos; em seguida, cada região é recortada com margem ampliada e enviada ao MediaPipe Face Landmarker. O perfil mediapipe é mantido como baseline, enquanto o perfil research, baseado em SCRFD, é apenas comparativo acadêmico e não constitui o padrão de distribuição.</w:t>
       </w:r>
     </w:p>
     <w:p>
       <w:pPr>
-        <w:spacing w:after="120"/>
-        <w:ind w:firstLine="720"/>
-        <w:jc w:val="both"/>
+        <w:spacing w:before="120" w:after="0"/>
+        <w:jc w:val="center"/>
       </w:pPr>
-      <w:r>
-        <w:rPr>
-          <w:rFonts w:ascii="Times New Roman" w:hAnsi="Times New Roman" w:eastAsia="Times New Roman"/>
-          <w:b w:val="0"/>
-          <w:i w:val="0"/>
-          <w:sz w:val="24"/>
-        </w:rPr>
-        <w:t>No modo individual, o Eye Aspect Ratio (EAR) é calculado pela razão entre distâncias verticais e horizontais de landmarks dos olhos, seguindo a ideia de detecção de piscadas por geometria facial [Soukupova and Cech 2016]. Quando os olhos fecham, as distâncias verticais diminuem e o EAR cai. A Mouth Aspect Ratio (MAR) usa princípio semelhante para representar abertura da boca e sinalizar bocejos sustentados.</w:t>
-      </w:r>
-    </w:p>
-    <w:p>
-      <w:pPr>
-        <w:spacing w:after="120"/>
-        <w:ind w:firstLine="720"/>
-        <w:jc w:val="both"/>
-      </w:pPr>
-      <w:r>
-        <w:rPr>
-          <w:rFonts w:ascii="Times New Roman" w:hAnsi="Times New Roman" w:eastAsia="Times New Roman"/>
-          <w:b w:val="0"/>
-          <w:i w:val="0"/>
-          <w:sz w:val="24"/>
-        </w:rPr>
-        <w:t>A orientação da cabeça é estimada por correspondências 2D-3D e pela família de algoritmos solvePnP [Lepetit et al. 2009]. A partir de landmarks como nariz, queixo, cantos dos olhos e boca, o sistema estima yaw, pitch e roll. Esses ângulos são suavizados no tempo porque frames isolados podem conter ruído de landmark, oclusão ou blur de movimento.</w:t>
-      </w:r>
-    </w:p>
-    <w:p>
-      <w:pPr>
-        <w:spacing w:after="120"/>
-        <w:ind w:firstLine="720"/>
-        <w:jc w:val="both"/>
-      </w:pPr>
-      <w:r>
-        <w:rPr>
-          <w:rFonts w:ascii="Times New Roman" w:hAnsi="Times New Roman" w:eastAsia="Times New Roman"/>
-          <w:b w:val="0"/>
-          <w:i w:val="0"/>
-          <w:sz w:val="24"/>
-        </w:rPr>
-        <w:t>A detecção inicial de faces foi avaliada contra o uso direto de MediaPipe no quadro completo [Lugaresi et al. 2019]. O benchmark WIDER FACE [Yang et al. 2016] foi usado como base anotada para medir recall, precisão e F1 em diferentes tamanhos de face, distâncias e perturbações sintéticas.</w:t>
-      </w:r>
-    </w:p>
-    <w:p>
-      <w:pPr>
-        <w:keepNext/>
-        <w:spacing w:before="200" w:after="120"/>
-        <w:jc w:val="left"/>
-      </w:pPr>
-      <w:r>
-        <w:rPr>
-          <w:rFonts w:ascii="Times New Roman" w:hAnsi="Times New Roman" w:eastAsia="Times New Roman"/>
-          <w:b/>
-          <w:i w:val="0"/>
-          <w:sz w:val="26"/>
-        </w:rPr>
-        <w:t>Metodologia e Pipeline</w:t>
-      </w:r>
-    </w:p>
-    <w:p>
-      <w:pPr>
-        <w:spacing w:after="120"/>
-        <w:ind w:firstLine="0"/>
-        <w:jc w:val="both"/>
-      </w:pPr>
-      <w:r>
-        <w:rPr>
-          <w:rFonts w:ascii="Times New Roman" w:hAnsi="Times New Roman" w:eastAsia="Times New Roman"/>
-          <w:b w:val="0"/>
-          <w:i w:val="0"/>
-          <w:sz w:val="24"/>
-        </w:rPr>
-        <w:t>A Figura 1 resume o pipeline operacional. A entrada é uma webcam ou arquivo de vídeo redimensionado para 960x540 no modo padrão. O perfil enhanced aplica OpenCV YuNet para localizar faces, usa supressão de não máximos e recortes ampliados, e então executa MediaPipe Face Landmarker em cada região de interesse. Essa escolha preserva o MediaPipe para landmarks e desloca o gargalo de faces pequenas para um detector frontal mais adequado.</w:t>
-      </w:r>
-    </w:p>
-    <w:p>
-      <w:pPr>
-        <w:spacing w:after="120"/>
-        <w:ind w:firstLine="720"/>
-        <w:jc w:val="both"/>
-      </w:pPr>
-      <w:r>
-        <w:rPr>
-          <w:rFonts w:ascii="Times New Roman" w:hAnsi="Times New Roman" w:eastAsia="Times New Roman"/>
-          <w:b w:val="0"/>
-          <w:i w:val="0"/>
-          <w:sz w:val="24"/>
-        </w:rPr>
-        <w:t>Três perfis foram mantidos para comparação metodológica. O perfil mediapipe é o baseline, com processamento direto do quadro. O perfil enhanced é o padrão distribuível, combinando YuNet e landmarks em crops. O perfil research usa SCRFD/InsightFace apenas como comparativo acadêmico opcional; o padrão de entrega é o perfil enhanced.</w:t>
-      </w:r>
-    </w:p>
-    <w:p>
-      <w:pPr>
-        <w:spacing w:after="120"/>
-        <w:ind w:firstLine="720"/>
-        <w:jc w:val="both"/>
-      </w:pPr>
-      <w:r>
-        <w:rPr>
-          <w:rFonts w:ascii="Times New Roman" w:hAnsi="Times New Roman" w:eastAsia="Times New Roman"/>
-          <w:b w:val="0"/>
-          <w:i w:val="0"/>
-          <w:sz w:val="24"/>
-        </w:rPr>
-        <w:t>No modo individual, o sistema usa no máximo uma face e confiança facial 0,70. A calibração dura 5 s a partir da primeira amostra facial válida, evitando baseline vazio quando a câmera ou vídeo inicia sem rosto. O baseline armazena medianas e desvios robustos de EAR, MAR, yaw e pitch. Para yaw/pitch, a estatística é circular: valores próximos de +179 e -179 graus são tratados como orientações equivalentes, não como extremos opostos.</w:t>
-      </w:r>
-    </w:p>
-    <w:p>
-      <w:pPr>
-        <w:spacing w:after="120"/>
-        <w:ind w:firstLine="720"/>
-        <w:jc w:val="both"/>
-      </w:pPr>
-      <w:r>
-        <w:rPr>
-          <w:rFonts w:ascii="Times New Roman" w:hAnsi="Times New Roman" w:eastAsia="Times New Roman"/>
-          <w:b w:val="0"/>
-          <w:i w:val="0"/>
-          <w:sz w:val="24"/>
-        </w:rPr>
-        <w:t>Os alertas usam médias móveis e condições sustentadas. Fadiga ocular exige EAR médio abaixo do limiar dinâmico e queda simultânea dos dois olhos; bocejo exige MAR acima do limiar; postura usa desvio de pitch; e desatenção usa desvio de yaw. No modo plateia, cada face com pose válida é comparada a um eixo de palco calibrado, e os resultados são agregados em janelas de 10 s.</w:t>
-      </w:r>
-    </w:p>
-    <w:p>
       <w:r>
         <w:drawing>
           <wp:inline xmlns:a="http://schemas.openxmlformats.org/drawingml/2006/main" xmlns:pic="http://schemas.openxmlformats.org/drawingml/2006/picture">
-            <wp:extent cx="5220000" cy="1222617"/>
+            <wp:extent cx="5220000" cy="1624000"/>
             <wp:docPr id="1" name="Picture 1"/>
             <wp:cNvGraphicFramePr>
               <a:graphicFrameLocks noChangeAspect="1"/>
@@ -364,7 +278,7 @@
               <a:graphicData uri="http://schemas.openxmlformats.org/drawingml/2006/picture">
                 <pic:pic>
                   <pic:nvPicPr>
-                    <pic:cNvPr id="0" name="pipeline_generated.png"/>
+                    <pic:cNvPr id="0" name="pipeline_edutech_vision.png"/>
                     <pic:cNvPicPr/>
                   </pic:nvPicPr>
                   <pic:blipFill>
@@ -376,7 +290,7 @@
                   <pic:spPr>
                     <a:xfrm>
                       <a:off x="0" y="0"/>
-                      <a:ext cx="5220000" cy="1222617"/>
+                      <a:ext cx="5220000" cy="1624000"/>
                     </a:xfrm>
                     <a:prstGeom prst="rect"/>
                   </pic:spPr>
@@ -389,14 +303,14 @@
     </w:p>
     <w:p>
       <w:pPr>
-        <w:spacing w:after="140"/>
+        <w:spacing w:before="120" w:after="120" w:line="240" w:lineRule="auto"/>
+        <w:ind w:firstLine="0"/>
         <w:jc w:val="center"/>
       </w:pPr>
       <w:r>
         <w:rPr>
-          <w:rFonts w:ascii="Times New Roman" w:hAnsi="Times New Roman" w:eastAsia="Times New Roman"/>
+          <w:rFonts w:ascii="Arial" w:hAnsi="Arial" w:eastAsia="Arial"/>
           <w:b/>
-          <w:i w:val="0"/>
           <w:sz w:val="20"/>
         </w:rPr>
         <w:t>Figura 1. Pipeline atual do EduTech Vision.</w:t>
@@ -404,25 +318,8 @@
     </w:p>
     <w:p>
       <w:pPr>
-        <w:keepNext/>
-        <w:spacing w:before="200" w:after="120"/>
-        <w:jc w:val="left"/>
-      </w:pPr>
-      <w:r>
-        <w:rPr>
-          <w:rFonts w:ascii="Times New Roman" w:hAnsi="Times New Roman" w:eastAsia="Times New Roman"/>
-          <w:b/>
-          <w:i w:val="0"/>
-          <w:sz w:val="26"/>
-        </w:rPr>
-        <w:t>Metodologia Experimental</w:t>
-      </w:r>
-    </w:p>
-    <w:p>
-      <w:pPr>
-        <w:spacing w:after="120"/>
-        <w:ind w:firstLine="0"/>
-        <w:jc w:val="both"/>
+        <w:spacing w:before="120" w:after="0" w:line="240" w:lineRule="auto"/>
+        <w:ind w:firstLine="720"/>
       </w:pPr>
       <w:r>
         <w:rPr>
@@ -431,14 +328,13 @@
           <w:i w:val="0"/>
           <w:sz w:val="24"/>
         </w:rPr>
-        <w:t>A avaliação foi organizada em quatro frentes. A primeira foi um benchmark smoke do detector, comparando o baseline mediapipe e o perfil enhanced nos modos individual e plateia. As métricas foram recall de face, recall de landmarks, precisão, F1, FPS médio e FPS mínimo. O recall de face mede caixas detectadas; o recall de landmarks exige também pontos suficientes para EAR, MAR ou pose.</w:t>
+        <w:t>No modo individual, a configuração atual usa confiança facial 0,70 e no máximo uma face. A primeira etapa de uso realiza calibração de 5 s para estabelecer referências de EAR, MAR, yaw e pitch. Em seguida, as medidas passam por média móvel de janela 7 e por condições sustentadas, evitando que piscadas ou movimentos pontuais acionem alertas. Os alertas visuais indicam fadiga, bocejo, postura ruim e desatenção, sem atribuir diagnóstico clínico.</w:t>
       </w:r>
     </w:p>
     <w:p>
       <w:pPr>
-        <w:spacing w:after="120"/>
+        <w:spacing w:before="120" w:after="0" w:line="240" w:lineRule="auto"/>
         <w:ind w:firstLine="720"/>
-        <w:jc w:val="both"/>
       </w:pPr>
       <w:r>
         <w:rPr>
@@ -447,14 +343,28 @@
           <w:i w:val="0"/>
           <w:sz w:val="24"/>
         </w:rPr>
-        <w:t>A segunda frente foi uma auditoria específica do modo individual. Foram baixados vídeos frontais 1080p e retratos estáticos por manifesto reprodutível. O auditor processou vídeos completos, sem amostragem por intervalo, redimensionando cada frame para a mesma resolução operacional do app. Cada frame gerou uma linha com detecção, qualidade dos landmarks, EAR, MAR, yaw, pitch, deltas em relação ao baseline e classificação frontal/neutra.</w:t>
+        <w:t>No modo plateia, a configuração atual usa confiança facial 0,60, limite de 24 faces, tolerância de 30 graus em yaw, tolerância de 20 graus em pitch e janela de agregação de 10 s. Faces detectadas sem landmarks confiáveis podem aparecer no painel visual como detecções anônimas, mas não entram no cálculo de pose e engajamento. A saída persistida é agregada, composta por séries temporais e estatísticas da sessão.</w:t>
       </w:r>
     </w:p>
     <w:p>
       <w:pPr>
-        <w:spacing w:after="120"/>
+        <w:spacing w:before="240" w:after="0"/>
+        <w:ind w:firstLine="0"/>
+        <w:jc w:val="left"/>
+      </w:pPr>
+      <w:r>
+        <w:rPr>
+          <w:rFonts w:ascii="Times New Roman" w:hAnsi="Times New Roman" w:eastAsia="Times New Roman"/>
+          <w:b/>
+          <w:sz w:val="26"/>
+        </w:rPr>
+        <w:t>4. Metodologia Experimental</w:t>
+      </w:r>
+    </w:p>
+    <w:p>
+      <w:pPr>
+        <w:spacing w:before="120" w:after="0" w:line="240" w:lineRule="auto"/>
         <w:ind w:firstLine="720"/>
-        <w:jc w:val="both"/>
       </w:pPr>
       <w:r>
         <w:rPr>
@@ -463,14 +373,13 @@
           <w:i w:val="0"/>
           <w:sz w:val="24"/>
         </w:rPr>
-        <w:t>A terceira frente foi a auditoria HQ de plateia. Vídeos 1080p completos foram processados do primeiro ao último frame e quadros selecionados foram comparados a contagens manuais de rostos avaliáveis. Foram medidos acertos exatos, erro de no máximo um rosto, erro absoluto médio, presença da contagem manual em janela temporal de +/-1 s, FPS médio e FPS p10.</w:t>
+        <w:t>A avaliação foi organizada em quatro frentes. A primeira é o benchmark smoke do detector, que compara o baseline MediaPipe em quadro inteiro com o perfil enhanced em dois modos. As métricas são recall de face, recall de landmarks, precisão, F1, FPS médio e FPS mínimo. O recall de face considera uma caixa localizada corretamente; o recall de landmarks é mais restritivo e exige que a face também gere pontos suficientes para EAR, MAR ou pose.</w:t>
       </w:r>
     </w:p>
     <w:p>
       <w:pPr>
-        <w:spacing w:after="120"/>
+        <w:spacing w:before="120" w:after="0" w:line="240" w:lineRule="auto"/>
         <w:ind w:firstLine="720"/>
-        <w:jc w:val="both"/>
       </w:pPr>
       <w:r>
         <w:rPr>
@@ -479,30 +388,13 @@
           <w:i w:val="0"/>
           <w:sz w:val="24"/>
         </w:rPr>
-        <w:t>A quarta frente foi a instrumentação dos protocolos formais: iluminação, oclusão, FPS, matriz de confusão e tolerância a falhas. Na versão atual, apenas a matriz demonstrativa possui resultado consolidado; os demais protocolos estão implementados como scripts de coleta, mas não foram usados como evidência final por falta de nova execução presencial completa. Essa limitação é explicitada para evitar uso indevido de logs preliminares.</w:t>
+        <w:t>A segunda frente é a auditoria HQ de plateia. Nessa avaliação, vídeos 1080p são processados integralmente e quadros selecionados são comparados com contagens manuais de rostos avaliáveis. As métricas são acertos exatos, casos com erro de no máximo um rosto, erro absoluto médio, presença da contagem manual dentro da janela temporal de mais ou menos 1 s, FPS médio e FPS no percentil 10.</w:t>
       </w:r>
     </w:p>
     <w:p>
       <w:pPr>
-        <w:keepNext/>
-        <w:spacing w:before="200" w:after="120"/>
-        <w:jc w:val="left"/>
-      </w:pPr>
-      <w:r>
-        <w:rPr>
-          <w:rFonts w:ascii="Times New Roman" w:hAnsi="Times New Roman" w:eastAsia="Times New Roman"/>
-          <w:b/>
-          <w:i w:val="0"/>
-          <w:sz w:val="26"/>
-        </w:rPr>
-        <w:t>Resultados</w:t>
-      </w:r>
-    </w:p>
-    <w:p>
-      <w:pPr>
-        <w:spacing w:after="120"/>
-        <w:ind w:firstLine="0"/>
-        <w:jc w:val="both"/>
+        <w:spacing w:before="120" w:after="0" w:line="240" w:lineRule="auto"/>
+        <w:ind w:firstLine="720"/>
       </w:pPr>
       <w:r>
         <w:rPr>
@@ -511,50 +403,111 @@
           <w:i w:val="0"/>
           <w:sz w:val="24"/>
         </w:rPr>
-        <w:t>A Tabela 1 apresenta o benchmark smoke canônico da versão atual. Em ambos os modos, o perfil enhanced aumenta substancialmente o recall de face e o F1 em relação ao baseline MediaPipe, mantendo desempenho em tempo real. A redução de FPS é esperada porque o pipeline passa a executar detecção por YuNet, recortes ampliados e landmarks em regiões de interesse.</w:t>
+        <w:t>A terceira frente é o relatório de sessão. Ele demonstra instrumentação da aplicação por meio de logs CSV, gráficos, relatório HTML, relatório PDF, timeline de eventos e telemetria. Esses artefatos são usados para evidenciar capacidade de registro e reprodutibilidade da demonstração, e não como verdade final dos protocolos formais.</w:t>
       </w:r>
     </w:p>
     <w:p>
       <w:pPr>
-        <w:spacing w:after="140"/>
-        <w:jc w:val="center"/>
+        <w:spacing w:before="120" w:after="0" w:line="240" w:lineRule="auto"/>
+        <w:ind w:firstLine="720"/>
+      </w:pPr>
+      <w:r>
+        <w:rPr>
+          <w:rFonts w:ascii="Times New Roman" w:hAnsi="Times New Roman" w:eastAsia="Times New Roman"/>
+          <w:b w:val="0"/>
+          <w:i w:val="0"/>
+          <w:sz w:val="24"/>
+        </w:rPr>
+        <w:t>Por fim, a versão atual contém metodologia e scripts para os cinco protocolos formais do plano da disciplina: robustez luminosa, resiliência a oclusão, telemetria de FPS, matriz de confusão e tolerância a falhas. Entretanto, não foram usados resultados históricos, preliminares ou logs finais antigos como evidência da versão atual. Na ausência de novos registros experimentais finais desses cinco protocolos, eles são tratados neste artigo como metodologia disponível para reexecução. O suporte a reconexão de câmera é descrito apenas como característica de robustez implementada, não como resultado experimental principal.</w:t>
+      </w:r>
+    </w:p>
+    <w:p>
+      <w:pPr>
+        <w:spacing w:before="240" w:after="0"/>
+        <w:ind w:firstLine="0"/>
+        <w:jc w:val="left"/>
       </w:pPr>
       <w:r>
         <w:rPr>
           <w:rFonts w:ascii="Times New Roman" w:hAnsi="Times New Roman" w:eastAsia="Times New Roman"/>
           <w:b/>
+          <w:sz w:val="26"/>
+        </w:rPr>
+        <w:t>5. Resultados</w:t>
+      </w:r>
+    </w:p>
+    <w:p>
+      <w:pPr>
+        <w:spacing w:before="120" w:after="0" w:line="240" w:lineRule="auto"/>
+        <w:ind w:firstLine="0"/>
+      </w:pPr>
+      <w:r>
+        <w:rPr>
+          <w:rFonts w:ascii="Times New Roman" w:hAnsi="Times New Roman" w:eastAsia="Times New Roman"/>
+          <w:b w:val="0"/>
           <w:i w:val="0"/>
+          <w:sz w:val="24"/>
+        </w:rPr>
+        <w:t>A Tabela 1 apresenta o benchmark smoke canônico da versão atual. Em ambos os modos, o perfil enhanced aumenta substancialmente o recall de face e o F1 em relação ao baseline MediaPipe, mantendo desempenho em tempo real. A redução de FPS é esperada, pois o pipeline passa a executar detecção por YuNet, recortes ampliados e landmarks em regiões de interesse, em vez de depender apenas do rastreamento direto no quadro inteiro.</w:t>
+      </w:r>
+    </w:p>
+    <w:p>
+      <w:pPr>
+        <w:spacing w:before="120" w:after="120" w:line="240" w:lineRule="auto"/>
+        <w:ind w:firstLine="0"/>
+        <w:jc w:val="center"/>
+      </w:pPr>
+      <w:r>
+        <w:rPr>
+          <w:rFonts w:ascii="Arial" w:hAnsi="Arial" w:eastAsia="Arial"/>
+          <w:b/>
           <w:sz w:val="20"/>
         </w:rPr>
-        <w:t>Tabela 1. Benchmark smoke do detector em resolução 960x540.</w:t>
+        <w:t>Tabela 1. Benchmark smoke do detector em 960x540.</w:t>
       </w:r>
     </w:p>
     <w:tbl>
       <w:tblPr>
-        <w:tblStyle w:val="TableGrid"/>
         <w:tblW w:type="auto" w:w="0"/>
         <w:jc w:val="center"/>
+        <w:tblLayout w:type="autofit"/>
         <w:tblLook w:firstColumn="1" w:firstRow="1" w:lastColumn="0" w:lastRow="0" w:noHBand="0" w:noVBand="1" w:val="04A0"/>
+        <w:tblBorders>
+          <w:top w:val="single" w:sz="4" w:space="0" w:color="808080"/>
+          <w:left w:val="single" w:sz="4" w:space="0" w:color="808080"/>
+          <w:bottom w:val="single" w:sz="4" w:space="0" w:color="808080"/>
+          <w:right w:val="single" w:sz="4" w:space="0" w:color="808080"/>
+          <w:insideH w:val="single" w:sz="4" w:space="0" w:color="808080"/>
+          <w:insideV w:val="single" w:sz="4" w:space="0" w:color="808080"/>
+        </w:tblBorders>
+        <w:tblCellMar>
+          <w:top w:w="20" w:type="dxa"/>
+          <w:start w:w="35" w:type="dxa"/>
+          <w:bottom w:w="20" w:type="dxa"/>
+          <w:end w:w="35" w:type="dxa"/>
+        </w:tblCellMar>
       </w:tblPr>
       <w:tblGrid>
-        <w:gridCol w:w="1215"/>
-        <w:gridCol w:w="1215"/>
-        <w:gridCol w:w="1215"/>
-        <w:gridCol w:w="1215"/>
-        <w:gridCol w:w="1215"/>
-        <w:gridCol w:w="1215"/>
-        <w:gridCol w:w="1215"/>
+        <w:gridCol w:w="1063"/>
+        <w:gridCol w:w="1063"/>
+        <w:gridCol w:w="1063"/>
+        <w:gridCol w:w="1063"/>
+        <w:gridCol w:w="1063"/>
+        <w:gridCol w:w="1063"/>
+        <w:gridCol w:w="1063"/>
+        <w:gridCol w:w="1063"/>
       </w:tblGrid>
       <w:tr>
         <w:tc>
           <w:tcPr>
-            <w:tcW w:type="dxa" w:w="1215"/>
+            <w:tcW w:type="dxa" w:w="1063"/>
+            <w:vAlign w:val="center"/>
           </w:tcPr>
           <w:p>
             <w:pPr>
+              <w:spacing w:before="0" w:after="0"/>
               <w:jc w:val="center"/>
             </w:pPr>
-            <w:r/>
             <w:r>
               <w:rPr>
                 <w:rFonts w:ascii="Times New Roman" w:hAnsi="Times New Roman" w:eastAsia="Times New Roman"/>
@@ -567,13 +520,14 @@
         </w:tc>
         <w:tc>
           <w:tcPr>
-            <w:tcW w:type="dxa" w:w="1215"/>
+            <w:tcW w:type="dxa" w:w="1063"/>
+            <w:vAlign w:val="center"/>
           </w:tcPr>
           <w:p>
             <w:pPr>
+              <w:spacing w:before="0" w:after="0"/>
               <w:jc w:val="center"/>
             </w:pPr>
-            <w:r/>
             <w:r>
               <w:rPr>
                 <w:rFonts w:ascii="Times New Roman" w:hAnsi="Times New Roman" w:eastAsia="Times New Roman"/>
@@ -586,13 +540,14 @@
         </w:tc>
         <w:tc>
           <w:tcPr>
-            <w:tcW w:type="dxa" w:w="1215"/>
+            <w:tcW w:type="dxa" w:w="1063"/>
+            <w:vAlign w:val="center"/>
           </w:tcPr>
           <w:p>
             <w:pPr>
+              <w:spacing w:before="0" w:after="0"/>
               <w:jc w:val="center"/>
             </w:pPr>
-            <w:r/>
             <w:r>
               <w:rPr>
                 <w:rFonts w:ascii="Times New Roman" w:hAnsi="Times New Roman" w:eastAsia="Times New Roman"/>
@@ -605,13 +560,14 @@
         </w:tc>
         <w:tc>
           <w:tcPr>
-            <w:tcW w:type="dxa" w:w="1215"/>
+            <w:tcW w:type="dxa" w:w="1063"/>
+            <w:vAlign w:val="center"/>
           </w:tcPr>
           <w:p>
             <w:pPr>
+              <w:spacing w:before="0" w:after="0"/>
               <w:jc w:val="center"/>
             </w:pPr>
-            <w:r/>
             <w:r>
               <w:rPr>
                 <w:rFonts w:ascii="Times New Roman" w:hAnsi="Times New Roman" w:eastAsia="Times New Roman"/>
@@ -624,13 +580,14 @@
         </w:tc>
         <w:tc>
           <w:tcPr>
-            <w:tcW w:type="dxa" w:w="1215"/>
+            <w:tcW w:type="dxa" w:w="1063"/>
+            <w:vAlign w:val="center"/>
           </w:tcPr>
           <w:p>
             <w:pPr>
+              <w:spacing w:before="0" w:after="0"/>
               <w:jc w:val="center"/>
             </w:pPr>
-            <w:r/>
             <w:r>
               <w:rPr>
                 <w:rFonts w:ascii="Times New Roman" w:hAnsi="Times New Roman" w:eastAsia="Times New Roman"/>
@@ -643,13 +600,14 @@
         </w:tc>
         <w:tc>
           <w:tcPr>
-            <w:tcW w:type="dxa" w:w="1215"/>
+            <w:tcW w:type="dxa" w:w="1063"/>
+            <w:vAlign w:val="center"/>
           </w:tcPr>
           <w:p>
             <w:pPr>
+              <w:spacing w:before="0" w:after="0"/>
               <w:jc w:val="center"/>
             </w:pPr>
-            <w:r/>
             <w:r>
               <w:rPr>
                 <w:rFonts w:ascii="Times New Roman" w:hAnsi="Times New Roman" w:eastAsia="Times New Roman"/>
@@ -662,13 +620,14 @@
         </w:tc>
         <w:tc>
           <w:tcPr>
-            <w:tcW w:type="dxa" w:w="1215"/>
+            <w:tcW w:type="dxa" w:w="1063"/>
+            <w:vAlign w:val="center"/>
           </w:tcPr>
           <w:p>
             <w:pPr>
+              <w:spacing w:before="0" w:after="0"/>
               <w:jc w:val="center"/>
             </w:pPr>
-            <w:r/>
             <w:r>
               <w:rPr>
                 <w:rFonts w:ascii="Times New Roman" w:hAnsi="Times New Roman" w:eastAsia="Times New Roman"/>
@@ -679,17 +638,38 @@
             </w:r>
           </w:p>
         </w:tc>
+        <w:tc>
+          <w:tcPr>
+            <w:tcW w:type="dxa" w:w="1063"/>
+            <w:vAlign w:val="center"/>
+          </w:tcPr>
+          <w:p>
+            <w:pPr>
+              <w:spacing w:before="0" w:after="0"/>
+              <w:jc w:val="center"/>
+            </w:pPr>
+            <w:r>
+              <w:rPr>
+                <w:rFonts w:ascii="Times New Roman" w:hAnsi="Times New Roman" w:eastAsia="Times New Roman"/>
+                <w:b/>
+                <w:sz w:val="16"/>
+              </w:rPr>
+              <w:t>FPS mín.</w:t>
+            </w:r>
+          </w:p>
+        </w:tc>
       </w:tr>
       <w:tr>
         <w:tc>
           <w:tcPr>
-            <w:tcW w:type="dxa" w:w="1215"/>
+            <w:tcW w:type="dxa" w:w="1063"/>
+            <w:vAlign w:val="center"/>
           </w:tcPr>
           <w:p>
             <w:pPr>
+              <w:spacing w:before="0" w:after="0"/>
               <w:jc w:val="center"/>
             </w:pPr>
-            <w:r/>
             <w:r>
               <w:rPr>
                 <w:rFonts w:ascii="Times New Roman" w:hAnsi="Times New Roman" w:eastAsia="Times New Roman"/>
@@ -702,13 +682,14 @@
         </w:tc>
         <w:tc>
           <w:tcPr>
-            <w:tcW w:type="dxa" w:w="1215"/>
+            <w:tcW w:type="dxa" w:w="1063"/>
+            <w:vAlign w:val="center"/>
           </w:tcPr>
           <w:p>
             <w:pPr>
+              <w:spacing w:before="0" w:after="0"/>
               <w:jc w:val="center"/>
             </w:pPr>
-            <w:r/>
             <w:r>
               <w:rPr>
                 <w:rFonts w:ascii="Times New Roman" w:hAnsi="Times New Roman" w:eastAsia="Times New Roman"/>
@@ -721,13 +702,14 @@
         </w:tc>
         <w:tc>
           <w:tcPr>
-            <w:tcW w:type="dxa" w:w="1215"/>
+            <w:tcW w:type="dxa" w:w="1063"/>
+            <w:vAlign w:val="center"/>
           </w:tcPr>
           <w:p>
             <w:pPr>
+              <w:spacing w:before="0" w:after="0"/>
               <w:jc w:val="center"/>
             </w:pPr>
-            <w:r/>
             <w:r>
               <w:rPr>
                 <w:rFonts w:ascii="Times New Roman" w:hAnsi="Times New Roman" w:eastAsia="Times New Roman"/>
@@ -740,13 +722,14 @@
         </w:tc>
         <w:tc>
           <w:tcPr>
-            <w:tcW w:type="dxa" w:w="1215"/>
+            <w:tcW w:type="dxa" w:w="1063"/>
+            <w:vAlign w:val="center"/>
           </w:tcPr>
           <w:p>
             <w:pPr>
+              <w:spacing w:before="0" w:after="0"/>
               <w:jc w:val="center"/>
             </w:pPr>
-            <w:r/>
             <w:r>
               <w:rPr>
                 <w:rFonts w:ascii="Times New Roman" w:hAnsi="Times New Roman" w:eastAsia="Times New Roman"/>
@@ -759,13 +742,14 @@
         </w:tc>
         <w:tc>
           <w:tcPr>
-            <w:tcW w:type="dxa" w:w="1215"/>
+            <w:tcW w:type="dxa" w:w="1063"/>
+            <w:vAlign w:val="center"/>
           </w:tcPr>
           <w:p>
             <w:pPr>
+              <w:spacing w:before="0" w:after="0"/>
               <w:jc w:val="center"/>
             </w:pPr>
-            <w:r/>
             <w:r>
               <w:rPr>
                 <w:rFonts w:ascii="Times New Roman" w:hAnsi="Times New Roman" w:eastAsia="Times New Roman"/>
@@ -778,13 +762,14 @@
         </w:tc>
         <w:tc>
           <w:tcPr>
-            <w:tcW w:type="dxa" w:w="1215"/>
+            <w:tcW w:type="dxa" w:w="1063"/>
+            <w:vAlign w:val="center"/>
           </w:tcPr>
           <w:p>
             <w:pPr>
+              <w:spacing w:before="0" w:after="0"/>
               <w:jc w:val="center"/>
             </w:pPr>
-            <w:r/>
             <w:r>
               <w:rPr>
                 <w:rFonts w:ascii="Times New Roman" w:hAnsi="Times New Roman" w:eastAsia="Times New Roman"/>
@@ -797,13 +782,14 @@
         </w:tc>
         <w:tc>
           <w:tcPr>
-            <w:tcW w:type="dxa" w:w="1215"/>
+            <w:tcW w:type="dxa" w:w="1063"/>
+            <w:vAlign w:val="center"/>
           </w:tcPr>
           <w:p>
             <w:pPr>
+              <w:spacing w:before="0" w:after="0"/>
               <w:jc w:val="center"/>
             </w:pPr>
-            <w:r/>
             <w:r>
               <w:rPr>
                 <w:rFonts w:ascii="Times New Roman" w:hAnsi="Times New Roman" w:eastAsia="Times New Roman"/>
@@ -814,17 +800,38 @@
             </w:r>
           </w:p>
         </w:tc>
+        <w:tc>
+          <w:tcPr>
+            <w:tcW w:type="dxa" w:w="1063"/>
+            <w:vAlign w:val="center"/>
+          </w:tcPr>
+          <w:p>
+            <w:pPr>
+              <w:spacing w:before="0" w:after="0"/>
+              <w:jc w:val="center"/>
+            </w:pPr>
+            <w:r>
+              <w:rPr>
+                <w:rFonts w:ascii="Times New Roman" w:hAnsi="Times New Roman" w:eastAsia="Times New Roman"/>
+                <w:b w:val="0"/>
+                <w:sz w:val="16"/>
+              </w:rPr>
+              <w:t>91,7</w:t>
+            </w:r>
+          </w:p>
+        </w:tc>
       </w:tr>
       <w:tr>
         <w:tc>
           <w:tcPr>
-            <w:tcW w:type="dxa" w:w="1215"/>
+            <w:tcW w:type="dxa" w:w="1063"/>
+            <w:vAlign w:val="center"/>
           </w:tcPr>
           <w:p>
             <w:pPr>
+              <w:spacing w:before="0" w:after="0"/>
               <w:jc w:val="center"/>
             </w:pPr>
-            <w:r/>
             <w:r>
               <w:rPr>
                 <w:rFonts w:ascii="Times New Roman" w:hAnsi="Times New Roman" w:eastAsia="Times New Roman"/>
@@ -837,13 +844,14 @@
         </w:tc>
         <w:tc>
           <w:tcPr>
-            <w:tcW w:type="dxa" w:w="1215"/>
+            <w:tcW w:type="dxa" w:w="1063"/>
+            <w:vAlign w:val="center"/>
           </w:tcPr>
           <w:p>
             <w:pPr>
+              <w:spacing w:before="0" w:after="0"/>
               <w:jc w:val="center"/>
             </w:pPr>
-            <w:r/>
             <w:r>
               <w:rPr>
                 <w:rFonts w:ascii="Times New Roman" w:hAnsi="Times New Roman" w:eastAsia="Times New Roman"/>
@@ -856,13 +864,14 @@
         </w:tc>
         <w:tc>
           <w:tcPr>
-            <w:tcW w:type="dxa" w:w="1215"/>
+            <w:tcW w:type="dxa" w:w="1063"/>
+            <w:vAlign w:val="center"/>
           </w:tcPr>
           <w:p>
             <w:pPr>
+              <w:spacing w:before="0" w:after="0"/>
               <w:jc w:val="center"/>
             </w:pPr>
-            <w:r/>
             <w:r>
               <w:rPr>
                 <w:rFonts w:ascii="Times New Roman" w:hAnsi="Times New Roman" w:eastAsia="Times New Roman"/>
@@ -875,13 +884,14 @@
         </w:tc>
         <w:tc>
           <w:tcPr>
-            <w:tcW w:type="dxa" w:w="1215"/>
+            <w:tcW w:type="dxa" w:w="1063"/>
+            <w:vAlign w:val="center"/>
           </w:tcPr>
           <w:p>
             <w:pPr>
+              <w:spacing w:before="0" w:after="0"/>
               <w:jc w:val="center"/>
             </w:pPr>
-            <w:r/>
             <w:r>
               <w:rPr>
                 <w:rFonts w:ascii="Times New Roman" w:hAnsi="Times New Roman" w:eastAsia="Times New Roman"/>
@@ -894,13 +904,14 @@
         </w:tc>
         <w:tc>
           <w:tcPr>
-            <w:tcW w:type="dxa" w:w="1215"/>
+            <w:tcW w:type="dxa" w:w="1063"/>
+            <w:vAlign w:val="center"/>
           </w:tcPr>
           <w:p>
             <w:pPr>
+              <w:spacing w:before="0" w:after="0"/>
               <w:jc w:val="center"/>
             </w:pPr>
-            <w:r/>
             <w:r>
               <w:rPr>
                 <w:rFonts w:ascii="Times New Roman" w:hAnsi="Times New Roman" w:eastAsia="Times New Roman"/>
@@ -913,13 +924,14 @@
         </w:tc>
         <w:tc>
           <w:tcPr>
-            <w:tcW w:type="dxa" w:w="1215"/>
+            <w:tcW w:type="dxa" w:w="1063"/>
+            <w:vAlign w:val="center"/>
           </w:tcPr>
           <w:p>
             <w:pPr>
+              <w:spacing w:before="0" w:after="0"/>
               <w:jc w:val="center"/>
             </w:pPr>
-            <w:r/>
             <w:r>
               <w:rPr>
                 <w:rFonts w:ascii="Times New Roman" w:hAnsi="Times New Roman" w:eastAsia="Times New Roman"/>
@@ -932,20 +944,41 @@
         </w:tc>
         <w:tc>
           <w:tcPr>
-            <w:tcW w:type="dxa" w:w="1215"/>
+            <w:tcW w:type="dxa" w:w="1063"/>
+            <w:vAlign w:val="center"/>
           </w:tcPr>
           <w:p>
             <w:pPr>
+              <w:spacing w:before="0" w:after="0"/>
               <w:jc w:val="center"/>
             </w:pPr>
-            <w:r/>
             <w:r>
               <w:rPr>
                 <w:rFonts w:ascii="Times New Roman" w:hAnsi="Times New Roman" w:eastAsia="Times New Roman"/>
                 <w:b w:val="0"/>
                 <w:sz w:val="16"/>
               </w:rPr>
-              <w:t>27,6</w:t>
+              <w:t>29,0</w:t>
+            </w:r>
+          </w:p>
+        </w:tc>
+        <w:tc>
+          <w:tcPr>
+            <w:tcW w:type="dxa" w:w="1063"/>
+            <w:vAlign w:val="center"/>
+          </w:tcPr>
+          <w:p>
+            <w:pPr>
+              <w:spacing w:before="0" w:after="0"/>
+              <w:jc w:val="center"/>
+            </w:pPr>
+            <w:r>
+              <w:rPr>
+                <w:rFonts w:ascii="Times New Roman" w:hAnsi="Times New Roman" w:eastAsia="Times New Roman"/>
+                <w:b w:val="0"/>
+                <w:sz w:val="16"/>
+              </w:rPr>
+              <w:t>19,3</w:t>
             </w:r>
           </w:p>
         </w:tc>
@@ -953,13 +986,14 @@
       <w:tr>
         <w:tc>
           <w:tcPr>
-            <w:tcW w:type="dxa" w:w="1215"/>
+            <w:tcW w:type="dxa" w:w="1063"/>
+            <w:vAlign w:val="center"/>
           </w:tcPr>
           <w:p>
             <w:pPr>
+              <w:spacing w:before="0" w:after="0"/>
               <w:jc w:val="center"/>
             </w:pPr>
-            <w:r/>
             <w:r>
               <w:rPr>
                 <w:rFonts w:ascii="Times New Roman" w:hAnsi="Times New Roman" w:eastAsia="Times New Roman"/>
@@ -972,13 +1006,14 @@
         </w:tc>
         <w:tc>
           <w:tcPr>
-            <w:tcW w:type="dxa" w:w="1215"/>
+            <w:tcW w:type="dxa" w:w="1063"/>
+            <w:vAlign w:val="center"/>
           </w:tcPr>
           <w:p>
             <w:pPr>
+              <w:spacing w:before="0" w:after="0"/>
               <w:jc w:val="center"/>
             </w:pPr>
-            <w:r/>
             <w:r>
               <w:rPr>
                 <w:rFonts w:ascii="Times New Roman" w:hAnsi="Times New Roman" w:eastAsia="Times New Roman"/>
@@ -991,13 +1026,14 @@
         </w:tc>
         <w:tc>
           <w:tcPr>
-            <w:tcW w:type="dxa" w:w="1215"/>
+            <w:tcW w:type="dxa" w:w="1063"/>
+            <w:vAlign w:val="center"/>
           </w:tcPr>
           <w:p>
             <w:pPr>
+              <w:spacing w:before="0" w:after="0"/>
               <w:jc w:val="center"/>
             </w:pPr>
-            <w:r/>
             <w:r>
               <w:rPr>
                 <w:rFonts w:ascii="Times New Roman" w:hAnsi="Times New Roman" w:eastAsia="Times New Roman"/>
@@ -1010,13 +1046,14 @@
         </w:tc>
         <w:tc>
           <w:tcPr>
-            <w:tcW w:type="dxa" w:w="1215"/>
+            <w:tcW w:type="dxa" w:w="1063"/>
+            <w:vAlign w:val="center"/>
           </w:tcPr>
           <w:p>
             <w:pPr>
+              <w:spacing w:before="0" w:after="0"/>
               <w:jc w:val="center"/>
             </w:pPr>
-            <w:r/>
             <w:r>
               <w:rPr>
                 <w:rFonts w:ascii="Times New Roman" w:hAnsi="Times New Roman" w:eastAsia="Times New Roman"/>
@@ -1029,13 +1066,14 @@
         </w:tc>
         <w:tc>
           <w:tcPr>
-            <w:tcW w:type="dxa" w:w="1215"/>
+            <w:tcW w:type="dxa" w:w="1063"/>
+            <w:vAlign w:val="center"/>
           </w:tcPr>
           <w:p>
             <w:pPr>
+              <w:spacing w:before="0" w:after="0"/>
               <w:jc w:val="center"/>
             </w:pPr>
-            <w:r/>
             <w:r>
               <w:rPr>
                 <w:rFonts w:ascii="Times New Roman" w:hAnsi="Times New Roman" w:eastAsia="Times New Roman"/>
@@ -1048,13 +1086,14 @@
         </w:tc>
         <w:tc>
           <w:tcPr>
-            <w:tcW w:type="dxa" w:w="1215"/>
+            <w:tcW w:type="dxa" w:w="1063"/>
+            <w:vAlign w:val="center"/>
           </w:tcPr>
           <w:p>
             <w:pPr>
+              <w:spacing w:before="0" w:after="0"/>
               <w:jc w:val="center"/>
             </w:pPr>
-            <w:r/>
             <w:r>
               <w:rPr>
                 <w:rFonts w:ascii="Times New Roman" w:hAnsi="Times New Roman" w:eastAsia="Times New Roman"/>
@@ -1067,13 +1106,14 @@
         </w:tc>
         <w:tc>
           <w:tcPr>
-            <w:tcW w:type="dxa" w:w="1215"/>
+            <w:tcW w:type="dxa" w:w="1063"/>
+            <w:vAlign w:val="center"/>
           </w:tcPr>
           <w:p>
             <w:pPr>
+              <w:spacing w:before="0" w:after="0"/>
               <w:jc w:val="center"/>
             </w:pPr>
-            <w:r/>
             <w:r>
               <w:rPr>
                 <w:rFonts w:ascii="Times New Roman" w:hAnsi="Times New Roman" w:eastAsia="Times New Roman"/>
@@ -1084,17 +1124,38 @@
             </w:r>
           </w:p>
         </w:tc>
+        <w:tc>
+          <w:tcPr>
+            <w:tcW w:type="dxa" w:w="1063"/>
+            <w:vAlign w:val="center"/>
+          </w:tcPr>
+          <w:p>
+            <w:pPr>
+              <w:spacing w:before="0" w:after="0"/>
+              <w:jc w:val="center"/>
+            </w:pPr>
+            <w:r>
+              <w:rPr>
+                <w:rFonts w:ascii="Times New Roman" w:hAnsi="Times New Roman" w:eastAsia="Times New Roman"/>
+                <w:b w:val="0"/>
+                <w:sz w:val="16"/>
+              </w:rPr>
+              <w:t>154,6</w:t>
+            </w:r>
+          </w:p>
+        </w:tc>
       </w:tr>
       <w:tr>
         <w:tc>
           <w:tcPr>
-            <w:tcW w:type="dxa" w:w="1215"/>
+            <w:tcW w:type="dxa" w:w="1063"/>
+            <w:vAlign w:val="center"/>
           </w:tcPr>
           <w:p>
             <w:pPr>
+              <w:spacing w:before="0" w:after="0"/>
               <w:jc w:val="center"/>
             </w:pPr>
-            <w:r/>
             <w:r>
               <w:rPr>
                 <w:rFonts w:ascii="Times New Roman" w:hAnsi="Times New Roman" w:eastAsia="Times New Roman"/>
@@ -1107,13 +1168,14 @@
         </w:tc>
         <w:tc>
           <w:tcPr>
-            <w:tcW w:type="dxa" w:w="1215"/>
+            <w:tcW w:type="dxa" w:w="1063"/>
+            <w:vAlign w:val="center"/>
           </w:tcPr>
           <w:p>
             <w:pPr>
+              <w:spacing w:before="0" w:after="0"/>
               <w:jc w:val="center"/>
             </w:pPr>
-            <w:r/>
             <w:r>
               <w:rPr>
                 <w:rFonts w:ascii="Times New Roman" w:hAnsi="Times New Roman" w:eastAsia="Times New Roman"/>
@@ -1126,13 +1188,14 @@
         </w:tc>
         <w:tc>
           <w:tcPr>
-            <w:tcW w:type="dxa" w:w="1215"/>
+            <w:tcW w:type="dxa" w:w="1063"/>
+            <w:vAlign w:val="center"/>
           </w:tcPr>
           <w:p>
             <w:pPr>
+              <w:spacing w:before="0" w:after="0"/>
               <w:jc w:val="center"/>
             </w:pPr>
-            <w:r/>
             <w:r>
               <w:rPr>
                 <w:rFonts w:ascii="Times New Roman" w:hAnsi="Times New Roman" w:eastAsia="Times New Roman"/>
@@ -1145,13 +1208,14 @@
         </w:tc>
         <w:tc>
           <w:tcPr>
-            <w:tcW w:type="dxa" w:w="1215"/>
+            <w:tcW w:type="dxa" w:w="1063"/>
+            <w:vAlign w:val="center"/>
           </w:tcPr>
           <w:p>
             <w:pPr>
+              <w:spacing w:before="0" w:after="0"/>
               <w:jc w:val="center"/>
             </w:pPr>
-            <w:r/>
             <w:r>
               <w:rPr>
                 <w:rFonts w:ascii="Times New Roman" w:hAnsi="Times New Roman" w:eastAsia="Times New Roman"/>
@@ -1164,13 +1228,14 @@
         </w:tc>
         <w:tc>
           <w:tcPr>
-            <w:tcW w:type="dxa" w:w="1215"/>
+            <w:tcW w:type="dxa" w:w="1063"/>
+            <w:vAlign w:val="center"/>
           </w:tcPr>
           <w:p>
             <w:pPr>
+              <w:spacing w:before="0" w:after="0"/>
               <w:jc w:val="center"/>
             </w:pPr>
-            <w:r/>
             <w:r>
               <w:rPr>
                 <w:rFonts w:ascii="Times New Roman" w:hAnsi="Times New Roman" w:eastAsia="Times New Roman"/>
@@ -1183,13 +1248,14 @@
         </w:tc>
         <w:tc>
           <w:tcPr>
-            <w:tcW w:type="dxa" w:w="1215"/>
+            <w:tcW w:type="dxa" w:w="1063"/>
+            <w:vAlign w:val="center"/>
           </w:tcPr>
           <w:p>
             <w:pPr>
+              <w:spacing w:before="0" w:after="0"/>
               <w:jc w:val="center"/>
             </w:pPr>
-            <w:r/>
             <w:r>
               <w:rPr>
                 <w:rFonts w:ascii="Times New Roman" w:hAnsi="Times New Roman" w:eastAsia="Times New Roman"/>
@@ -1202,13 +1268,14 @@
         </w:tc>
         <w:tc>
           <w:tcPr>
-            <w:tcW w:type="dxa" w:w="1215"/>
+            <w:tcW w:type="dxa" w:w="1063"/>
+            <w:vAlign w:val="center"/>
           </w:tcPr>
           <w:p>
             <w:pPr>
+              <w:spacing w:before="0" w:after="0"/>
               <w:jc w:val="center"/>
             </w:pPr>
-            <w:r/>
             <w:r>
               <w:rPr>
                 <w:rFonts w:ascii="Times New Roman" w:hAnsi="Times New Roman" w:eastAsia="Times New Roman"/>
@@ -1219,18 +1286,32 @@
             </w:r>
           </w:p>
         </w:tc>
+        <w:tc>
+          <w:tcPr>
+            <w:tcW w:type="dxa" w:w="1063"/>
+            <w:vAlign w:val="center"/>
+          </w:tcPr>
+          <w:p>
+            <w:pPr>
+              <w:spacing w:before="0" w:after="0"/>
+              <w:jc w:val="center"/>
+            </w:pPr>
+            <w:r>
+              <w:rPr>
+                <w:rFonts w:ascii="Times New Roman" w:hAnsi="Times New Roman" w:eastAsia="Times New Roman"/>
+                <w:b w:val="0"/>
+                <w:sz w:val="16"/>
+              </w:rPr>
+              <w:t>56,3</w:t>
+            </w:r>
+          </w:p>
+        </w:tc>
       </w:tr>
     </w:tbl>
     <w:p>
       <w:pPr>
-        <w:spacing w:after="80"/>
-      </w:pPr>
-    </w:p>
-    <w:p>
-      <w:pPr>
-        <w:spacing w:after="120"/>
-        <w:ind w:firstLine="720"/>
-        <w:jc w:val="both"/>
+        <w:spacing w:before="120" w:after="0" w:line="240" w:lineRule="auto"/>
+        <w:ind w:firstLine="0"/>
       </w:pPr>
       <w:r>
         <w:rPr>
@@ -1239,30 +1320,44 @@
           <w:i w:val="0"/>
           <w:sz w:val="24"/>
         </w:rPr>
-        <w:t>A Tabela 2 mostra a auditoria específica do modo individual. Nos três vídeos frontais completos, o sistema processou 15.193 frames. Os frames sem face dos vídeos NASA correspondem principalmente a cartelas e b-roll de abertura, não a perda sistemática de rosto frontal. Quando havia pessoa frontal no quadro, os deltas medianos foram pequenos: 4,0 graus em yaw e 1,8 grau em pitch.</w:t>
+        <w:t>A Tabela 2 resume a auditoria HQ do modo plateia com a configuração enhanced, confiança 0,60 e limite de 24 faces. Diferentemente da Tabela 1, essa avaliação usa vídeos 1080p completos, cenas mais pesadas e comparação com contagem manual em quadros específicos. Portanto, o FPS dessa auditoria não deve ser comparado diretamente com o FPS do benchmark de detector em 960x540.</w:t>
       </w:r>
     </w:p>
     <w:p>
       <w:pPr>
-        <w:spacing w:after="140"/>
+        <w:spacing w:before="120" w:after="120" w:line="240" w:lineRule="auto"/>
+        <w:ind w:firstLine="0"/>
         <w:jc w:val="center"/>
       </w:pPr>
       <w:r>
         <w:rPr>
-          <w:rFonts w:ascii="Times New Roman" w:hAnsi="Times New Roman" w:eastAsia="Times New Roman"/>
+          <w:rFonts w:ascii="Arial" w:hAnsi="Arial" w:eastAsia="Arial"/>
           <w:b/>
-          <w:i w:val="0"/>
           <w:sz w:val="20"/>
         </w:rPr>
-        <w:t>Tabela 2. Auditoria do modo individual em vídeos frontais completos.</w:t>
+        <w:t>Tabela 2. Auditoria HQ de plateia com configuração enhanced, confiança 0,60 e limite de 24 faces.</w:t>
       </w:r>
     </w:p>
     <w:tbl>
       <w:tblPr>
-        <w:tblStyle w:val="TableGrid"/>
         <w:tblW w:type="auto" w:w="0"/>
         <w:jc w:val="center"/>
+        <w:tblLayout w:type="autofit"/>
         <w:tblLook w:firstColumn="1" w:firstRow="1" w:lastColumn="0" w:lastRow="0" w:noHBand="0" w:noVBand="1" w:val="04A0"/>
+        <w:tblBorders>
+          <w:top w:val="single" w:sz="4" w:space="0" w:color="808080"/>
+          <w:left w:val="single" w:sz="4" w:space="0" w:color="808080"/>
+          <w:bottom w:val="single" w:sz="4" w:space="0" w:color="808080"/>
+          <w:right w:val="single" w:sz="4" w:space="0" w:color="808080"/>
+          <w:insideH w:val="single" w:sz="4" w:space="0" w:color="808080"/>
+          <w:insideV w:val="single" w:sz="4" w:space="0" w:color="808080"/>
+        </w:tblBorders>
+        <w:tblCellMar>
+          <w:top w:w="20" w:type="dxa"/>
+          <w:start w:w="35" w:type="dxa"/>
+          <w:bottom w:w="20" w:type="dxa"/>
+          <w:end w:w="35" w:type="dxa"/>
+        </w:tblCellMar>
       </w:tblPr>
       <w:tblGrid>
         <w:gridCol w:w="4252"/>
@@ -1272,17 +1367,18 @@
         <w:tc>
           <w:tcPr>
             <w:tcW w:type="dxa" w:w="4252"/>
+            <w:vAlign w:val="center"/>
           </w:tcPr>
           <w:p>
             <w:pPr>
+              <w:spacing w:before="0" w:after="0"/>
               <w:jc w:val="center"/>
             </w:pPr>
-            <w:r/>
             <w:r>
               <w:rPr>
                 <w:rFonts w:ascii="Times New Roman" w:hAnsi="Times New Roman" w:eastAsia="Times New Roman"/>
                 <w:b/>
-                <w:sz w:val="16"/>
+                <w:sz w:val="18"/>
               </w:rPr>
               <w:t>Métrica</w:t>
             </w:r>
@@ -1291,19 +1387,20 @@
         <w:tc>
           <w:tcPr>
             <w:tcW w:type="dxa" w:w="4252"/>
+            <w:vAlign w:val="center"/>
           </w:tcPr>
           <w:p>
             <w:pPr>
+              <w:spacing w:before="0" w:after="0"/>
               <w:jc w:val="center"/>
             </w:pPr>
-            <w:r/>
             <w:r>
               <w:rPr>
                 <w:rFonts w:ascii="Times New Roman" w:hAnsi="Times New Roman" w:eastAsia="Times New Roman"/>
                 <w:b/>
-                <w:sz w:val="16"/>
+                <w:sz w:val="18"/>
               </w:rPr>
-              <w:t>Valor</w:t>
+              <w:t>Resultado</w:t>
             </w:r>
           </w:p>
         </w:tc>
@@ -1312,38 +1409,40 @@
         <w:tc>
           <w:tcPr>
             <w:tcW w:type="dxa" w:w="4252"/>
+            <w:vAlign w:val="center"/>
           </w:tcPr>
           <w:p>
             <w:pPr>
+              <w:spacing w:before="0" w:after="0"/>
               <w:jc w:val="center"/>
             </w:pPr>
-            <w:r/>
             <w:r>
               <w:rPr>
                 <w:rFonts w:ascii="Times New Roman" w:hAnsi="Times New Roman" w:eastAsia="Times New Roman"/>
                 <w:b w:val="0"/>
-                <w:sz w:val="16"/>
+                <w:sz w:val="18"/>
               </w:rPr>
-              <w:t>Vídeos processados</w:t>
+              <w:t>Acertos exatos</w:t>
             </w:r>
           </w:p>
         </w:tc>
         <w:tc>
           <w:tcPr>
             <w:tcW w:type="dxa" w:w="4252"/>
+            <w:vAlign w:val="center"/>
           </w:tcPr>
           <w:p>
             <w:pPr>
+              <w:spacing w:before="0" w:after="0"/>
               <w:jc w:val="center"/>
             </w:pPr>
-            <w:r/>
             <w:r>
               <w:rPr>
                 <w:rFonts w:ascii="Times New Roman" w:hAnsi="Times New Roman" w:eastAsia="Times New Roman"/>
                 <w:b w:val="0"/>
-                <w:sz w:val="16"/>
+                <w:sz w:val="18"/>
               </w:rPr>
-              <w:t>3</w:t>
+              <w:t>5/11</w:t>
             </w:r>
           </w:p>
         </w:tc>
@@ -1352,38 +1451,40 @@
         <w:tc>
           <w:tcPr>
             <w:tcW w:type="dxa" w:w="4252"/>
+            <w:vAlign w:val="center"/>
           </w:tcPr>
           <w:p>
             <w:pPr>
+              <w:spacing w:before="0" w:after="0"/>
               <w:jc w:val="center"/>
             </w:pPr>
-            <w:r/>
             <w:r>
               <w:rPr>
                 <w:rFonts w:ascii="Times New Roman" w:hAnsi="Times New Roman" w:eastAsia="Times New Roman"/>
                 <w:b w:val="0"/>
-                <w:sz w:val="16"/>
+                <w:sz w:val="18"/>
               </w:rPr>
-              <w:t>Frames totais</w:t>
+              <w:t>Erro de no máximo 1 rosto</w:t>
             </w:r>
           </w:p>
         </w:tc>
         <w:tc>
           <w:tcPr>
             <w:tcW w:type="dxa" w:w="4252"/>
+            <w:vAlign w:val="center"/>
           </w:tcPr>
           <w:p>
             <w:pPr>
+              <w:spacing w:before="0" w:after="0"/>
               <w:jc w:val="center"/>
             </w:pPr>
-            <w:r/>
             <w:r>
               <w:rPr>
                 <w:rFonts w:ascii="Times New Roman" w:hAnsi="Times New Roman" w:eastAsia="Times New Roman"/>
                 <w:b w:val="0"/>
-                <w:sz w:val="16"/>
+                <w:sz w:val="18"/>
               </w:rPr>
-              <w:t>15.193</w:t>
+              <w:t>10/11</w:t>
             </w:r>
           </w:p>
         </w:tc>
@@ -1392,38 +1493,40 @@
         <w:tc>
           <w:tcPr>
             <w:tcW w:type="dxa" w:w="4252"/>
+            <w:vAlign w:val="center"/>
           </w:tcPr>
           <w:p>
             <w:pPr>
+              <w:spacing w:before="0" w:after="0"/>
               <w:jc w:val="center"/>
             </w:pPr>
-            <w:r/>
             <w:r>
               <w:rPr>
                 <w:rFonts w:ascii="Times New Roman" w:hAnsi="Times New Roman" w:eastAsia="Times New Roman"/>
                 <w:b w:val="0"/>
-                <w:sz w:val="16"/>
+                <w:sz w:val="18"/>
               </w:rPr>
-              <w:t>Frames com face/métricas válidas</w:t>
+              <w:t>Erro absoluto médio</w:t>
             </w:r>
           </w:p>
         </w:tc>
         <w:tc>
           <w:tcPr>
             <w:tcW w:type="dxa" w:w="4252"/>
+            <w:vAlign w:val="center"/>
           </w:tcPr>
           <w:p>
             <w:pPr>
+              <w:spacing w:before="0" w:after="0"/>
               <w:jc w:val="center"/>
             </w:pPr>
-            <w:r/>
             <w:r>
               <w:rPr>
                 <w:rFonts w:ascii="Times New Roman" w:hAnsi="Times New Roman" w:eastAsia="Times New Roman"/>
                 <w:b w:val="0"/>
-                <w:sz w:val="16"/>
+                <w:sz w:val="18"/>
               </w:rPr>
-              <w:t>86,6%</w:t>
+              <w:t>0,636 rosto</w:t>
             </w:r>
           </w:p>
         </w:tc>
@@ -1432,38 +1535,40 @@
         <w:tc>
           <w:tcPr>
             <w:tcW w:type="dxa" w:w="4252"/>
+            <w:vAlign w:val="center"/>
           </w:tcPr>
           <w:p>
             <w:pPr>
+              <w:spacing w:before="0" w:after="0"/>
               <w:jc w:val="center"/>
             </w:pPr>
-            <w:r/>
             <w:r>
               <w:rPr>
                 <w:rFonts w:ascii="Times New Roman" w:hAnsi="Times New Roman" w:eastAsia="Times New Roman"/>
                 <w:b w:val="0"/>
-                <w:sz w:val="16"/>
+                <w:sz w:val="18"/>
               </w:rPr>
-              <w:t>Frames frontais</w:t>
+              <w:t>Manual dentro da janela +/-1 s</w:t>
             </w:r>
           </w:p>
         </w:tc>
         <w:tc>
           <w:tcPr>
             <w:tcW w:type="dxa" w:w="4252"/>
+            <w:vAlign w:val="center"/>
           </w:tcPr>
           <w:p>
             <w:pPr>
+              <w:spacing w:before="0" w:after="0"/>
               <w:jc w:val="center"/>
             </w:pPr>
-            <w:r/>
             <w:r>
               <w:rPr>
                 <w:rFonts w:ascii="Times New Roman" w:hAnsi="Times New Roman" w:eastAsia="Times New Roman"/>
                 <w:b w:val="0"/>
-                <w:sz w:val="16"/>
+                <w:sz w:val="18"/>
               </w:rPr>
-              <w:t>82,5%</w:t>
+              <w:t>10/11</w:t>
             </w:r>
           </w:p>
         </w:tc>
@@ -1472,38 +1577,40 @@
         <w:tc>
           <w:tcPr>
             <w:tcW w:type="dxa" w:w="4252"/>
+            <w:vAlign w:val="center"/>
           </w:tcPr>
           <w:p>
             <w:pPr>
+              <w:spacing w:before="0" w:after="0"/>
               <w:jc w:val="center"/>
             </w:pPr>
-            <w:r/>
             <w:r>
               <w:rPr>
                 <w:rFonts w:ascii="Times New Roman" w:hAnsi="Times New Roman" w:eastAsia="Times New Roman"/>
                 <w:b w:val="0"/>
-                <w:sz w:val="16"/>
+                <w:sz w:val="18"/>
               </w:rPr>
-              <w:t>Frames neutros em pose</w:t>
+              <w:t>FPS médio</w:t>
             </w:r>
           </w:p>
         </w:tc>
         <w:tc>
           <w:tcPr>
             <w:tcW w:type="dxa" w:w="4252"/>
+            <w:vAlign w:val="center"/>
           </w:tcPr>
           <w:p>
             <w:pPr>
+              <w:spacing w:before="0" w:after="0"/>
               <w:jc w:val="center"/>
             </w:pPr>
-            <w:r/>
             <w:r>
               <w:rPr>
                 <w:rFonts w:ascii="Times New Roman" w:hAnsi="Times New Roman" w:eastAsia="Times New Roman"/>
                 <w:b w:val="0"/>
-                <w:sz w:val="16"/>
+                <w:sz w:val="18"/>
               </w:rPr>
-              <w:t>76,7%</w:t>
+              <w:t>13,3</w:t>
             </w:r>
           </w:p>
         </w:tc>
@@ -1512,444 +1619,38 @@
         <w:tc>
           <w:tcPr>
             <w:tcW w:type="dxa" w:w="4252"/>
+            <w:vAlign w:val="center"/>
           </w:tcPr>
           <w:p>
             <w:pPr>
+              <w:spacing w:before="0" w:after="0"/>
               <w:jc w:val="center"/>
             </w:pPr>
-            <w:r/>
             <w:r>
               <w:rPr>
                 <w:rFonts w:ascii="Times New Roman" w:hAnsi="Times New Roman" w:eastAsia="Times New Roman"/>
                 <w:b w:val="0"/>
-                <w:sz w:val="16"/>
+                <w:sz w:val="18"/>
               </w:rPr>
-              <w:t>Frames aprovados</w:t>
+              <w:t>FPS p10</w:t>
             </w:r>
           </w:p>
         </w:tc>
         <w:tc>
           <w:tcPr>
             <w:tcW w:type="dxa" w:w="4252"/>
+            <w:vAlign w:val="center"/>
           </w:tcPr>
           <w:p>
             <w:pPr>
+              <w:spacing w:before="0" w:after="0"/>
               <w:jc w:val="center"/>
             </w:pPr>
-            <w:r/>
             <w:r>
               <w:rPr>
                 <w:rFonts w:ascii="Times New Roman" w:hAnsi="Times New Roman" w:eastAsia="Times New Roman"/>
                 <w:b w:val="0"/>
-                <w:sz w:val="16"/>
-              </w:rPr>
-              <w:t>73,0%</w:t>
-            </w:r>
-          </w:p>
-        </w:tc>
-      </w:tr>
-      <w:tr>
-        <w:tc>
-          <w:tcPr>
-            <w:tcW w:type="dxa" w:w="4252"/>
-          </w:tcPr>
-          <w:p>
-            <w:pPr>
-              <w:jc w:val="center"/>
-            </w:pPr>
-            <w:r/>
-            <w:r>
-              <w:rPr>
-                <w:rFonts w:ascii="Times New Roman" w:hAnsi="Times New Roman" w:eastAsia="Times New Roman"/>
-                <w:b w:val="0"/>
-                <w:sz w:val="16"/>
-              </w:rPr>
-              <w:t>Yaw delta mediano</w:t>
-            </w:r>
-          </w:p>
-        </w:tc>
-        <w:tc>
-          <w:tcPr>
-            <w:tcW w:type="dxa" w:w="4252"/>
-          </w:tcPr>
-          <w:p>
-            <w:pPr>
-              <w:jc w:val="center"/>
-            </w:pPr>
-            <w:r/>
-            <w:r>
-              <w:rPr>
-                <w:rFonts w:ascii="Times New Roman" w:hAnsi="Times New Roman" w:eastAsia="Times New Roman"/>
-                <w:b w:val="0"/>
-                <w:sz w:val="16"/>
-              </w:rPr>
-              <w:t>4,0 graus</w:t>
-            </w:r>
-          </w:p>
-        </w:tc>
-      </w:tr>
-      <w:tr>
-        <w:tc>
-          <w:tcPr>
-            <w:tcW w:type="dxa" w:w="4252"/>
-          </w:tcPr>
-          <w:p>
-            <w:pPr>
-              <w:jc w:val="center"/>
-            </w:pPr>
-            <w:r/>
-            <w:r>
-              <w:rPr>
-                <w:rFonts w:ascii="Times New Roman" w:hAnsi="Times New Roman" w:eastAsia="Times New Roman"/>
-                <w:b w:val="0"/>
-                <w:sz w:val="16"/>
-              </w:rPr>
-              <w:t>Pitch delta mediano</w:t>
-            </w:r>
-          </w:p>
-        </w:tc>
-        <w:tc>
-          <w:tcPr>
-            <w:tcW w:type="dxa" w:w="4252"/>
-          </w:tcPr>
-          <w:p>
-            <w:pPr>
-              <w:jc w:val="center"/>
-            </w:pPr>
-            <w:r/>
-            <w:r>
-              <w:rPr>
-                <w:rFonts w:ascii="Times New Roman" w:hAnsi="Times New Roman" w:eastAsia="Times New Roman"/>
-                <w:b w:val="0"/>
-                <w:sz w:val="16"/>
-              </w:rPr>
-              <w:t>1,8 grau</w:t>
-            </w:r>
-          </w:p>
-        </w:tc>
-      </w:tr>
-    </w:tbl>
-    <w:p>
-      <w:pPr>
-        <w:spacing w:after="80"/>
-      </w:pPr>
-    </w:p>
-    <w:p>
-      <w:pPr>
-        <w:spacing w:after="120"/>
-        <w:ind w:firstLine="720"/>
-        <w:jc w:val="both"/>
-      </w:pPr>
-      <w:r>
-        <w:rPr>
-          <w:rFonts w:ascii="Times New Roman" w:hAnsi="Times New Roman" w:eastAsia="Times New Roman"/>
-          <w:b w:val="0"/>
-          <w:i w:val="0"/>
-          <w:sz w:val="24"/>
-        </w:rPr>
-        <w:t>A Tabela 3 resume a auditoria HQ de plateia com a configuração enhanced, confiança 0,60 e limite de 24 faces. Essa avaliação é mais pesada que o benchmark smoke porque usa vídeos 1080p completos e compara a saída temporal do app com contagens manuais.</w:t>
-      </w:r>
-    </w:p>
-    <w:p>
-      <w:r>
-        <w:br w:type="page"/>
-      </w:r>
-    </w:p>
-    <w:p>
-      <w:pPr>
-        <w:spacing w:after="140"/>
-        <w:jc w:val="center"/>
-      </w:pPr>
-      <w:r>
-        <w:rPr>
-          <w:rFonts w:ascii="Times New Roman" w:hAnsi="Times New Roman" w:eastAsia="Times New Roman"/>
-          <w:b/>
-          <w:i w:val="0"/>
-          <w:sz w:val="20"/>
-        </w:rPr>
-        <w:t>Tabela 3. Auditoria HQ de plateia com enhanced, confiança 0,60 e 24 faces.</w:t>
-      </w:r>
-    </w:p>
-    <w:tbl>
-      <w:tblPr>
-        <w:tblStyle w:val="TableGrid"/>
-        <w:tblW w:type="auto" w:w="0"/>
-        <w:jc w:val="center"/>
-        <w:tblLook w:firstColumn="1" w:firstRow="1" w:lastColumn="0" w:lastRow="0" w:noHBand="0" w:noVBand="1" w:val="04A0"/>
-      </w:tblPr>
-      <w:tblGrid>
-        <w:gridCol w:w="1215"/>
-        <w:gridCol w:w="1215"/>
-        <w:gridCol w:w="1215"/>
-        <w:gridCol w:w="1215"/>
-        <w:gridCol w:w="1215"/>
-        <w:gridCol w:w="1215"/>
-        <w:gridCol w:w="1215"/>
-      </w:tblGrid>
-      <w:tr>
-        <w:tc>
-          <w:tcPr>
-            <w:tcW w:type="dxa" w:w="1215"/>
-          </w:tcPr>
-          <w:p>
-            <w:pPr>
-              <w:jc w:val="center"/>
-            </w:pPr>
-            <w:r/>
-            <w:r>
-              <w:rPr>
-                <w:rFonts w:ascii="Times New Roman" w:hAnsi="Times New Roman" w:eastAsia="Times New Roman"/>
-                <w:b/>
-                <w:sz w:val="16"/>
-              </w:rPr>
-              <w:t>Configuração</w:t>
-            </w:r>
-          </w:p>
-        </w:tc>
-        <w:tc>
-          <w:tcPr>
-            <w:tcW w:type="dxa" w:w="1215"/>
-          </w:tcPr>
-          <w:p>
-            <w:pPr>
-              <w:jc w:val="center"/>
-            </w:pPr>
-            <w:r/>
-            <w:r>
-              <w:rPr>
-                <w:rFonts w:ascii="Times New Roman" w:hAnsi="Times New Roman" w:eastAsia="Times New Roman"/>
-                <w:b/>
-                <w:sz w:val="16"/>
-              </w:rPr>
-              <w:t>Exatos</w:t>
-            </w:r>
-          </w:p>
-        </w:tc>
-        <w:tc>
-          <w:tcPr>
-            <w:tcW w:type="dxa" w:w="1215"/>
-          </w:tcPr>
-          <w:p>
-            <w:pPr>
-              <w:jc w:val="center"/>
-            </w:pPr>
-            <w:r/>
-            <w:r>
-              <w:rPr>
-                <w:rFonts w:ascii="Times New Roman" w:hAnsi="Times New Roman" w:eastAsia="Times New Roman"/>
-                <w:b/>
-                <w:sz w:val="16"/>
-              </w:rPr>
-              <w:t>Erro &lt;=1</w:t>
-            </w:r>
-          </w:p>
-        </w:tc>
-        <w:tc>
-          <w:tcPr>
-            <w:tcW w:type="dxa" w:w="1215"/>
-          </w:tcPr>
-          <w:p>
-            <w:pPr>
-              <w:jc w:val="center"/>
-            </w:pPr>
-            <w:r/>
-            <w:r>
-              <w:rPr>
-                <w:rFonts w:ascii="Times New Roman" w:hAnsi="Times New Roman" w:eastAsia="Times New Roman"/>
-                <w:b/>
-                <w:sz w:val="16"/>
-              </w:rPr>
-              <w:t>Erro médio</w:t>
-            </w:r>
-          </w:p>
-        </w:tc>
-        <w:tc>
-          <w:tcPr>
-            <w:tcW w:type="dxa" w:w="1215"/>
-          </w:tcPr>
-          <w:p>
-            <w:pPr>
-              <w:jc w:val="center"/>
-            </w:pPr>
-            <w:r/>
-            <w:r>
-              <w:rPr>
-                <w:rFonts w:ascii="Times New Roman" w:hAnsi="Times New Roman" w:eastAsia="Times New Roman"/>
-                <w:b/>
-                <w:sz w:val="16"/>
-              </w:rPr>
-              <w:t>Manual em +/-1s</w:t>
-            </w:r>
-          </w:p>
-        </w:tc>
-        <w:tc>
-          <w:tcPr>
-            <w:tcW w:type="dxa" w:w="1215"/>
-          </w:tcPr>
-          <w:p>
-            <w:pPr>
-              <w:jc w:val="center"/>
-            </w:pPr>
-            <w:r/>
-            <w:r>
-              <w:rPr>
-                <w:rFonts w:ascii="Times New Roman" w:hAnsi="Times New Roman" w:eastAsia="Times New Roman"/>
-                <w:b/>
-                <w:sz w:val="16"/>
-              </w:rPr>
-              <w:t>FPS médio</w:t>
-            </w:r>
-          </w:p>
-        </w:tc>
-        <w:tc>
-          <w:tcPr>
-            <w:tcW w:type="dxa" w:w="1215"/>
-          </w:tcPr>
-          <w:p>
-            <w:pPr>
-              <w:jc w:val="center"/>
-            </w:pPr>
-            <w:r/>
-            <w:r>
-              <w:rPr>
-                <w:rFonts w:ascii="Times New Roman" w:hAnsi="Times New Roman" w:eastAsia="Times New Roman"/>
-                <w:b/>
-                <w:sz w:val="16"/>
-              </w:rPr>
-              <w:t>FPS p10</w:t>
-            </w:r>
-          </w:p>
-        </w:tc>
-      </w:tr>
-      <w:tr>
-        <w:tc>
-          <w:tcPr>
-            <w:tcW w:type="dxa" w:w="1215"/>
-          </w:tcPr>
-          <w:p>
-            <w:pPr>
-              <w:jc w:val="center"/>
-            </w:pPr>
-            <w:r/>
-            <w:r>
-              <w:rPr>
-                <w:rFonts w:ascii="Times New Roman" w:hAnsi="Times New Roman" w:eastAsia="Times New Roman"/>
-                <w:b w:val="0"/>
-                <w:sz w:val="16"/>
-              </w:rPr>
-              <w:t>enhanced c0,60 m24</w:t>
-            </w:r>
-          </w:p>
-        </w:tc>
-        <w:tc>
-          <w:tcPr>
-            <w:tcW w:type="dxa" w:w="1215"/>
-          </w:tcPr>
-          <w:p>
-            <w:pPr>
-              <w:jc w:val="center"/>
-            </w:pPr>
-            <w:r/>
-            <w:r>
-              <w:rPr>
-                <w:rFonts w:ascii="Times New Roman" w:hAnsi="Times New Roman" w:eastAsia="Times New Roman"/>
-                <w:b w:val="0"/>
-                <w:sz w:val="16"/>
-              </w:rPr>
-              <w:t>5/11</w:t>
-            </w:r>
-          </w:p>
-        </w:tc>
-        <w:tc>
-          <w:tcPr>
-            <w:tcW w:type="dxa" w:w="1215"/>
-          </w:tcPr>
-          <w:p>
-            <w:pPr>
-              <w:jc w:val="center"/>
-            </w:pPr>
-            <w:r/>
-            <w:r>
-              <w:rPr>
-                <w:rFonts w:ascii="Times New Roman" w:hAnsi="Times New Roman" w:eastAsia="Times New Roman"/>
-                <w:b w:val="0"/>
-                <w:sz w:val="16"/>
-              </w:rPr>
-              <w:t>10/11</w:t>
-            </w:r>
-          </w:p>
-        </w:tc>
-        <w:tc>
-          <w:tcPr>
-            <w:tcW w:type="dxa" w:w="1215"/>
-          </w:tcPr>
-          <w:p>
-            <w:pPr>
-              <w:jc w:val="center"/>
-            </w:pPr>
-            <w:r/>
-            <w:r>
-              <w:rPr>
-                <w:rFonts w:ascii="Times New Roman" w:hAnsi="Times New Roman" w:eastAsia="Times New Roman"/>
-                <w:b w:val="0"/>
-                <w:sz w:val="16"/>
-              </w:rPr>
-              <w:t>0,636</w:t>
-            </w:r>
-          </w:p>
-        </w:tc>
-        <w:tc>
-          <w:tcPr>
-            <w:tcW w:type="dxa" w:w="1215"/>
-          </w:tcPr>
-          <w:p>
-            <w:pPr>
-              <w:jc w:val="center"/>
-            </w:pPr>
-            <w:r/>
-            <w:r>
-              <w:rPr>
-                <w:rFonts w:ascii="Times New Roman" w:hAnsi="Times New Roman" w:eastAsia="Times New Roman"/>
-                <w:b w:val="0"/>
-                <w:sz w:val="16"/>
-              </w:rPr>
-              <w:t>10/11</w:t>
-            </w:r>
-          </w:p>
-        </w:tc>
-        <w:tc>
-          <w:tcPr>
-            <w:tcW w:type="dxa" w:w="1215"/>
-          </w:tcPr>
-          <w:p>
-            <w:pPr>
-              <w:jc w:val="center"/>
-            </w:pPr>
-            <w:r/>
-            <w:r>
-              <w:rPr>
-                <w:rFonts w:ascii="Times New Roman" w:hAnsi="Times New Roman" w:eastAsia="Times New Roman"/>
-                <w:b w:val="0"/>
-                <w:sz w:val="16"/>
-              </w:rPr>
-              <w:t>13,3</w:t>
-            </w:r>
-          </w:p>
-        </w:tc>
-        <w:tc>
-          <w:tcPr>
-            <w:tcW w:type="dxa" w:w="1215"/>
-          </w:tcPr>
-          <w:p>
-            <w:pPr>
-              <w:jc w:val="center"/>
-            </w:pPr>
-            <w:r/>
-            <w:r>
-              <w:rPr>
-                <w:rFonts w:ascii="Times New Roman" w:hAnsi="Times New Roman" w:eastAsia="Times New Roman"/>
-                <w:b w:val="0"/>
-                <w:sz w:val="16"/>
+                <w:sz w:val="18"/>
               </w:rPr>
               <w:t>9,4</w:t>
             </w:r>
@@ -1959,14 +1660,8 @@
     </w:tbl>
     <w:p>
       <w:pPr>
-        <w:spacing w:after="80"/>
-      </w:pPr>
-    </w:p>
-    <w:p>
-      <w:pPr>
-        <w:spacing w:after="120"/>
-        <w:ind w:firstLine="720"/>
-        <w:jc w:val="both"/>
+        <w:spacing w:before="120" w:after="0" w:line="240" w:lineRule="auto"/>
+        <w:ind w:firstLine="0"/>
       </w:pPr>
       <w:r>
         <w:rPr>
@@ -1975,30 +1670,241 @@
           <w:i w:val="0"/>
           <w:sz w:val="24"/>
         </w:rPr>
-        <w:t>A matriz de confusão disponível contém 50 amostras sintéticas de atenção/desatenção, usadas para testar o fluxo de cálculo, visualização e relatório. O resultado foi acurácia, precisão macro, recall macro e F1 macro de 0,92. Por serem amostras demonstrativas, esses valores não substituem uma validação científica com rotulação real.</w:t>
+        <w:t>A matriz de confusão disponível na versão revisada é demonstrativa. Ela contém 50 amostras sintéticas de atenção e desatenção, usadas para testar o fluxo de cálculo, visualização e relatório. A Tabela 3 mostra que houve 46 acertos e 4 erros, produzindo acurácia, precisão macro, recall macro e F1 macro de 0,92. Como as amostras são explicitamente demonstrativas, esse resultado não é apresentado como validação científica real; a validação final exige amostras reais rotuladas.</w:t>
       </w:r>
     </w:p>
     <w:p>
       <w:pPr>
-        <w:keepNext/>
-        <w:spacing w:before="200" w:after="120"/>
-        <w:jc w:val="left"/>
+        <w:spacing w:before="120" w:after="120" w:line="240" w:lineRule="auto"/>
+        <w:ind w:firstLine="0"/>
+        <w:jc w:val="center"/>
       </w:pPr>
       <w:r>
         <w:rPr>
-          <w:rFonts w:ascii="Times New Roman" w:hAnsi="Times New Roman" w:eastAsia="Times New Roman"/>
+          <w:rFonts w:ascii="Arial" w:hAnsi="Arial" w:eastAsia="Arial"/>
           <w:b/>
-          <w:i w:val="0"/>
-          <w:sz w:val="26"/>
+          <w:sz w:val="20"/>
         </w:rPr>
-        <w:t>Discussão</w:t>
+        <w:t>Tabela 3. Matriz de confusão demonstrativa com 50 amostras.</w:t>
       </w:r>
     </w:p>
+    <w:tbl>
+      <w:tblPr>
+        <w:tblW w:type="auto" w:w="0"/>
+        <w:jc w:val="center"/>
+        <w:tblLayout w:type="autofit"/>
+        <w:tblLook w:firstColumn="1" w:firstRow="1" w:lastColumn="0" w:lastRow="0" w:noHBand="0" w:noVBand="1" w:val="04A0"/>
+        <w:tblBorders>
+          <w:top w:val="single" w:sz="4" w:space="0" w:color="808080"/>
+          <w:left w:val="single" w:sz="4" w:space="0" w:color="808080"/>
+          <w:bottom w:val="single" w:sz="4" w:space="0" w:color="808080"/>
+          <w:right w:val="single" w:sz="4" w:space="0" w:color="808080"/>
+          <w:insideH w:val="single" w:sz="4" w:space="0" w:color="808080"/>
+          <w:insideV w:val="single" w:sz="4" w:space="0" w:color="808080"/>
+        </w:tblBorders>
+        <w:tblCellMar>
+          <w:top w:w="20" w:type="dxa"/>
+          <w:start w:w="35" w:type="dxa"/>
+          <w:bottom w:w="20" w:type="dxa"/>
+          <w:end w:w="35" w:type="dxa"/>
+        </w:tblCellMar>
+      </w:tblPr>
+      <w:tblGrid>
+        <w:gridCol w:w="2835"/>
+        <w:gridCol w:w="2835"/>
+        <w:gridCol w:w="2835"/>
+      </w:tblGrid>
+      <w:tr>
+        <w:tc>
+          <w:tcPr>
+            <w:tcW w:type="dxa" w:w="2835"/>
+            <w:vAlign w:val="center"/>
+          </w:tcPr>
+          <w:p>
+            <w:pPr>
+              <w:spacing w:before="0" w:after="0"/>
+              <w:jc w:val="center"/>
+            </w:pPr>
+            <w:r>
+              <w:rPr>
+                <w:rFonts w:ascii="Times New Roman" w:hAnsi="Times New Roman" w:eastAsia="Times New Roman"/>
+                <w:b/>
+                <w:sz w:val="18"/>
+              </w:rPr>
+              <w:t>Classe real</w:t>
+            </w:r>
+          </w:p>
+        </w:tc>
+        <w:tc>
+          <w:tcPr>
+            <w:tcW w:type="dxa" w:w="2835"/>
+            <w:vAlign w:val="center"/>
+          </w:tcPr>
+          <w:p>
+            <w:pPr>
+              <w:spacing w:before="0" w:after="0"/>
+              <w:jc w:val="center"/>
+            </w:pPr>
+            <w:r>
+              <w:rPr>
+                <w:rFonts w:ascii="Times New Roman" w:hAnsi="Times New Roman" w:eastAsia="Times New Roman"/>
+                <w:b/>
+                <w:sz w:val="18"/>
+              </w:rPr>
+              <w:t>Predito atento</w:t>
+            </w:r>
+          </w:p>
+        </w:tc>
+        <w:tc>
+          <w:tcPr>
+            <w:tcW w:type="dxa" w:w="2835"/>
+            <w:vAlign w:val="center"/>
+          </w:tcPr>
+          <w:p>
+            <w:pPr>
+              <w:spacing w:before="0" w:after="0"/>
+              <w:jc w:val="center"/>
+            </w:pPr>
+            <w:r>
+              <w:rPr>
+                <w:rFonts w:ascii="Times New Roman" w:hAnsi="Times New Roman" w:eastAsia="Times New Roman"/>
+                <w:b/>
+                <w:sz w:val="18"/>
+              </w:rPr>
+              <w:t>Predito desatento</w:t>
+            </w:r>
+          </w:p>
+        </w:tc>
+      </w:tr>
+      <w:tr>
+        <w:tc>
+          <w:tcPr>
+            <w:tcW w:type="dxa" w:w="2835"/>
+            <w:vAlign w:val="center"/>
+          </w:tcPr>
+          <w:p>
+            <w:pPr>
+              <w:spacing w:before="0" w:after="0"/>
+              <w:jc w:val="center"/>
+            </w:pPr>
+            <w:r>
+              <w:rPr>
+                <w:rFonts w:ascii="Times New Roman" w:hAnsi="Times New Roman" w:eastAsia="Times New Roman"/>
+                <w:b w:val="0"/>
+                <w:sz w:val="18"/>
+              </w:rPr>
+              <w:t>Atento</w:t>
+            </w:r>
+          </w:p>
+        </w:tc>
+        <w:tc>
+          <w:tcPr>
+            <w:tcW w:type="dxa" w:w="2835"/>
+            <w:vAlign w:val="center"/>
+          </w:tcPr>
+          <w:p>
+            <w:pPr>
+              <w:spacing w:before="0" w:after="0"/>
+              <w:jc w:val="center"/>
+            </w:pPr>
+            <w:r>
+              <w:rPr>
+                <w:rFonts w:ascii="Times New Roman" w:hAnsi="Times New Roman" w:eastAsia="Times New Roman"/>
+                <w:b w:val="0"/>
+                <w:sz w:val="18"/>
+              </w:rPr>
+              <w:t>23</w:t>
+            </w:r>
+          </w:p>
+        </w:tc>
+        <w:tc>
+          <w:tcPr>
+            <w:tcW w:type="dxa" w:w="2835"/>
+            <w:vAlign w:val="center"/>
+          </w:tcPr>
+          <w:p>
+            <w:pPr>
+              <w:spacing w:before="0" w:after="0"/>
+              <w:jc w:val="center"/>
+            </w:pPr>
+            <w:r>
+              <w:rPr>
+                <w:rFonts w:ascii="Times New Roman" w:hAnsi="Times New Roman" w:eastAsia="Times New Roman"/>
+                <w:b w:val="0"/>
+                <w:sz w:val="18"/>
+              </w:rPr>
+              <w:t>2</w:t>
+            </w:r>
+          </w:p>
+        </w:tc>
+      </w:tr>
+      <w:tr>
+        <w:tc>
+          <w:tcPr>
+            <w:tcW w:type="dxa" w:w="2835"/>
+            <w:vAlign w:val="center"/>
+          </w:tcPr>
+          <w:p>
+            <w:pPr>
+              <w:spacing w:before="0" w:after="0"/>
+              <w:jc w:val="center"/>
+            </w:pPr>
+            <w:r>
+              <w:rPr>
+                <w:rFonts w:ascii="Times New Roman" w:hAnsi="Times New Roman" w:eastAsia="Times New Roman"/>
+                <w:b w:val="0"/>
+                <w:sz w:val="18"/>
+              </w:rPr>
+              <w:t>Desatento</w:t>
+            </w:r>
+          </w:p>
+        </w:tc>
+        <w:tc>
+          <w:tcPr>
+            <w:tcW w:type="dxa" w:w="2835"/>
+            <w:vAlign w:val="center"/>
+          </w:tcPr>
+          <w:p>
+            <w:pPr>
+              <w:spacing w:before="0" w:after="0"/>
+              <w:jc w:val="center"/>
+            </w:pPr>
+            <w:r>
+              <w:rPr>
+                <w:rFonts w:ascii="Times New Roman" w:hAnsi="Times New Roman" w:eastAsia="Times New Roman"/>
+                <w:b w:val="0"/>
+                <w:sz w:val="18"/>
+              </w:rPr>
+              <w:t>2</w:t>
+            </w:r>
+          </w:p>
+        </w:tc>
+        <w:tc>
+          <w:tcPr>
+            <w:tcW w:type="dxa" w:w="2835"/>
+            <w:vAlign w:val="center"/>
+          </w:tcPr>
+          <w:p>
+            <w:pPr>
+              <w:spacing w:before="0" w:after="0"/>
+              <w:jc w:val="center"/>
+            </w:pPr>
+            <w:r>
+              <w:rPr>
+                <w:rFonts w:ascii="Times New Roman" w:hAnsi="Times New Roman" w:eastAsia="Times New Roman"/>
+                <w:b w:val="0"/>
+                <w:sz w:val="18"/>
+              </w:rPr>
+              <w:t>23</w:t>
+            </w:r>
+          </w:p>
+        </w:tc>
+      </w:tr>
+    </w:tbl>
     <w:p>
       <w:pPr>
-        <w:spacing w:after="120"/>
-        <w:ind w:firstLine="0"/>
-        <w:jc w:val="both"/>
+        <w:spacing w:before="120" w:after="0" w:line="240" w:lineRule="auto"/>
+        <w:ind w:firstLine="720"/>
       </w:pPr>
       <w:r>
         <w:rPr>
@@ -2007,14 +1913,28 @@
           <w:i w:val="0"/>
           <w:sz w:val="24"/>
         </w:rPr>
-        <w:t>Os resultados justificam o perfil enhanced como padrão. O baseline mediapipe é muito rápido, mas perde faces pequenas ou distantes, sobretudo no modo plateia. A combinação YuNet + crops + landmarks aumenta a utilidade visual do produto sem exigir treinamento próprio. Separar recall de face e recall de landmarks evita uma interpretação incorreta: uma caixa pode estar correta, mas ainda não oferecer pontos confiáveis para pose ou EAR/MAR.</w:t>
+        <w:t>O relatório de sessão demonstra que a aplicação gera CSVs de telemetria, gráficos, páginas HTML, PDF e linha do tempo de eventos. Seus valores numéricos não foram usados para substituir a reexecução formal dos cinco protocolos, mas comprovam que o sistema está instrumentado para registrar sessões e produzir artefatos analisáveis.</w:t>
       </w:r>
     </w:p>
     <w:p>
       <w:pPr>
-        <w:spacing w:after="120"/>
+        <w:spacing w:before="240" w:after="0"/>
+        <w:ind w:firstLine="0"/>
+        <w:jc w:val="left"/>
+      </w:pPr>
+      <w:r>
+        <w:rPr>
+          <w:rFonts w:ascii="Times New Roman" w:hAnsi="Times New Roman" w:eastAsia="Times New Roman"/>
+          <w:b/>
+          <w:sz w:val="26"/>
+        </w:rPr>
+        <w:t>6. Discussão</w:t>
+      </w:r>
+    </w:p>
+    <w:p>
+      <w:pPr>
+        <w:spacing w:before="120" w:after="0" w:line="240" w:lineRule="auto"/>
         <w:ind w:firstLine="720"/>
-        <w:jc w:val="both"/>
       </w:pPr>
       <w:r>
         <w:rPr>
@@ -2023,14 +1943,13 @@
           <w:i w:val="0"/>
           <w:sz w:val="24"/>
         </w:rPr>
-        <w:t>No modo individual, os principais ajustes metodológicos foram motivados pelos testes. O pitch retornado por solvePnP pode alternar entre +179 e -179 graus para faces frontais; por isso o baseline passou a usar média circular. A calibração também passou a esperar a primeira face válida, pois vídeos com abertura sem rosto geravam baseline inadequado. Esses dois pontos aumentaram a consistência dos deltas de pose em vídeos frontais.</w:t>
+        <w:t>Os resultados justificam o uso do perfil enhanced como padrão. O baseline MediaPipe é muito rápido, mas perde muitas faces pequenas ou distantes, sobretudo no modo plateia. O uso de YuNet antes dos landmarks aumenta o recall de faces e torna a interface mais útil para demonstrações com mais de uma pessoa. A principal contrapartida é a queda de FPS e a diferença entre detecção de face e disponibilidade de landmarks.</w:t>
       </w:r>
     </w:p>
     <w:p>
       <w:pPr>
-        <w:spacing w:after="120"/>
+        <w:spacing w:before="120" w:after="0" w:line="240" w:lineRule="auto"/>
         <w:ind w:firstLine="720"/>
-        <w:jc w:val="both"/>
       </w:pPr>
       <w:r>
         <w:rPr>
@@ -2039,30 +1958,13 @@
           <w:i w:val="0"/>
           <w:sz w:val="24"/>
         </w:rPr>
-        <w:t>Ainda há limitações importantes. Iluminação irregular, contraluz, oclusões, rosto em perfil, distância excessiva, motion blur e cortes nas bordas reduzem a estabilidade de landmarks. No modo plateia, a estimativa é agregada e visual; ela não mede atenção cognitiva. No modo individual, EAR e MAR variam entre pessoas e dependem de calibração inicial.</w:t>
+        <w:t>Essa diferença é importante para interpretar o sistema. Uma face pode ser localizada por caixa, mas não gerar landmarks estáveis o suficiente para pose, EAR ou MAR. Nesses casos, a face pode ser desenhada de forma anônima, mas não deve influenciar métricas de atenção ou engajamento. Por isso, recall de face e recall de landmarks são relatados separadamente.</w:t>
       </w:r>
     </w:p>
     <w:p>
       <w:pPr>
-        <w:keepNext/>
-        <w:spacing w:before="200" w:after="120"/>
-        <w:jc w:val="left"/>
-      </w:pPr>
-      <w:r>
-        <w:rPr>
-          <w:rFonts w:ascii="Times New Roman" w:hAnsi="Times New Roman" w:eastAsia="Times New Roman"/>
-          <w:b/>
-          <w:i w:val="0"/>
-          <w:sz w:val="26"/>
-        </w:rPr>
-        <w:t>Considerações Éticas e LGPD</w:t>
-      </w:r>
-    </w:p>
-    <w:p>
-      <w:pPr>
-        <w:spacing w:after="120"/>
-        <w:ind w:firstLine="0"/>
-        <w:jc w:val="both"/>
+        <w:spacing w:before="120" w:after="0" w:line="240" w:lineRule="auto"/>
+        <w:ind w:firstLine="720"/>
       </w:pPr>
       <w:r>
         <w:rPr>
@@ -2071,14 +1973,13 @@
           <w:i w:val="0"/>
           <w:sz w:val="24"/>
         </w:rPr>
-        <w:t>Como o sistema captura imagem de pessoas, seu uso deve seguir minimização de dados, transparência e finalidade acadêmica. O modo individual deve ser demonstrado com consentimento do participante e sem finalidade punitiva, clínica ou classificatória. O modo plateia deve operar com métricas agregadas e não deve identificar alunos, associar nomes a rostos ou produzir avaliação individual de aprendizagem.</w:t>
+        <w:t>Também há diferença metodológica entre o FPS do benchmark e o FPS da auditoria HQ. O benchmark smoke mede o pipeline do detector em 960x540, com foco em comparação controlada entre perfis. A auditoria HQ processa vídeos 1080p completos, registra respostas por frame e avalia cenas com maior densidade visual. É esperado que os valores absolutos de FPS sejam menores nesse contexto.</w:t>
       </w:r>
     </w:p>
     <w:p>
       <w:pPr>
-        <w:spacing w:after="120"/>
+        <w:spacing w:before="120" w:after="0" w:line="240" w:lineRule="auto"/>
         <w:ind w:firstLine="720"/>
-        <w:jc w:val="both"/>
       </w:pPr>
       <w:r>
         <w:rPr>
@@ -2087,30 +1988,28 @@
           <w:i w:val="0"/>
           <w:sz w:val="24"/>
         </w:rPr>
-        <w:t>A proposta privilegia processamento local e armazenamento apenas de telemetria numérica, como séries temporais, contagens, percentuais agregados e eventos de interface. Em demonstrações públicas, recomenda-se sinalização visível, opção de ficar fora do campo da câmera e uso de voluntários quando forem necessárias evidências visuais.</w:t>
+        <w:t>As limitações observadas são coerentes com aplicações de visão computacional em tempo real. Iluminação irregular, distância da câmera, oclusão parcial, rostos em perfil, faces pequenas, motion blur e cortes nas bordas reduzem a estabilidade dos landmarks. No modo individual, EAR e MAR variam entre pessoas e dependem da calibração inicial. No modo plateia, a métrica agregada estima orientação visual aproximada e não atenção cognitiva ou aprendizagem.</w:t>
       </w:r>
     </w:p>
     <w:p>
       <w:pPr>
-        <w:keepNext/>
-        <w:spacing w:before="200" w:after="120"/>
+        <w:spacing w:before="240" w:after="0"/>
+        <w:ind w:firstLine="0"/>
         <w:jc w:val="left"/>
       </w:pPr>
       <w:r>
         <w:rPr>
           <w:rFonts w:ascii="Times New Roman" w:hAnsi="Times New Roman" w:eastAsia="Times New Roman"/>
           <w:b/>
-          <w:i w:val="0"/>
           <w:sz w:val="26"/>
         </w:rPr>
-        <w:t>Conclusão</w:t>
+        <w:t>7. Considerações Éticas e LGPD</w:t>
       </w:r>
     </w:p>
     <w:p>
       <w:pPr>
-        <w:spacing w:after="120"/>
-        <w:ind w:firstLine="0"/>
-        <w:jc w:val="both"/>
+        <w:spacing w:before="120" w:after="0" w:line="240" w:lineRule="auto"/>
+        <w:ind w:firstLine="720"/>
       </w:pPr>
       <w:r>
         <w:rPr>
@@ -2119,14 +2018,13 @@
           <w:i w:val="0"/>
           <w:sz w:val="24"/>
         </w:rPr>
-        <w:t>Este artigo apresentou o EduTech Vision como aplicação de PDI em tempo real para monitoramento aproximado de atenção visual, postura e engajamento agregado. A arquitetura final combina YuNet, MediaPipe Face Landmarker em recortes ampliados, EAR, MAR, solvePnP, suavização temporal, painel OpenCV e relatórios de sessão.</w:t>
+        <w:t>O EduTech Vision trata imagem de pessoas e, portanto, deve ser usado com minimização de dados, transparência e finalidade acadêmica. No modo individual, a captura deve ocorrer com consentimento do participante e sem uso punitivo, clínico ou classificatório. No modo plateia, o sistema opera apenas com métricas agregadas e não deve identificar alunos, registrar nomes, persistir frames ou permitir reidentificação.</w:t>
       </w:r>
     </w:p>
     <w:p>
       <w:pPr>
-        <w:spacing w:after="120"/>
+        <w:spacing w:before="120" w:after="0" w:line="240" w:lineRule="auto"/>
         <w:ind w:firstLine="720"/>
-        <w:jc w:val="both"/>
       </w:pPr>
       <w:r>
         <w:rPr>
@@ -2135,30 +2033,13 @@
           <w:i w:val="0"/>
           <w:sz w:val="24"/>
         </w:rPr>
-        <w:t>As evidências quantitativas mostram ganho claro do perfil enhanced sobre o baseline mediapipe e uma auditoria específica mais forte para o modo individual. Ao mesmo tempo, o artigo delimita o escopo: o sistema é uma demonstração acadêmica e não uma ferramenta diagnóstica ou avaliativa. Trabalhos futuros incluem reexecutar os cinco protocolos formais com coleta presencial completa, ampliar amostras reais rotuladas e testar condições controladas de iluminação, distância e oclusão.</w:t>
+        <w:t>Por padrão, a proposta privilegia processamento local, descarte de imagens e armazenamento apenas de séries temporais, contagens, percentuais agregados e eventos de interface. Relatórios e gráficos devem ser usados para explicar o comportamento do pipeline, não para vigiar indivíduos. Em demonstrações públicas, recomenda-se sinalização visível sobre a captura de imagem, opção de afastamento da câmera e uso de voluntários quando forem necessárias evidências visuais.</w:t>
       </w:r>
     </w:p>
     <w:p>
       <w:pPr>
-        <w:keepNext/>
-        <w:spacing w:before="200" w:after="120"/>
-        <w:jc w:val="left"/>
-      </w:pPr>
-      <w:r>
-        <w:rPr>
-          <w:rFonts w:ascii="Times New Roman" w:hAnsi="Times New Roman" w:eastAsia="Times New Roman"/>
-          <w:b/>
-          <w:i w:val="0"/>
-          <w:sz w:val="26"/>
-        </w:rPr>
-        <w:t>Agradecimentos</w:t>
-      </w:r>
-    </w:p>
-    <w:p>
-      <w:pPr>
-        <w:spacing w:after="120"/>
-        <w:ind w:firstLine="0"/>
-        <w:jc w:val="both"/>
+        <w:spacing w:before="120" w:after="0" w:line="240" w:lineRule="auto"/>
+        <w:ind w:firstLine="720"/>
       </w:pPr>
       <w:r>
         <w:rPr>
@@ -2167,20 +2048,94 @@
           <w:i w:val="0"/>
           <w:sz w:val="24"/>
         </w:rPr>
-        <w:t>Os autores agradecem ao curso de Bacharelado em Ciência da Computação da UNEMAT e ao docente da disciplina de Processamento Digital de Imagens pelas diretrizes, críticas e critérios de avaliação do projeto. Ferramentas de IA generativa foram utilizadas pontualmente como apoio à revisão gramatical e à organização textual; o conteúdo técnico, a interpretação dos resultados e a responsabilidade final permanecem dos autores.</w:t>
+        <w:t>Essas escolhas atendem ao princípio de necessidade da Lei Geral de Proteção de Dados e reduzem o risco de interpretação abusiva. O sistema deve ser entendido como material didático de PDI, não como tecnologia de decisão automatizada sobre estudantes.</w:t>
       </w:r>
     </w:p>
     <w:p>
       <w:pPr>
-        <w:keepNext/>
-        <w:spacing w:before="200" w:after="120"/>
+        <w:spacing w:before="240" w:after="0"/>
+        <w:ind w:firstLine="0"/>
         <w:jc w:val="left"/>
       </w:pPr>
       <w:r>
         <w:rPr>
           <w:rFonts w:ascii="Times New Roman" w:hAnsi="Times New Roman" w:eastAsia="Times New Roman"/>
           <w:b/>
+          <w:sz w:val="26"/>
+        </w:rPr>
+        <w:t>8. Conclusão</w:t>
+      </w:r>
+    </w:p>
+    <w:p>
+      <w:pPr>
+        <w:spacing w:before="120" w:after="0" w:line="240" w:lineRule="auto"/>
+        <w:ind w:firstLine="720"/>
+      </w:pPr>
+      <w:r>
+        <w:rPr>
+          <w:rFonts w:ascii="Times New Roman" w:hAnsi="Times New Roman" w:eastAsia="Times New Roman"/>
+          <w:b w:val="0"/>
           <w:i w:val="0"/>
+          <w:sz w:val="24"/>
+        </w:rPr>
+        <w:t>Este artigo apresentou a versão atual do EduTech Vision, uma aplicação funcional de PDI em tempo real para monitoramento aproximado de atenção visual, postura e engajamento agregado. A arquitetura atual combina YuNet, MediaPipe Face Landmarker em recortes ampliados, EAR, MAR, solvePnP, suavização temporal e relatórios de sessão. O benchmark smoke mostra que o perfil enhanced supera o baseline MediaPipe em recall e F1 nos dois modos, enquanto a auditoria HQ indica desempenho aceitável para contagem agregada em vídeos mais pesados.</w:t>
+      </w:r>
+    </w:p>
+    <w:p>
+      <w:pPr>
+        <w:spacing w:before="120" w:after="0" w:line="240" w:lineRule="auto"/>
+        <w:ind w:firstLine="720"/>
+      </w:pPr>
+      <w:r>
+        <w:rPr>
+          <w:rFonts w:ascii="Times New Roman" w:hAnsi="Times New Roman" w:eastAsia="Times New Roman"/>
+          <w:b w:val="0"/>
+          <w:i w:val="0"/>
+          <w:sz w:val="24"/>
+        </w:rPr>
+        <w:t>As evidências atuais sustentam o sistema como demonstração reprodutível e tecnicamente coerente para a Trilha 3. Ao mesmo tempo, a matriz de confusão disponível é apenas demonstrativa e os cinco protocolos formais devem ser reexecutados com novos registros experimentais finais para uma validação máxima da versão atual. Trabalhos futuros incluem ampliar amostras reais rotuladas, testar diferentes condições de iluminação e distância, melhorar a estabilidade de landmarks em rostos pequenos e refinar a comunicação ética do uso em ambientes educacionais.</w:t>
+      </w:r>
+    </w:p>
+    <w:p>
+      <w:pPr>
+        <w:spacing w:before="240" w:after="0"/>
+        <w:ind w:firstLine="0"/>
+        <w:jc w:val="left"/>
+      </w:pPr>
+      <w:r>
+        <w:rPr>
+          <w:rFonts w:ascii="Times New Roman" w:hAnsi="Times New Roman" w:eastAsia="Times New Roman"/>
+          <w:b/>
+          <w:sz w:val="26"/>
+        </w:rPr>
+        <w:t>Agradecimentos</w:t>
+      </w:r>
+    </w:p>
+    <w:p>
+      <w:pPr>
+        <w:spacing w:before="120" w:after="0" w:line="240" w:lineRule="auto"/>
+        <w:ind w:firstLine="0"/>
+      </w:pPr>
+      <w:r>
+        <w:rPr>
+          <w:rFonts w:ascii="Times New Roman" w:hAnsi="Times New Roman" w:eastAsia="Times New Roman"/>
+          <w:b w:val="0"/>
+          <w:i w:val="0"/>
+          <w:sz w:val="24"/>
+        </w:rPr>
+        <w:t>Os autores agradecem ao curso de Bacharelado em Ciência da Computação da UNEMAT e ao docente da disciplina de Processamento Digital de Imagens pelas diretrizes do projeto. Ferramentas de IA generativa foram utilizadas pontualmente como apoio à revisão gramatical e à organização textual; o conteúdo técnico, a interpretação dos resultados e a responsabilidade final permanecem dos autores.</w:t>
+      </w:r>
+    </w:p>
+    <w:p>
+      <w:pPr>
+        <w:spacing w:before="240" w:after="0"/>
+        <w:ind w:firstLine="0"/>
+        <w:jc w:val="left"/>
+      </w:pPr>
+      <w:r>
+        <w:rPr>
+          <w:rFonts w:ascii="Times New Roman" w:hAnsi="Times New Roman" w:eastAsia="Times New Roman"/>
+          <w:b/>
           <w:sz w:val="26"/>
         </w:rPr>
         <w:t>Referências</w:t>
@@ -2188,130 +2143,107 @@
     </w:p>
     <w:p>
       <w:pPr>
-        <w:spacing w:after="80"/>
-        <w:ind w:firstLine="0"/>
-        <w:jc w:val="left"/>
+        <w:spacing w:before="120" w:after="0" w:line="240" w:lineRule="auto"/>
+        <w:ind w:left="283" w:hanging="283"/>
       </w:pPr>
       <w:r>
         <w:rPr>
           <w:rFonts w:ascii="Times New Roman" w:hAnsi="Times New Roman" w:eastAsia="Times New Roman"/>
           <w:b w:val="0"/>
           <w:i w:val="0"/>
-          <w:sz w:val="22"/>
+          <w:sz w:val="24"/>
         </w:rPr>
-        <w:t>Brasil (2018). Lei nº 13.709, de 14 de agosto de 2018. Lei Geral de Proteção de Dados Pessoais (LGPD).</w:t>
+        <w:t>Brasil (2018). Lei nº 13.709, de 14 de agosto de 2018. Lei Geral de Proteção de Dados Pessoais.</w:t>
       </w:r>
     </w:p>
     <w:p>
       <w:pPr>
-        <w:spacing w:after="80"/>
-        <w:ind w:firstLine="0"/>
-        <w:jc w:val="left"/>
+        <w:spacing w:before="120" w:after="0" w:line="240" w:lineRule="auto"/>
+        <w:ind w:left="283" w:hanging="283"/>
       </w:pPr>
       <w:r>
         <w:rPr>
           <w:rFonts w:ascii="Times New Roman" w:hAnsi="Times New Roman" w:eastAsia="Times New Roman"/>
           <w:b w:val="0"/>
           <w:i w:val="0"/>
-          <w:sz w:val="22"/>
+          <w:sz w:val="24"/>
         </w:rPr>
-        <w:t>Gonzalez, R. C. and Woods, R. E. (2018). Digital Image Processing. 4. ed. Pearson.</w:t>
+        <w:t>Gonzalez, R. C. and Woods, R. E. (2018). Processamento Digital de Imagens. 4. ed. Pearson.</w:t>
       </w:r>
     </w:p>
     <w:p>
       <w:pPr>
-        <w:spacing w:after="80"/>
-        <w:ind w:firstLine="0"/>
-        <w:jc w:val="left"/>
+        <w:spacing w:before="120" w:after="0" w:line="240" w:lineRule="auto"/>
+        <w:ind w:left="283" w:hanging="283"/>
       </w:pPr>
       <w:r>
         <w:rPr>
           <w:rFonts w:ascii="Times New Roman" w:hAnsi="Times New Roman" w:eastAsia="Times New Roman"/>
           <w:b w:val="0"/>
           <w:i w:val="0"/>
-          <w:sz w:val="22"/>
+          <w:sz w:val="24"/>
         </w:rPr>
-        <w:t>Lepetit, V., Moreno-Noguer, F. and Fua, P. (2009). EPnP: An Accurate O(n) Solution to the PnP Problem. International Journal of Computer Vision, 81(2):155-166.</w:t>
+        <w:t>Google (2026). MediaPipe Face Landmarker. Disponível em: https://developers.google.com/mediapipe. Acesso em: 2026.</w:t>
       </w:r>
     </w:p>
     <w:p>
       <w:pPr>
-        <w:spacing w:after="80"/>
-        <w:ind w:firstLine="0"/>
-        <w:jc w:val="left"/>
+        <w:spacing w:before="120" w:after="0" w:line="240" w:lineRule="auto"/>
+        <w:ind w:left="283" w:hanging="283"/>
       </w:pPr>
       <w:r>
         <w:rPr>
           <w:rFonts w:ascii="Times New Roman" w:hAnsi="Times New Roman" w:eastAsia="Times New Roman"/>
           <w:b w:val="0"/>
           <w:i w:val="0"/>
-          <w:sz w:val="22"/>
+          <w:sz w:val="24"/>
         </w:rPr>
-        <w:t>Lugaresi, C. et al. (2019). MediaPipe: A Framework for Building Perception Pipelines. arXiv:1906.08172.</w:t>
+        <w:t>OpenCV (2026). OpenCV Documentation. Disponível em: https://docs.opencv.org. Acesso em: 2026.</w:t>
       </w:r>
     </w:p>
     <w:p>
       <w:pPr>
-        <w:spacing w:after="80"/>
-        <w:ind w:firstLine="0"/>
-        <w:jc w:val="left"/>
+        <w:spacing w:before="120" w:after="0" w:line="240" w:lineRule="auto"/>
+        <w:ind w:left="283" w:hanging="283"/>
       </w:pPr>
       <w:r>
         <w:rPr>
           <w:rFonts w:ascii="Times New Roman" w:hAnsi="Times New Roman" w:eastAsia="Times New Roman"/>
           <w:b w:val="0"/>
           <w:i w:val="0"/>
-          <w:sz w:val="22"/>
+          <w:sz w:val="24"/>
         </w:rPr>
-        <w:t>OpenCV Zoo (2026). YuNet Face Detection Model. Disponível em: https://github.com/opencv/opencv_zoo.</w:t>
+        <w:t>OpenCV Zoo (2026). YuNet Face Detection. Disponível em: https://github.com/opencv/opencv_zoo/tree/main/models/face_detection_yunet. Acesso em: 2026.</w:t>
       </w:r>
     </w:p>
     <w:p>
       <w:pPr>
-        <w:spacing w:after="80"/>
-        <w:ind w:firstLine="0"/>
-        <w:jc w:val="left"/>
+        <w:spacing w:before="120" w:after="0" w:line="240" w:lineRule="auto"/>
+        <w:ind w:left="283" w:hanging="283"/>
       </w:pPr>
       <w:r>
         <w:rPr>
           <w:rFonts w:ascii="Times New Roman" w:hAnsi="Times New Roman" w:eastAsia="Times New Roman"/>
           <w:b w:val="0"/>
           <w:i w:val="0"/>
-          <w:sz w:val="22"/>
+          <w:sz w:val="24"/>
         </w:rPr>
-        <w:t>Soukupova, T. and Cech, J. (2016). Real-Time Eye Blink Detection using Facial Landmarks. 21st Computer Vision Winter Workshop.</w:t>
+        <w:t>Szeliski, R. (2022). Computer Vision: Algorithms and Applications. 2. ed. Springer.</w:t>
       </w:r>
     </w:p>
     <w:p>
       <w:pPr>
-        <w:spacing w:after="80"/>
-        <w:ind w:firstLine="0"/>
-        <w:jc w:val="left"/>
+        <w:spacing w:before="120" w:after="0" w:line="240" w:lineRule="auto"/>
+        <w:ind w:left="283" w:hanging="283"/>
       </w:pPr>
       <w:r>
         <w:rPr>
           <w:rFonts w:ascii="Times New Roman" w:hAnsi="Times New Roman" w:eastAsia="Times New Roman"/>
           <w:b w:val="0"/>
           <w:i w:val="0"/>
-          <w:sz w:val="22"/>
+          <w:sz w:val="24"/>
         </w:rPr>
-        <w:t>Szeliski, R. (2022). Computer Vision: Algorithms and Applications. 2. ed. Springer.</w:t>
-      </w:r>
-    </w:p>
-    <w:p>
-      <w:pPr>
-        <w:spacing w:after="80"/>
-        <w:ind w:firstLine="0"/>
-        <w:jc w:val="left"/>
-      </w:pPr>
-      <w:r>
-        <w:rPr>
-          <w:rFonts w:ascii="Times New Roman" w:hAnsi="Times New Roman" w:eastAsia="Times New Roman"/>
-          <w:b w:val="0"/>
-          <w:i w:val="0"/>
-          <w:sz w:val="22"/>
-        </w:rPr>
-        <w:t>Yang, S., Luo, P., Loy, C. C. and Tang, X. (2016). WIDER FACE: A Face Detection Benchmark. Proceedings of CVPR.</w:t>
+        <w:t>Yang, S., Luo, P., Loy, C. C. and Tang, X. (2016). WIDER FACE: A Face Detection Benchmark. In Proceedings of the IEEE Conference on Computer Vision and Pattern Recognition.</w:t>
       </w:r>
     </w:p>
     <w:sectPr>

</xml_diff>